<commit_message>
Record supervisor decisions D-41..D-49 (implementation choices, overlap read exception, MDE80 sigma, replay-mode conditions)
Co-Authored-By: Claude Fable 5.1 <noreply@anthropic.com>
Claude-Session: https://claude.ai/code/session_01Y5Ccgz17Pq2brpK5TTSYa7
</commit_message>
<xml_diff>
--- a/deliverables/02-hypotheses-algorithms/الفرضيات-والخوارزميات.docx
+++ b/deliverables/02-hypotheses-algorithms/الفرضيات-والخوارزميات.docx
@@ -6559,13 +6559,7 @@
         <w:rPr>
           <w:rtl/>
         </w:rPr>
-        <w:t xml:space="preserve"> </w:t>
-      </w:r>
-      <w:r>
-        <w:rPr>
-          <w:rtl/>
-        </w:rPr>
-        <w:t xml:space="preserve">=</w:t>
+        <w:t xml:space="preserve">، وهو</w:t>
       </w:r>
       <w:r>
         <w:rPr>
@@ -6597,7 +6591,7 @@
         <w:rPr>
           <w:rtl/>
         </w:rPr>
-        <w:t xml:space="preserve">+ الملامح الأكاديمية والإدارية (الالتزام بالموعد، والدرجة، و</w:t>
+        <w:t xml:space="preserve">مضافاً إليه الملامح الأكاديمية والإدارية (الالتزام بالموعد، والدرجة، و</w:t>
       </w:r>
       <w:r>
         <w:rPr>
@@ -44905,13 +44899,7 @@
         <w:rPr>
           <w:rtl/>
         </w:rPr>
-        <w:t xml:space="preserve"> </w:t>
-      </w:r>
-      <w:r>
-        <w:rPr>
-          <w:rtl/>
-        </w:rPr>
-        <w:t xml:space="preserve">=</w:t>
+        <w:t xml:space="preserve">، وهو</w:t>
       </w:r>
       <w:r>
         <w:rPr>
@@ -44943,7 +44931,7 @@
         <w:rPr>
           <w:rtl/>
         </w:rPr>
-        <w:t xml:space="preserve">+ الملامح الأكاديمية والإدارية (الالتزام، والدرجة، و</w:t>
+        <w:t xml:space="preserve">مضافاً إليه الملامح الأكاديمية والإدارية (الالتزام، والدرجة، و</w:t>
       </w:r>
       <w:r>
         <w:rPr>

</xml_diff>

<commit_message>
Hypotheses document: incorporate D-41..D-49 (MDE80 per hypothesis, limited-read exception, replay rules)
Co-Authored-By: Claude Fable 5.1 <noreply@anthropic.com>
Claude-Session: https://claude.ai/code/session_01Y5Ccgz17Pq2brpK5TTSYa7
</commit_message>
<xml_diff>
--- a/deliverables/02-hypotheses-algorithms/الفرضيات-والخوارزميات.docx
+++ b/deliverables/02-hypotheses-algorithms/الفرضيات-والخوارزميات.docx
@@ -259,7 +259,7 @@
         <w:rPr>
           <w:rtl/>
         </w:rPr>
-        <w:t xml:space="preserve">): J1–J9 وM-1…M-14 وS-1…S-11.</w:t>
+        <w:t xml:space="preserve">): J1–J9 وM-1…M-14 وS-1…S-11، ثم القرارات التنفيذية D-41…D-49.</w:t>
       </w:r>
     </w:p>
     <w:p>
@@ -289,7 +289,7 @@
         <w:rPr>
           <w:rtl/>
         </w:rPr>
-        <w:t xml:space="preserve">سجل القرارات D-01 إلى D-22 (اجتماع الإشراف 01) وD-23 إلى D-40 (اجتماع الإشراف 02)، وADR-001 وADR-002 (مع قسمه 7) وADR-003 وADR-004، والأخير يسود حيث يتعارض مع ADR-002. هذه الوثيقة</w:t>
+        <w:t xml:space="preserve">سجل القرارات D-01 إلى D-22 (اجتماع الإشراف 01) وD-23 إلى D-40 (اجتماع الإشراف 02) وD-41 إلى D-49 (تثبيت منصة التجارب)، وADR-001 وADR-002 (مع قسمه 7) وADR-003 وADR-004 (مع §4-مكرر)، والأخير يسود حيث يتعارض مع ADR-002. هذه الوثيقة</w:t>
       </w:r>
       <w:r>
         <w:rPr>
@@ -3004,7 +3004,7 @@
               <w:rPr>
                 <w:rtl/>
               </w:rPr>
-              <w:t xml:space="preserve">ما عدا ذلك، ولا يُدّعى بها شيء</w:t>
+              <w:t xml:space="preserve">ما عدا ذلك، ولا يُدّعى بها شيء؛ ويُلحق به: «لا يكشف التصميم بقوة 80% أثراً أصغر من MDE80 = x» (D-48)</w:t>
             </w:r>
           </w:p>
         </w:tc>
@@ -4018,19 +4018,51 @@
           <w:bCs/>
           <w:b/>
         </w:rPr>
-        <w:t xml:space="preserve">الحد الأدنى للأثر القابل للكشف (MDE80):</w:t>
-      </w:r>
-      <w:r>
-        <w:rPr>
-          <w:rtl/>
-        </w:rPr>
-        <w:t xml:space="preserve"> </w:t>
-      </w:r>
-      <w:r>
-        <w:rPr>
-          <w:rtl/>
-        </w:rPr>
-        <w:t xml:space="preserve">بعد E2/E3 يُقدَّر σ لـ</w:t>
+        <w:t xml:space="preserve">الحد الأدنى للأثر القابل للكشف (MDE80؛ D-46):</w:t>
+      </w:r>
+      <w:r>
+        <w:rPr>
+          <w:rtl/>
+        </w:rPr>
+        <w:t xml:space="preserve"> </w:t>
+      </w:r>
+      <w:r>
+        <w:rPr>
+          <w:rtl/>
+        </w:rPr>
+        <w:t xml:space="preserve">لكل فرضية يُقدَّر σ من</w:t>
+      </w:r>
+      <w:r>
+        <w:rPr>
+          <w:rtl/>
+        </w:rPr>
+        <w:t xml:space="preserve"> </w:t>
+      </w:r>
+      <w:r>
+        <w:rPr>
+          <w:rtl/>
+          <w:bCs/>
+          <w:b/>
+        </w:rPr>
+        <w:t xml:space="preserve">زوجها الفعلي</w:t>
+      </w:r>
+      <w:r>
+        <w:rPr>
+          <w:rtl/>
+        </w:rPr>
+        <w:t xml:space="preserve"> </w:t>
+      </w:r>
+      <w:r>
+        <w:rPr>
+          <w:rtl/>
+        </w:rPr>
+        <w:t xml:space="preserve">على نوافذ اختبار 2013 (انحراف</w:t>
+      </w:r>
+      <w:r>
+        <w:rPr>
+          <w:rtl/>
+        </w:rPr>
+        <w:t xml:space="preserve"> </w:t>
       </w:r>
       <m:oMath>
         <m:sSub>
@@ -4056,7 +4088,32 @@
         <w:rPr>
           <w:rtl/>
         </w:rPr>
-        <w:t xml:space="preserve">على التطوير (H1 وH2-أ)، ويُحسب MDE80، أي أصغر μ يعطي احتمال تأكيد ≥ 0.8 بالمحاكاة نفسها،</w:t>
+        <w:t xml:space="preserve">عبر العروض التسعة)، ويُحسب MDE80، أي أصغر μ يعطي احتمال تأكيد ≥ 0.8 بالمحاكاة نفسها، بالدالة</w:t>
+      </w:r>
+      <w:r>
+        <w:rPr>
+          <w:rtl/>
+        </w:rPr>
+        <w:t xml:space="preserve"> </w:t>
+      </w:r>
+      <w:r>
+        <w:rPr>
+          <w:rStyle w:val="VerbatimChar"/>
+          <w:rtl/>
+        </w:rPr>
+        <w:t xml:space="preserve">stats.mde80</w:t>
+      </w:r>
+      <w:r>
+        <w:rPr>
+          <w:rtl/>
+        </w:rPr>
+        <w:t xml:space="preserve"> </w:t>
+      </w:r>
+      <w:r>
+        <w:rPr>
+          <w:rtl/>
+        </w:rPr>
+        <w:t xml:space="preserve">وبعامل Holm الأشد (4). ويُكتب الجدول 2-ب كاملاً</w:t>
       </w:r>
       <w:r>
         <w:rPr>
@@ -4070,25 +4127,492 @@
           <w:bCs/>
           <w:b/>
         </w:rPr>
-        <w:t xml:space="preserve">ويُكتب هنا قبل التجميد</w:t>
-      </w:r>
-      <w:r>
-        <w:rPr>
-          <w:rtl/>
-        </w:rPr>
-        <w:t xml:space="preserve"> </w:t>
-      </w:r>
-      <w:r>
-        <w:rPr>
-          <w:rtl/>
-        </w:rPr>
-        <w:t xml:space="preserve">(الموعد 2026-11-13). وإن تجاوز 2δ يُكتب صراحة أن التصميم لا يكشف إلا آثاراً كبيرة، وأن «غير حاسمة» متوقعة. ولا يُعدَّل δ ولا القاعدة بناءً عليه.</w:t>
+        <w:t xml:space="preserve">قبل التجميد (12-14)</w:t>
+      </w:r>
+      <w:r>
+        <w:rPr>
+          <w:rtl/>
+        </w:rPr>
+        <w:t xml:space="preserve">، مع التنبيه إلى أن σ المقدَّر من 9 وحدات تقريبي. ولا يُعدَّل δ ولا القاعدة بناءً عليه.</w:t>
       </w:r>
     </w:p>
     <w:p>
       <w:pPr>
+        <w:bidi w:val="1"/>
+      </w:pPr>
+      <w:r>
+        <w:rPr>
+          <w:rtl/>
+          <w:bCs/>
+          <w:b/>
+        </w:rPr>
+        <w:t xml:space="preserve">جدول 2-ب: جدول MDE80 لكل فرضية (D-46؛ يُملأ قبل التجميد)</w:t>
+      </w:r>
+    </w:p>
+    <w:tbl>
+      <w:tblPr>
+        <w:tblStyle w:val="Table"/>
+        <w:tblW w:type="pct" w:w="5000"/>
+        <w:tblLook w:firstRow="1" w:lastRow="0" w:firstColumn="0" w:lastColumn="0" w:noHBand="0" w:noVBand="0" w:val="0020"/>
+        <w:jc w:val="center"/>
+        <w:bidiVisual w:val="1"/>
+        <w:tblBorders>
+          <w:top w:val="single" w:sz="4" w:space="0" w:color="808080"/>
+          <w:left w:val="single" w:sz="4" w:space="0" w:color="808080"/>
+          <w:bottom w:val="single" w:sz="4" w:space="0" w:color="808080"/>
+          <w:right w:val="single" w:sz="4" w:space="0" w:color="808080"/>
+          <w:insideH w:val="single" w:sz="4" w:space="0" w:color="808080"/>
+          <w:insideV w:val="single" w:sz="4" w:space="0" w:color="808080"/>
+        </w:tblBorders>
+      </w:tblPr>
+      <w:tblGrid>
+        <w:gridCol w:w="1980"/>
+        <w:gridCol w:w="1980"/>
+        <w:gridCol w:w="1980"/>
+        <w:gridCol w:w="1980"/>
+      </w:tblGrid>
+      <w:tr>
+        <w:trPr>
+          <w:tblHeader w:val="true"/>
+        </w:trPr>
+        <w:tc>
+          <w:tcPr>
+            <w:shd w:val="clear" w:color="auto" w:fill="D9E2F3"/>
+          </w:tcPr>
+          <w:p>
+            <w:pPr>
+              <w:pStyle w:val="Compact"/>
+              <w:bidi w:val="1"/>
+              <w:jc w:val="left"/>
+            </w:pPr>
+            <w:r>
+              <w:rPr>
+                <w:b/>
+                <w:rtl/>
+              </w:rPr>
+              <w:t xml:space="preserve">الفرضية</w:t>
+            </w:r>
+          </w:p>
+        </w:tc>
+        <w:tc>
+          <w:tcPr>
+            <w:shd w:val="clear" w:color="auto" w:fill="D9E2F3"/>
+          </w:tcPr>
+          <w:p>
+            <w:pPr>
+              <w:pStyle w:val="Compact"/>
+              <w:bidi w:val="1"/>
+              <w:jc w:val="left"/>
+            </w:pPr>
+            <w:r>
+              <w:rPr>
+                <w:b/>
+                <w:rtl/>
+              </w:rPr>
+              <w:t xml:space="preserve">الزوج الذي يُقدَّر منه σ</w:t>
+            </w:r>
+          </w:p>
+        </w:tc>
+        <w:tc>
+          <w:tcPr>
+            <w:shd w:val="clear" w:color="auto" w:fill="D9E2F3"/>
+          </w:tcPr>
+          <w:p>
+            <w:pPr>
+              <w:pStyle w:val="Compact"/>
+              <w:bidi w:val="1"/>
+              <w:jc w:val="left"/>
+            </w:pPr>
+            <w:r>
+              <w:rPr>
+                <w:b/>
+                <w:rtl/>
+              </w:rPr>
+              <w:t xml:space="preserve">موعد التقدير</w:t>
+            </w:r>
+          </w:p>
+        </w:tc>
+        <w:tc>
+          <w:tcPr>
+            <w:shd w:val="clear" w:color="auto" w:fill="D9E2F3"/>
+          </w:tcPr>
+          <w:p>
+            <w:pPr>
+              <w:pStyle w:val="Compact"/>
+              <w:bidi w:val="1"/>
+              <w:jc w:val="left"/>
+            </w:pPr>
+            <w:r>
+              <w:rPr>
+                <w:b/>
+                <w:rtl/>
+              </w:rPr>
+              <w:t xml:space="preserve">MDE80</w:t>
+            </w:r>
+          </w:p>
+        </w:tc>
+      </w:tr>
+      <w:tr>
+        <w:tc>
+          <w:tcPr/>
+          <w:p>
+            <w:pPr>
+              <w:pStyle w:val="Compact"/>
+              <w:bidi w:val="1"/>
+              <w:jc w:val="left"/>
+            </w:pPr>
+            <w:r>
+              <w:rPr>
+                <w:rtl/>
+              </w:rPr>
+              <w:t xml:space="preserve">H2-أ</w:t>
+            </w:r>
+          </w:p>
+        </w:tc>
+        <w:tc>
+          <w:tcPr/>
+          <w:p>
+            <w:pPr>
+              <w:pStyle w:val="Compact"/>
+              <w:bidi w:val="1"/>
+              <w:jc w:val="left"/>
+            </w:pPr>
+            <w:r>
+              <w:rPr>
+                <w:rtl/>
+              </w:rPr>
+              <w:t xml:space="preserve">WRMF(W) مقابل WRMF(ثنائي)</w:t>
+            </w:r>
+          </w:p>
+        </w:tc>
+        <w:tc>
+          <w:tcPr/>
+          <w:p>
+            <w:pPr>
+              <w:pStyle w:val="Compact"/>
+              <w:bidi w:val="1"/>
+              <w:jc w:val="left"/>
+            </w:pPr>
+            <w:r>
+              <w:rPr>
+                <w:rtl/>
+              </w:rPr>
+              <w:t xml:space="preserve">بعد E3 (الموعد المسجل 11-13)</w:t>
+            </w:r>
+          </w:p>
+        </w:tc>
+        <w:tc>
+          <w:tcPr/>
+          <w:p>
+            <w:pPr>
+              <w:pStyle w:val="Compact"/>
+              <w:bidi w:val="1"/>
+              <w:jc w:val="left"/>
+            </w:pPr>
+            <w:r>
+              <w:rPr>
+                <w:rtl/>
+              </w:rPr>
+              <w:t xml:space="preserve">[يُملأ]</w:t>
+            </w:r>
+          </w:p>
+        </w:tc>
+      </w:tr>
+      <w:tr>
+        <w:tc>
+          <w:tcPr/>
+          <w:p>
+            <w:pPr>
+              <w:pStyle w:val="Compact"/>
+              <w:bidi w:val="1"/>
+              <w:jc w:val="left"/>
+            </w:pPr>
+            <w:r>
+              <w:rPr>
+                <w:rtl/>
+              </w:rPr>
+              <w:t xml:space="preserve">H3</w:t>
+            </w:r>
+          </w:p>
+        </w:tc>
+        <w:tc>
+          <w:tcPr/>
+          <w:p>
+            <w:pPr>
+              <w:pStyle w:val="Compact"/>
+              <w:bidi w:val="1"/>
+              <w:jc w:val="left"/>
+            </w:pPr>
+            <w:r>
+              <w:rPr>
+                <w:rtl/>
+              </w:rPr>
+              <w:t xml:space="preserve">GRU-lite مقابل</w:t>
+            </w:r>
+            <w:r>
+              <w:rPr>
+                <w:rtl/>
+              </w:rPr>
+              <w:t xml:space="preserve"> </w:t>
+            </w:r>
+            <m:oMath>
+              <m:sSup>
+                <m:e>
+                  <m:r>
+                    <m:t>S</m:t>
+                  </m:r>
+                </m:e>
+                <m:sup>
+                  <m:r>
+                    <m:rPr>
+                      <m:sty m:val="p"/>
+                    </m:rPr>
+                    <m:t>*</m:t>
+                  </m:r>
+                </m:sup>
+              </m:sSup>
+            </m:oMath>
+          </w:p>
+        </w:tc>
+        <w:tc>
+          <w:tcPr/>
+          <w:p>
+            <w:pPr>
+              <w:pStyle w:val="Compact"/>
+              <w:bidi w:val="1"/>
+              <w:jc w:val="left"/>
+            </w:pPr>
+            <w:r>
+              <w:rPr>
+                <w:rtl/>
+              </w:rPr>
+              <w:t xml:space="preserve">بعد E5 (12-03)</w:t>
+            </w:r>
+          </w:p>
+        </w:tc>
+        <w:tc>
+          <w:tcPr/>
+          <w:p>
+            <w:pPr>
+              <w:pStyle w:val="Compact"/>
+              <w:bidi w:val="1"/>
+              <w:jc w:val="left"/>
+            </w:pPr>
+            <w:r>
+              <w:rPr>
+                <w:rtl/>
+              </w:rPr>
+              <w:t xml:space="preserve">[يُملأ]</w:t>
+            </w:r>
+          </w:p>
+        </w:tc>
+      </w:tr>
+      <w:tr>
+        <w:tc>
+          <w:tcPr/>
+          <w:p>
+            <w:pPr>
+              <w:pStyle w:val="Compact"/>
+              <w:bidi w:val="1"/>
+              <w:jc w:val="left"/>
+            </w:pPr>
+            <w:r>
+              <w:rPr>
+                <w:rtl/>
+              </w:rPr>
+              <w:t xml:space="preserve">H4-أ</w:t>
+            </w:r>
+          </w:p>
+        </w:tc>
+        <w:tc>
+          <w:tcPr/>
+          <w:p>
+            <w:pPr>
+              <w:pStyle w:val="Compact"/>
+              <w:bidi w:val="1"/>
+              <w:jc w:val="left"/>
+            </w:pPr>
+            <w:r>
+              <w:rPr>
+                <w:rtl/>
+              </w:rPr>
+              <w:t xml:space="preserve">فروق AUC (</w:t>
+            </w:r>
+            <m:oMath>
+              <m:sSub>
+                <m:e>
+                  <m:r>
+                    <m:t>M</m:t>
+                  </m:r>
+                </m:e>
+                <m:sub>
+                  <m:r>
+                    <m:t>1</m:t>
+                  </m:r>
+                </m:sub>
+              </m:sSub>
+              <m:r>
+                <m:rPr>
+                  <m:sty m:val="p"/>
+                </m:rPr>
+                <m:t>−</m:t>
+              </m:r>
+              <m:sSub>
+                <m:e>
+                  <m:r>
+                    <m:t>M</m:t>
+                  </m:r>
+                </m:e>
+                <m:sub>
+                  <m:r>
+                    <m:t>0</m:t>
+                  </m:r>
+                </m:sub>
+              </m:sSub>
+            </m:oMath>
+            <w:r>
+              <w:rPr>
+                <w:rtl/>
+              </w:rPr>
+              <w:t xml:space="preserve">) بتحقق «ترك عرض واحد خارج التدريب» داخل 2013</w:t>
+            </w:r>
+          </w:p>
+        </w:tc>
+        <w:tc>
+          <w:tcPr/>
+          <w:p>
+            <w:pPr>
+              <w:pStyle w:val="Compact"/>
+              <w:bidi w:val="1"/>
+              <w:jc w:val="left"/>
+            </w:pPr>
+            <w:r>
+              <w:rPr>
+                <w:rtl/>
+              </w:rPr>
+              <w:t xml:space="preserve">بعد E6ب (12-08)</w:t>
+            </w:r>
+          </w:p>
+        </w:tc>
+        <w:tc>
+          <w:tcPr/>
+          <w:p>
+            <w:pPr>
+              <w:pStyle w:val="Compact"/>
+              <w:bidi w:val="1"/>
+              <w:jc w:val="left"/>
+            </w:pPr>
+            <w:r>
+              <w:rPr>
+                <w:rtl/>
+              </w:rPr>
+              <w:t xml:space="preserve">[يُملأ]</w:t>
+            </w:r>
+          </w:p>
+        </w:tc>
+      </w:tr>
+      <w:tr>
+        <w:tc>
+          <w:tcPr/>
+          <w:p>
+            <w:pPr>
+              <w:pStyle w:val="Compact"/>
+              <w:bidi w:val="1"/>
+              <w:jc w:val="left"/>
+            </w:pPr>
+            <w:r>
+              <w:rPr>
+                <w:rtl/>
+              </w:rPr>
+              <w:t xml:space="preserve">H1</w:t>
+            </w:r>
+          </w:p>
+        </w:tc>
+        <w:tc>
+          <w:tcPr/>
+          <w:p>
+            <w:pPr>
+              <w:pStyle w:val="Compact"/>
+              <w:bidi w:val="1"/>
+              <w:jc w:val="left"/>
+            </w:pPr>
+            <w:r>
+              <w:rPr>
+                <w:rtl/>
+              </w:rPr>
+              <w:t xml:space="preserve">HYB* المجمَّد مقابل</w:t>
+            </w:r>
+            <w:r>
+              <w:rPr>
+                <w:rtl/>
+              </w:rPr>
+              <w:t xml:space="preserve"> </w:t>
+            </w:r>
+            <m:oMath>
+              <m:sSubSup>
+                <m:e>
+                  <m:r>
+                    <m:t>B</m:t>
+                  </m:r>
+                </m:e>
+                <m:sub>
+                  <m:r>
+                    <m:t>n</m:t>
+                  </m:r>
+                  <m:r>
+                    <m:t>p</m:t>
+                  </m:r>
+                </m:sub>
+                <m:sup>
+                  <m:r>
+                    <m:rPr>
+                      <m:sty m:val="p"/>
+                    </m:rPr>
+                    <m:t>*</m:t>
+                  </m:r>
+                </m:sup>
+              </m:sSubSup>
+            </m:oMath>
+          </w:p>
+        </w:tc>
+        <w:tc>
+          <w:tcPr/>
+          <w:p>
+            <w:pPr>
+              <w:pStyle w:val="Compact"/>
+              <w:bidi w:val="1"/>
+              <w:jc w:val="left"/>
+            </w:pPr>
+            <w:r>
+              <w:rPr>
+                <w:rtl/>
+              </w:rPr>
+              <w:t xml:space="preserve">بعد E7ب (12-09)</w:t>
+            </w:r>
+          </w:p>
+        </w:tc>
+        <w:tc>
+          <w:tcPr/>
+          <w:p>
+            <w:pPr>
+              <w:pStyle w:val="Compact"/>
+              <w:bidi w:val="1"/>
+              <w:jc w:val="left"/>
+            </w:pPr>
+            <w:r>
+              <w:rPr>
+                <w:rtl/>
+              </w:rPr>
+              <w:t xml:space="preserve">[يُملأ]</w:t>
+            </w:r>
+          </w:p>
+        </w:tc>
+      </w:tr>
+    </w:tbl>
+    <w:p>
+      <w:pPr>
         <w:numPr>
-          <w:ilvl w:val="1"/>
+          <w:ilvl w:val="0"/>
           <w:numId w:val="1007"/>
         </w:numPr>
         <w:pStyle w:val="Compact"/>
@@ -4097,48 +4621,96 @@
       <w:r>
         <w:rPr>
           <w:rtl/>
-        </w:rPr>
-        <w:t xml:space="preserve">MDE80 لـH1:</w:t>
-      </w:r>
-      <w:r>
-        <w:rPr>
-          <w:rtl/>
-        </w:rPr>
-        <w:t xml:space="preserve"> </w:t>
-      </w:r>
-      <w:r>
-        <w:rPr>
-          <w:rtl/>
           <w:bCs/>
           <w:b/>
         </w:rPr>
-        <w:t xml:space="preserve">[يُملأ بعد E2/E3]</w:t>
-      </w:r>
-      <w:r>
-        <w:rPr>
-          <w:rtl/>
-        </w:rPr>
-        <w:t xml:space="preserve">؛ MDE80 لـH2-أ:</w:t>
-      </w:r>
-      <w:r>
-        <w:rPr>
-          <w:rtl/>
-        </w:rPr>
-        <w:t xml:space="preserve"> </w:t>
-      </w:r>
+        <w:t xml:space="preserve">سياق تطويري توضيحي فقط (لا يدخل الجدول النهائي):</w:t>
+      </w:r>
+      <w:r>
+        <w:rPr>
+          <w:rtl/>
+        </w:rPr>
+        <w:t xml:space="preserve"> </w:t>
+      </w:r>
+      <w:r>
+        <w:rPr>
+          <w:rtl/>
+        </w:rPr>
+        <w:t xml:space="preserve">من زوج بديل B5 − B3 على التطوير (SKNN 0.531 مقابل Recent-Pop 0.541، Δ = −0.010، [−0.057، +0.024]) بلغ MDE80 التوضيحي ≈ 0.053، أي أكثر من 2δ (ADR-004 §4-مكرر).</w:t>
+      </w:r>
+    </w:p>
+    <w:p>
+      <w:pPr>
+        <w:numPr>
+          <w:ilvl w:val="0"/>
+          <w:numId w:val="1007"/>
+        </w:numPr>
+        <w:pStyle w:val="Compact"/>
+        <w:bidi w:val="1"/>
+      </w:pPr>
       <w:r>
         <w:rPr>
           <w:rtl/>
           <w:bCs/>
           <w:b/>
         </w:rPr>
-        <w:t xml:space="preserve">[يُملأ بعد E2/E3]</w:t>
-      </w:r>
-      <w:r>
-        <w:rPr>
-          <w:rtl/>
-        </w:rPr>
-        <w:t xml:space="preserve">.</w:t>
+        <w:t xml:space="preserve">بند MDE80 &gt; 2δ (D-25) مفعَّل مؤقتاً (D-48):</w:t>
+      </w:r>
+      <w:r>
+        <w:rPr>
+          <w:rtl/>
+        </w:rPr>
+        <w:t xml:space="preserve"> </w:t>
+      </w:r>
+      <w:r>
+        <w:rPr>
+          <w:rtl/>
+        </w:rPr>
+        <w:t xml:space="preserve">يُكتب صراحة أن التصميم لا يكشف بقوة 80% إلا آثاراً كبيرة، وأن «غير حاسمة» متوقعة؛ ويُحسم البند لكل فرضية بـσ زوجها (D-46).</w:t>
+      </w:r>
+    </w:p>
+    <w:p>
+      <w:pPr>
+        <w:numPr>
+          <w:ilvl w:val="0"/>
+          <w:numId w:val="1007"/>
+        </w:numPr>
+        <w:pStyle w:val="Compact"/>
+        <w:bidi w:val="1"/>
+      </w:pPr>
+      <w:r>
+        <w:rPr>
+          <w:rtl/>
+          <w:bCs/>
+          <w:b/>
+        </w:rPr>
+        <w:t xml:space="preserve">وصف «غير حاسمة» المسجل (D-48):</w:t>
+      </w:r>
+      <w:r>
+        <w:rPr>
+          <w:rtl/>
+        </w:rPr>
+        <w:t xml:space="preserve"> </w:t>
+      </w:r>
+      <w:r>
+        <w:rPr>
+          <w:rtl/>
+        </w:rPr>
+        <w:t xml:space="preserve">يُلحق بكل حكم «غير حاسمة» النص: «</w:t>
+      </w:r>
+      <w:r>
+        <w:rPr>
+          <w:rtl/>
+          <w:bCs/>
+          <w:b/>
+        </w:rPr>
+        <w:t xml:space="preserve">لا يكشف التصميم بقوة 80% أثراً أصغر من MDE80 = x</w:t>
+      </w:r>
+      <w:r>
+        <w:rPr>
+          <w:rtl/>
+        </w:rPr>
+        <w:t xml:space="preserve">»، حيث x قيمة الفرضية في الجدول 2-ب. وهو وصف لا حكم جديد، فالجدول 2 والجدول 3 بلا صف إضافي.</w:t>
       </w:r>
     </w:p>
     <w:p>
@@ -6268,7 +6840,7 @@
               <w:rPr>
                 <w:rtl/>
               </w:rPr>
-              <w:t xml:space="preserve">ما عدا ذلك</w:t>
+              <w:t xml:space="preserve">ما عدا ذلك؛ ويُلحق به: «لا يكشف التصميم بقوة 80% أثراً أصغر من MDE80 = x» (D-48)</w:t>
             </w:r>
           </w:p>
         </w:tc>
@@ -6889,7 +7461,159 @@
         <w:rPr>
           <w:rtl/>
         </w:rPr>
-        <w:t xml:space="preserve">) الذين لهم تسجيل في أي عرض من 2014 (نحو 10.3% من تسجيلات 2014 لطلاب ظهروا في 2013 بحسب فحص الزميل الاستكشافي)، فيبقى مجتمع 2014 كاملاً كما سيُنشر النظام عليه.</w:t>
+        <w:t xml:space="preserve">) الذين لهم تسجيل في أي عرض من 2014 (نحو 10.3% من تسجيلات 2014 لطلاب ظهروا في 2013 بحسب فحص الزميل الاستكشافي)، فيبقى مجتمع 2014 كاملاً كما سيُنشر النظام عليه. ولتحديد هؤلاء الطلاب قبل التجميد تُجاز</w:t>
+      </w:r>
+      <w:r>
+        <w:rPr>
+          <w:rtl/>
+        </w:rPr>
+        <w:t xml:space="preserve"> </w:t>
+      </w:r>
+      <w:r>
+        <w:rPr>
+          <w:rtl/>
+          <w:bCs/>
+          <w:b/>
+        </w:rPr>
+        <w:t xml:space="preserve">قراءة محدودة واحدة</w:t>
+      </w:r>
+      <w:r>
+        <w:rPr>
+          <w:rtl/>
+        </w:rPr>
+        <w:t xml:space="preserve"> </w:t>
+      </w:r>
+      <w:r>
+        <w:rPr>
+          <w:rtl/>
+        </w:rPr>
+        <w:t xml:space="preserve">هي الاستثناء الصريح الوحيد من حاجز D-09 (D-47): دالة مخصصة تقرأ من</w:t>
+      </w:r>
+      <w:r>
+        <w:rPr>
+          <w:rtl/>
+        </w:rPr>
+        <w:t xml:space="preserve"> </w:t>
+      </w:r>
+      <w:r>
+        <w:rPr>
+          <w:rStyle w:val="VerbatimChar"/>
+          <w:rtl/>
+        </w:rPr>
+        <w:t xml:space="preserve">studentRegistration.csv</w:t>
+      </w:r>
+      <w:r>
+        <w:rPr>
+          <w:rtl/>
+        </w:rPr>
+        <w:t xml:space="preserve"> </w:t>
+      </w:r>
+      <w:r>
+        <w:rPr>
+          <w:rtl/>
+        </w:rPr>
+        <w:t xml:space="preserve">لعروض 2014 الأعمدة</w:t>
+      </w:r>
+      <w:r>
+        <w:rPr>
+          <w:rtl/>
+        </w:rPr>
+        <w:t xml:space="preserve"> </w:t>
+      </w:r>
+      <w:r>
+        <w:rPr>
+          <w:rStyle w:val="VerbatimChar"/>
+          <w:rtl/>
+        </w:rPr>
+        <w:t xml:space="preserve">code_module, code_presentation, id_student</w:t>
+      </w:r>
+      <w:r>
+        <w:rPr>
+          <w:rtl/>
+        </w:rPr>
+        <w:t xml:space="preserve"> </w:t>
+      </w:r>
+      <w:r>
+        <w:rPr>
+          <w:rtl/>
+        </w:rPr>
+        <w:t xml:space="preserve">وحدها (</w:t>
+      </w:r>
+      <w:r>
+        <w:rPr>
+          <w:rStyle w:val="VerbatimChar"/>
+          <w:rtl/>
+        </w:rPr>
+        <w:t xml:space="preserve">usecols</w:t>
+      </w:r>
+      <w:r>
+        <w:rPr>
+          <w:rtl/>
+        </w:rPr>
+        <w:t xml:space="preserve">)، بلا</w:t>
+      </w:r>
+      <w:r>
+        <w:rPr>
+          <w:rtl/>
+        </w:rPr>
+        <w:t xml:space="preserve"> </w:t>
+      </w:r>
+      <w:r>
+        <w:rPr>
+          <w:rStyle w:val="VerbatimChar"/>
+          <w:rtl/>
+        </w:rPr>
+        <w:t xml:space="preserve">date_registration</w:t>
+      </w:r>
+      <w:r>
+        <w:rPr>
+          <w:rtl/>
+        </w:rPr>
+        <w:t xml:space="preserve"> </w:t>
+      </w:r>
+      <w:r>
+        <w:rPr>
+          <w:rtl/>
+        </w:rPr>
+        <w:t xml:space="preserve">ولا</w:t>
+      </w:r>
+      <w:r>
+        <w:rPr>
+          <w:rtl/>
+        </w:rPr>
+        <w:t xml:space="preserve"> </w:t>
+      </w:r>
+      <w:r>
+        <w:rPr>
+          <w:rStyle w:val="VerbatimChar"/>
+          <w:rtl/>
+        </w:rPr>
+        <w:t xml:space="preserve">date_unregistration</w:t>
+      </w:r>
+      <w:r>
+        <w:rPr>
+          <w:rtl/>
+        </w:rPr>
+        <w:t xml:space="preserve"> </w:t>
+      </w:r>
+      <w:r>
+        <w:rPr>
+          <w:rtl/>
+        </w:rPr>
+        <w:t xml:space="preserve">(فيه معلومة انسحاب = نتيجة)، ولا أي جدول آخر لـ2014؛ وتعيد مجموعة معرّفات فقط تُستعمل لترشيح تدريب H4-أ وحده؛ مع سجل وصول (</w:t>
+      </w:r>
+      <w:r>
+        <w:rPr>
+          <w:rStyle w:val="VerbatimChar"/>
+          <w:rtl/>
+        </w:rPr>
+        <w:t xml:space="preserve">results/access_log.jsonl</w:t>
+      </w:r>
+      <w:r>
+        <w:rPr>
+          <w:rtl/>
+        </w:rPr>
+        <w:t xml:space="preserve">: الزمن، وMD5، والأعمدة، وعدد المعرّفات، وcommit)، واختبار وحدة يتحقق من الأعمدة ومن رفض أي قراءة أخرى لـ2014، ومراجعة الزميل قبل الدمج.</w:t>
       </w:r>
       <w:r>
         <w:rPr>
@@ -7438,7 +8162,59 @@
         <w:rPr>
           <w:rtl/>
         </w:rPr>
-        <w:t xml:space="preserve">من عدد موارد الكتالوج المختلفة في التدريب، بين المتعلمين المقيَّمين في كل (عرض، أصل، طور). ويُبلَّغ عدد من لهم أقل من 5 موارد وصفاً لكل زوج. فهذه الشريحة «الأقل تاريخاً نسبياً»، لا «جديدة» بالمعنى المطلق، ويُكتب ذلك صراحة.</w:t>
+        <w:t xml:space="preserve">من عدد موارد الكتالوج المختلفة في التدريب، بين المتعلمين المقيَّمين في كل (عرض، أصل، طور). والشرط</w:t>
+      </w:r>
+      <w:r>
+        <w:rPr>
+          <w:rtl/>
+        </w:rPr>
+        <w:t xml:space="preserve"> </w:t>
+      </w:r>
+      <w:r>
+        <w:rPr>
+          <w:rtl/>
+          <w:bCs/>
+          <w:b/>
+        </w:rPr>
+        <w:t xml:space="preserve">n ≤ Q1</w:t>
+      </w:r>
+      <w:r>
+        <w:rPr>
+          <w:rtl/>
+        </w:rPr>
+        <w:t xml:space="preserve"> </w:t>
+      </w:r>
+      <w:r>
+        <w:rPr>
+          <w:rtl/>
+        </w:rPr>
+        <w:t xml:space="preserve">لكل (عرض، أصل، مهمة)، وتُبلَّغ دائماً</w:t>
+      </w:r>
+      <w:r>
+        <w:rPr>
+          <w:rtl/>
+        </w:rPr>
+        <w:t xml:space="preserve"> </w:t>
+      </w:r>
+      <w:r>
+        <w:rPr>
+          <w:rtl/>
+          <w:bCs/>
+          <w:b/>
+        </w:rPr>
+        <w:t xml:space="preserve">الحصة الفعلية</w:t>
+      </w:r>
+      <w:r>
+        <w:rPr>
+          <w:rtl/>
+        </w:rPr>
+        <w:t xml:space="preserve"> </w:t>
+      </w:r>
+      <w:r>
+        <w:rPr>
+          <w:rtl/>
+        </w:rPr>
+        <w:t xml:space="preserve">للشريحة من المقيَّمين (≈ 26.3% على التطوير) ومعها حصة «&lt; 5 موارد» (≈ 0.7%) (D-45). فهذه الشريحة «الأقل تاريخاً نسبياً»، لا «جديدة» بالمعنى المطلق، ويُكتب ذلك صراحة.</w:t>
       </w:r>
     </w:p>
     <w:p>
@@ -9725,7 +10501,7 @@
               <w:rPr>
                 <w:rtl/>
               </w:rPr>
-              <w:t xml:space="preserve">غير حاسمة أو مؤكَّدة بهامش صغير</w:t>
+              <w:t xml:space="preserve">غير حاسمة على الأرجح (MDE80 التوضيحي ≈ 0.053 &gt; 2δ؛ D-48)، أو مؤكَّدة بهامش صغير</w:t>
             </w:r>
           </w:p>
         </w:tc>
@@ -18037,7 +18813,33 @@
         <w:rPr>
           <w:rtl/>
         </w:rPr>
-        <w:t xml:space="preserve">؛ وأهداف المهمة B = الهدف كله؛ ويُقيَّم إن كان له تفاعل في التدريب وهدف واحد على الأقل؛ ويُوسم ضمن «الربع الأدنى» إن وقع عدد موارد الكتالوج المختلفة التي زارها في Q1 بين المقيَّمين في (العرض، الأصل، الطور)، مع عدّ من زار أقل من 5 موارد وصفاً (D-28).</w:t>
+        <w:t xml:space="preserve">؛ وأهداف المهمة B = الهدف كله؛ ويُقيَّم إن كان له تفاعل واحد على الأقل مع</w:t>
+      </w:r>
+      <w:r>
+        <w:rPr>
+          <w:rtl/>
+        </w:rPr>
+        <w:t xml:space="preserve"> </w:t>
+      </w:r>
+      <w:r>
+        <w:rPr>
+          <w:rtl/>
+          <w:bCs/>
+          <w:b/>
+        </w:rPr>
+        <w:t xml:space="preserve">مورد من الكتالوج</w:t>
+      </w:r>
+      <w:r>
+        <w:rPr>
+          <w:rtl/>
+        </w:rPr>
+        <w:t xml:space="preserve"> </w:t>
+      </w:r>
+      <w:r>
+        <w:rPr>
+          <w:rtl/>
+        </w:rPr>
+        <w:t xml:space="preserve">في التدريب وهدف واحد على الأقل، ومن له نقرات تنقل فقط يُعدّ ولا يُقيَّم (D-41)؛ ويُوسم ضمن «الربع الأدنى» إن وقع عدد موارد الكتالوج المختلفة التي زارها في Q1 بين المقيَّمين في (العرض، الأصل، الطور)، مع عدّ من زار أقل من 5 موارد وصفاً (D-28).</w:t>
       </w:r>
     </w:p>
     <w:p>
@@ -20754,7 +21556,95 @@
         <w:rPr>
           <w:rtl/>
         </w:rPr>
-        <w:t xml:space="preserve">عمود المورد i في المصفوفة (ثنائية أو موزونة)، و</w:t>
+        <w:t xml:space="preserve">عمود المورد i في المصفوفة</w:t>
+      </w:r>
+      <w:r>
+        <w:rPr>
+          <w:rtl/>
+        </w:rPr>
+        <w:t xml:space="preserve"> </w:t>
+      </w:r>
+      <w:r>
+        <w:rPr>
+          <w:rtl/>
+          <w:bCs/>
+          <w:b/>
+        </w:rPr>
+        <w:t xml:space="preserve">الثنائية</w:t>
+      </w:r>
+      <w:r>
+        <w:rPr>
+          <w:rtl/>
+        </w:rPr>
+        <w:t xml:space="preserve">: فالتشابه يُحسب على الأعمدة الثنائية مع التقليص، ومستوى الإشارة</w:t>
+      </w:r>
+      <w:r>
+        <w:rPr>
+          <w:rtl/>
+        </w:rPr>
+        <w:t xml:space="preserve"> </w:t>
+      </w:r>
+      <m:oMath>
+        <m:r>
+          <m:t>W</m:t>
+        </m:r>
+      </m:oMath>
+      <w:r>
+        <w:rPr>
+          <w:rtl/>
+        </w:rPr>
+        <w:t xml:space="preserve"> </w:t>
+      </w:r>
+      <w:r>
+        <w:rPr>
+          <w:rtl/>
+        </w:rPr>
+        <w:t xml:space="preserve">يدخل في التجميع</w:t>
+      </w:r>
+      <w:r>
+        <w:rPr>
+          <w:rtl/>
+        </w:rPr>
+        <w:t xml:space="preserve"> </w:t>
+      </w:r>
+      <m:oMath>
+        <m:r>
+          <m:t>s</m:t>
+        </m:r>
+        <m:d>
+          <m:dPr>
+            <m:begChr m:val="("/>
+            <m:endChr m:val=")"/>
+            <m:sepChr m:val=""/>
+            <m:grow/>
+          </m:dPr>
+          <m:e>
+            <m:r>
+              <m:t>u</m:t>
+            </m:r>
+            <m:r>
+              <m:rPr>
+                <m:sty m:val="p"/>
+              </m:rPr>
+              <m:t>,</m:t>
+            </m:r>
+            <m:r>
+              <m:t>j</m:t>
+            </m:r>
+          </m:e>
+        </m:d>
+      </m:oMath>
+      <w:r>
+        <w:rPr>
+          <w:rtl/>
+        </w:rPr>
+        <w:t xml:space="preserve"> </w:t>
+      </w:r>
+      <w:r>
+        <w:rPr>
+          <w:rtl/>
+        </w:rPr>
+        <w:t xml:space="preserve">فقط (D-43)، فيُعزل أثر الإشارة في ملف المتعلم ولا تقيس H2 شيئين معاً؛ و</w:t>
       </w:r>
       <m:oMath>
         <m:sSub>
@@ -22233,7 +23123,7 @@
         <w:rPr>
           <w:rtl/>
         </w:rPr>
-        <w:t xml:space="preserve">k ∈ {20, 50, 100, الكل}، وλ ∈ {0, 10, 50, 100}، ومستوى الإشارة ∈ {L0, …, L3}.</w:t>
+        <w:t xml:space="preserve">k ∈ {20, 50, 100, الكل}، وλ ∈ {0, 10, 50, 100}، ومستوى الإشارة ∈ {L0, …, L3} في التجميع وحده (D-43).</w:t>
       </w:r>
     </w:p>
     <w:bookmarkEnd w:id="50"/>
@@ -28815,7 +29705,27 @@
         <w:rPr>
           <w:rtl/>
         </w:rPr>
-        <w:t xml:space="preserve">). ملف المتعلم متوسط سمات ما زاره موزوناً بـ</w:t>
+        <w:t xml:space="preserve">،</w:t>
+      </w:r>
+      <w:r>
+        <w:rPr>
+          <w:rtl/>
+        </w:rPr>
+        <w:t xml:space="preserve"> </w:t>
+      </w:r>
+      <w:r>
+        <w:rPr>
+          <w:rtl/>
+          <w:bCs/>
+          <w:b/>
+        </w:rPr>
+        <w:t xml:space="preserve">مطبَّعة لكل مورد إلى مجموع 1</w:t>
+      </w:r>
+      <w:r>
+        <w:rPr>
+          <w:rtl/>
+        </w:rPr>
+        <w:t xml:space="preserve">، فيمثل الملف شكل استخدام المورد زمنياً لا مستواه، لأن المستوى شعبية تحملها المكوّنات (1) و(6)؛ والأيام بعد آخر موعد معروف تقع في الفئة &gt; 14؛ D-44). ملف المتعلم متوسط سمات ما زاره موزوناً بـ</w:t>
       </w:r>
       <m:oMath>
         <m:r>
@@ -33944,6 +34854,56 @@
           <w:rtl/>
         </w:rPr>
         <w:t xml:space="preserve">هي المختارة في ضبطها المنفرد لكل (عرض، أصل)، ولا يُعاد ضبطها داخل الهجين.</w:t>
+      </w:r>
+    </w:p>
+    <w:p>
+      <w:pPr>
+        <w:numPr>
+          <w:ilvl w:val="0"/>
+          <w:numId w:val="1042"/>
+        </w:numPr>
+        <w:pStyle w:val="Compact"/>
+        <w:bidi w:val="1"/>
+      </w:pPr>
+      <w:r>
+        <w:rPr>
+          <w:rtl/>
+          <w:bCs/>
+          <w:b/>
+        </w:rPr>
+        <w:t xml:space="preserve">اختيار الإعداد لكل مهمة (D-42):</w:t>
+      </w:r>
+      <w:r>
+        <w:rPr>
+          <w:rtl/>
+        </w:rPr>
+        <w:t xml:space="preserve"> </w:t>
+      </w:r>
+      <w:r>
+        <w:rPr>
+          <w:rtl/>
+        </w:rPr>
+        <w:t xml:space="preserve">يُختار إعداد كل نموذج بـNDCG@10 على التحقق لكل (عرض، أصل،</w:t>
+      </w:r>
+      <w:r>
+        <w:rPr>
+          <w:rtl/>
+        </w:rPr>
+        <w:t xml:space="preserve"> </w:t>
+      </w:r>
+      <w:r>
+        <w:rPr>
+          <w:rtl/>
+          <w:bCs/>
+          <w:b/>
+        </w:rPr>
+        <w:t xml:space="preserve">مهمة</w:t>
+      </w:r>
+      <w:r>
+        <w:rPr>
+          <w:rtl/>
+        </w:rPr>
+        <w:t xml:space="preserve">). لكن الفرضيات كلها على المهمة A وبإعدادات A، وتركيبة الهجين ومكوّناته وأوزانه تُضبط وتُجمَّد على المهمة A وحدها، وتُبلَّغ في المهمة B بإعدادات A مع ذكر ذلك.</w:t>
       </w:r>
     </w:p>
     <w:p>
@@ -45985,6 +46945,309 @@
         <w:t xml:space="preserve">ولا يُقيَّم التفسير بدراسة مستخدمين (خارج النطاق، D-22)، فلا ادعاء بأثره في الثقة أو التعلم.</w:t>
       </w:r>
     </w:p>
+    <w:p>
+      <w:pPr>
+        <w:bidi w:val="1"/>
+      </w:pPr>
+      <w:r>
+        <w:rPr>
+          <w:rtl/>
+          <w:bCs/>
+          <w:b/>
+        </w:rPr>
+        <w:t xml:space="preserve">إعادة التشغيل في الواجهة (D-49).</w:t>
+      </w:r>
+      <w:r>
+        <w:rPr>
+          <w:rtl/>
+        </w:rPr>
+        <w:t xml:space="preserve"> </w:t>
+      </w:r>
+      <w:r>
+        <w:rPr>
+          <w:rtl/>
+        </w:rPr>
+        <w:t xml:space="preserve">تعرض واجهة المتعلم توصيات تسجيل ما عند يوم مختار t (نمط إعادة التشغيل؛ D-22) بالقواعد الآتية، وكلها لا تستعمل إلا ما هو ≤ t فلا تسرب:</w:t>
+      </w:r>
+    </w:p>
+    <w:p>
+      <w:pPr>
+        <w:numPr>
+          <w:ilvl w:val="0"/>
+          <w:numId w:val="1052"/>
+        </w:numPr>
+        <w:pStyle w:val="Compact"/>
+        <w:bidi w:val="1"/>
+      </w:pPr>
+      <w:r>
+        <w:rPr>
+          <w:rtl/>
+        </w:rPr>
+        <w:t xml:space="preserve">المكوّنات الثقيلة (WRMF وGRU-lite) تُدرَّب عند القطوع الثلاثة فقط، والطلب عند t يستعمل معاملات</w:t>
+      </w:r>
+      <w:r>
+        <w:rPr>
+          <w:rtl/>
+        </w:rPr>
+        <w:t xml:space="preserve"> </w:t>
+      </w:r>
+      <w:r>
+        <w:rPr>
+          <w:rtl/>
+          <w:bCs/>
+          <w:b/>
+        </w:rPr>
+        <w:t xml:space="preserve">أقرب قطع c ≤ t</w:t>
+      </w:r>
+      <w:r>
+        <w:rPr>
+          <w:rtl/>
+        </w:rPr>
+        <w:t xml:space="preserve">.</w:t>
+      </w:r>
+    </w:p>
+    <w:p>
+      <w:pPr>
+        <w:numPr>
+          <w:ilvl w:val="0"/>
+          <w:numId w:val="1052"/>
+        </w:numPr>
+        <w:pStyle w:val="Compact"/>
+        <w:bidi w:val="1"/>
+      </w:pPr>
+      <w:r>
+        <w:rPr>
+          <w:rtl/>
+          <w:bCs/>
+          <w:b/>
+        </w:rPr>
+        <w:t xml:space="preserve">حالة المتعلم تُحسب عند t:</w:t>
+      </w:r>
+      <w:r>
+        <w:rPr>
+          <w:rtl/>
+        </w:rPr>
+        <w:t xml:space="preserve"> </w:t>
+      </w:r>
+      <w:r>
+        <w:rPr>
+          <w:rtl/>
+        </w:rPr>
+        <w:t xml:space="preserve">GRU بتمرير أمامي على تاريخه حتى t، وWRMF بـ</w:t>
+      </w:r>
+      <w:r>
+        <w:rPr>
+          <w:rtl/>
+          <w:bCs/>
+          <w:b/>
+        </w:rPr>
+        <w:t xml:space="preserve">fold-in</w:t>
+      </w:r>
+      <w:r>
+        <w:rPr>
+          <w:rtl/>
+        </w:rPr>
+        <w:t xml:space="preserve"> </w:t>
+      </w:r>
+      <w:r>
+        <w:rPr>
+          <w:rtl/>
+        </w:rPr>
+        <w:t xml:space="preserve">(نصف خطوة ALS مغلقة لـ</w:t>
+      </w:r>
+      <m:oMath>
+        <m:sSub>
+          <m:e>
+            <m:r>
+              <m:rPr>
+                <m:sty m:val="b"/>
+              </m:rPr>
+              <m:t>x</m:t>
+            </m:r>
+          </m:e>
+          <m:sub>
+            <m:r>
+              <m:t>u</m:t>
+            </m:r>
+          </m:sub>
+        </m:sSub>
+      </m:oMath>
+      <w:r>
+        <w:rPr>
+          <w:rtl/>
+        </w:rPr>
+        <w:t xml:space="preserve"> </w:t>
+      </w:r>
+      <w:r>
+        <w:rPr>
+          <w:rtl/>
+        </w:rPr>
+        <w:t xml:space="preserve">بـ</w:t>
+      </w:r>
+      <m:oMath>
+        <m:r>
+          <m:t>Y</m:t>
+        </m:r>
+      </m:oMath>
+      <w:r>
+        <w:rPr>
+          <w:rtl/>
+        </w:rPr>
+        <w:t xml:space="preserve"> </w:t>
+      </w:r>
+      <w:r>
+        <w:rPr>
+          <w:rtl/>
+        </w:rPr>
+        <w:t xml:space="preserve">ثابتة و</w:t>
+      </w:r>
+      <m:oMath>
+        <m:r>
+          <m:t>W</m:t>
+        </m:r>
+        <m:d>
+          <m:dPr>
+            <m:begChr m:val="("/>
+            <m:endChr m:val=")"/>
+            <m:sepChr m:val=""/>
+            <m:grow/>
+          </m:dPr>
+          <m:e>
+            <m:r>
+              <m:t>t</m:t>
+            </m:r>
+          </m:e>
+        </m:d>
+      </m:oMath>
+      <w:r>
+        <w:rPr>
+          <w:rtl/>
+        </w:rPr>
+        <w:t xml:space="preserve">). لا تدريب، والكلفة تافهة.</w:t>
+      </w:r>
+    </w:p>
+    <w:p>
+      <w:pPr>
+        <w:numPr>
+          <w:ilvl w:val="0"/>
+          <w:numId w:val="1052"/>
+        </w:numPr>
+        <w:pStyle w:val="Compact"/>
+        <w:bidi w:val="1"/>
+      </w:pPr>
+      <w:r>
+        <w:rPr>
+          <w:rtl/>
+        </w:rPr>
+        <w:t xml:space="preserve">المكوّنات الخفيفة (Recent-Pop وSKNN وMarkov وقرب التقييم) تُحسب عند t مباشرة.</w:t>
+      </w:r>
+    </w:p>
+    <w:p>
+      <w:pPr>
+        <w:numPr>
+          <w:ilvl w:val="0"/>
+          <w:numId w:val="1052"/>
+        </w:numPr>
+        <w:pStyle w:val="Compact"/>
+        <w:bidi w:val="1"/>
+      </w:pPr>
+      <w:r>
+        <w:rPr>
+          <w:rtl/>
+        </w:rPr>
+        <w:t xml:space="preserve">أوزان الهجين هي أوزان القطع c.</w:t>
+      </w:r>
+    </w:p>
+    <w:p>
+      <w:pPr>
+        <w:numPr>
+          <w:ilvl w:val="0"/>
+          <w:numId w:val="1052"/>
+        </w:numPr>
+        <w:pStyle w:val="Compact"/>
+        <w:bidi w:val="1"/>
+      </w:pPr>
+      <w:r>
+        <w:rPr>
+          <w:rtl/>
+        </w:rPr>
+        <w:t xml:space="preserve">عند t &lt; 70 لا مكوّن ثقيل متاح: يُستعمل المتاح مع</w:t>
+      </w:r>
+      <w:r>
+        <w:rPr>
+          <w:rtl/>
+        </w:rPr>
+        <w:t xml:space="preserve"> </w:t>
+      </w:r>
+      <w:r>
+        <w:rPr>
+          <w:rtl/>
+          <w:bCs/>
+          <w:b/>
+        </w:rPr>
+        <w:t xml:space="preserve">إعادة تطبيع الأوزان</w:t>
+      </w:r>
+      <w:r>
+        <w:rPr>
+          <w:rtl/>
+        </w:rPr>
+        <w:t xml:space="preserve">، ويُعرض ذلك للمستخدم.</w:t>
+      </w:r>
+    </w:p>
+    <w:p>
+      <w:pPr>
+        <w:numPr>
+          <w:ilvl w:val="0"/>
+          <w:numId w:val="1052"/>
+        </w:numPr>
+        <w:pStyle w:val="Compact"/>
+        <w:bidi w:val="1"/>
+      </w:pPr>
+      <w:r>
+        <w:rPr>
+          <w:rtl/>
+        </w:rPr>
+        <w:t xml:space="preserve">تعرض الواجهة «</w:t>
+      </w:r>
+      <w:r>
+        <w:rPr>
+          <w:rtl/>
+          <w:bCs/>
+          <w:b/>
+        </w:rPr>
+        <w:t xml:space="preserve">تاريخ النموذج = c</w:t>
+      </w:r>
+      <w:r>
+        <w:rPr>
+          <w:rtl/>
+        </w:rPr>
+        <w:t xml:space="preserve">».</w:t>
+      </w:r>
+    </w:p>
+    <w:p>
+      <w:pPr>
+        <w:numPr>
+          <w:ilvl w:val="0"/>
+          <w:numId w:val="1052"/>
+        </w:numPr>
+        <w:pStyle w:val="Compact"/>
+        <w:bidi w:val="1"/>
+      </w:pPr>
+      <w:r>
+        <w:rPr>
+          <w:rtl/>
+          <w:bCs/>
+          <w:b/>
+        </w:rPr>
+        <w:t xml:space="preserve">لا يُستخرج من إعادة التشغيل أي رقم تقييم</w:t>
+      </w:r>
+      <w:r>
+        <w:rPr>
+          <w:rtl/>
+        </w:rPr>
+        <w:t xml:space="preserve">؛ فالأرقام كلها من الحزام وحده.</w:t>
+      </w:r>
+    </w:p>
     <w:bookmarkEnd w:id="77"/>
     <w:bookmarkStart w:id="78" w:name="التعقيد-الحسابي-وقابلية-التوسع"/>
     <w:p>
@@ -49312,7 +50575,7 @@
       <w:pPr>
         <w:numPr>
           <w:ilvl w:val="0"/>
-          <w:numId w:val="1052"/>
+          <w:numId w:val="1053"/>
         </w:numPr>
         <w:pStyle w:val="Compact"/>
         <w:bidi w:val="1"/>
@@ -49415,127 +50678,6 @@
           <w:rtl/>
         </w:rPr>
         <w:t xml:space="preserve">، وفيها تُختار المعاملات.</w:t>
-      </w:r>
-    </w:p>
-    <w:p>
-      <w:pPr>
-        <w:numPr>
-          <w:ilvl w:val="0"/>
-          <w:numId w:val="1052"/>
-        </w:numPr>
-        <w:pStyle w:val="Compact"/>
-        <w:bidi w:val="1"/>
-      </w:pPr>
-      <w:r>
-        <w:rPr>
-          <w:rtl/>
-          <w:bCs/>
-          <w:b/>
-        </w:rPr>
-        <w:t xml:space="preserve">مرحلة الاختبار:</w:t>
-      </w:r>
-      <w:r>
-        <w:rPr>
-          <w:rtl/>
-        </w:rPr>
-        <w:t xml:space="preserve"> </w:t>
-      </w:r>
-      <w:r>
-        <w:rPr>
-          <w:rtl/>
-        </w:rPr>
-        <w:t xml:space="preserve">إعادة التدريب حتى t بالمعاملات المختارة، ثم الاختبار على</w:t>
-      </w:r>
-      <w:r>
-        <w:rPr>
-          <w:rtl/>
-        </w:rPr>
-        <w:t xml:space="preserve"> </w:t>
-      </w:r>
-      <m:oMath>
-        <m:r>
-          <m:rPr>
-            <m:sty m:val="p"/>
-          </m:rPr>
-          <m:t>(</m:t>
-        </m:r>
-        <m:r>
-          <m:t>t</m:t>
-        </m:r>
-        <m:r>
-          <m:rPr>
-            <m:sty m:val="p"/>
-          </m:rPr>
-          <m:t>,</m:t>
-        </m:r>
-        <m:r>
-          <m:t>t</m:t>
-        </m:r>
-        <m:r>
-          <m:rPr>
-            <m:sty m:val="p"/>
-          </m:rPr>
-          <m:t>+</m:t>
-        </m:r>
-        <m:r>
-          <m:t>14</m:t>
-        </m:r>
-        <m:r>
-          <m:rPr>
-            <m:sty m:val="p"/>
-          </m:rPr>
-          <m:t>]</m:t>
-        </m:r>
-      </m:oMath>
-      <w:r>
-        <w:rPr>
-          <w:rtl/>
-        </w:rPr>
-        <w:t xml:space="preserve">.</w:t>
-      </w:r>
-    </w:p>
-    <w:p>
-      <w:pPr>
-        <w:numPr>
-          <w:ilvl w:val="0"/>
-          <w:numId w:val="1052"/>
-        </w:numPr>
-        <w:pStyle w:val="Compact"/>
-        <w:bidi w:val="1"/>
-      </w:pPr>
-      <w:r>
-        <w:rPr>
-          <w:rtl/>
-          <w:bCs/>
-          <w:b/>
-        </w:rPr>
-        <w:t xml:space="preserve">لماذا القطع العام لا ترك العنصر الأخير؟</w:t>
-      </w:r>
-      <w:r>
-        <w:rPr>
-          <w:rtl/>
-        </w:rPr>
-        <w:t xml:space="preserve"> </w:t>
-      </w:r>
-      <w:r>
-        <w:rPr>
-          <w:rtl/>
-        </w:rPr>
-        <w:t xml:space="preserve">لأن ترك العنصر الأخير لكل متعلم يسمح لنموذج الشعبية بأن «يرى» تفاعلات متعلمين آخرين بعد لحظة الهدف، فيتسرب المستقبل (المحضر §3.8). ولماذا ثلاثة أصول؟ لتغطية بداية العرض ووسطه وآخره والحماية من حظ نقطة قطع واحدة.</w:t>
-      </w:r>
-    </w:p>
-    <w:bookmarkEnd w:id="82"/>
-    <w:bookmarkStart w:id="83" w:name="المهمتان-والكتالوج-والمتعلمون-المقيمون"/>
-    <w:p>
-      <w:pPr>
-        <w:pStyle w:val="Heading2"/>
-        <w:bidi w:val="1"/>
-      </w:pPr>
-      <w:r>
-        <w:rPr>
-          <w:rtl/>
-        </w:rPr>
-        <w:t xml:space="preserve">5.2 المهمتان والكتالوج والمتعلمون المقيَّمون</w:t>
       </w:r>
     </w:p>
     <w:p>
@@ -49553,6 +50695,127 @@
           <w:bCs/>
           <w:b/>
         </w:rPr>
+        <w:t xml:space="preserve">مرحلة الاختبار:</w:t>
+      </w:r>
+      <w:r>
+        <w:rPr>
+          <w:rtl/>
+        </w:rPr>
+        <w:t xml:space="preserve"> </w:t>
+      </w:r>
+      <w:r>
+        <w:rPr>
+          <w:rtl/>
+        </w:rPr>
+        <w:t xml:space="preserve">إعادة التدريب حتى t بالمعاملات المختارة، ثم الاختبار على</w:t>
+      </w:r>
+      <w:r>
+        <w:rPr>
+          <w:rtl/>
+        </w:rPr>
+        <w:t xml:space="preserve"> </w:t>
+      </w:r>
+      <m:oMath>
+        <m:r>
+          <m:rPr>
+            <m:sty m:val="p"/>
+          </m:rPr>
+          <m:t>(</m:t>
+        </m:r>
+        <m:r>
+          <m:t>t</m:t>
+        </m:r>
+        <m:r>
+          <m:rPr>
+            <m:sty m:val="p"/>
+          </m:rPr>
+          <m:t>,</m:t>
+        </m:r>
+        <m:r>
+          <m:t>t</m:t>
+        </m:r>
+        <m:r>
+          <m:rPr>
+            <m:sty m:val="p"/>
+          </m:rPr>
+          <m:t>+</m:t>
+        </m:r>
+        <m:r>
+          <m:t>14</m:t>
+        </m:r>
+        <m:r>
+          <m:rPr>
+            <m:sty m:val="p"/>
+          </m:rPr>
+          <m:t>]</m:t>
+        </m:r>
+      </m:oMath>
+      <w:r>
+        <w:rPr>
+          <w:rtl/>
+        </w:rPr>
+        <w:t xml:space="preserve">.</w:t>
+      </w:r>
+    </w:p>
+    <w:p>
+      <w:pPr>
+        <w:numPr>
+          <w:ilvl w:val="0"/>
+          <w:numId w:val="1053"/>
+        </w:numPr>
+        <w:pStyle w:val="Compact"/>
+        <w:bidi w:val="1"/>
+      </w:pPr>
+      <w:r>
+        <w:rPr>
+          <w:rtl/>
+          <w:bCs/>
+          <w:b/>
+        </w:rPr>
+        <w:t xml:space="preserve">لماذا القطع العام لا ترك العنصر الأخير؟</w:t>
+      </w:r>
+      <w:r>
+        <w:rPr>
+          <w:rtl/>
+        </w:rPr>
+        <w:t xml:space="preserve"> </w:t>
+      </w:r>
+      <w:r>
+        <w:rPr>
+          <w:rtl/>
+        </w:rPr>
+        <w:t xml:space="preserve">لأن ترك العنصر الأخير لكل متعلم يسمح لنموذج الشعبية بأن «يرى» تفاعلات متعلمين آخرين بعد لحظة الهدف، فيتسرب المستقبل (المحضر §3.8). ولماذا ثلاثة أصول؟ لتغطية بداية العرض ووسطه وآخره والحماية من حظ نقطة قطع واحدة.</w:t>
+      </w:r>
+    </w:p>
+    <w:bookmarkEnd w:id="82"/>
+    <w:bookmarkStart w:id="83" w:name="المهمتان-والكتالوج-والمتعلمون-المقيمون"/>
+    <w:p>
+      <w:pPr>
+        <w:pStyle w:val="Heading2"/>
+        <w:bidi w:val="1"/>
+      </w:pPr>
+      <w:r>
+        <w:rPr>
+          <w:rtl/>
+        </w:rPr>
+        <w:t xml:space="preserve">5.2 المهمتان والكتالوج والمتعلمون المقيَّمون</w:t>
+      </w:r>
+    </w:p>
+    <w:p>
+      <w:pPr>
+        <w:numPr>
+          <w:ilvl w:val="0"/>
+          <w:numId w:val="1054"/>
+        </w:numPr>
+        <w:pStyle w:val="Compact"/>
+        <w:bidi w:val="1"/>
+      </w:pPr>
+      <w:r>
+        <w:rPr>
+          <w:rtl/>
+          <w:bCs/>
+          <w:b/>
+        </w:rPr>
         <w:t xml:space="preserve">المهمة A (الأساسية، اكتشاف الجديد):</w:t>
       </w:r>
       <w:r>
@@ -49754,7 +51017,7 @@
       <w:pPr>
         <w:numPr>
           <w:ilvl w:val="0"/>
-          <w:numId w:val="1053"/>
+          <w:numId w:val="1054"/>
         </w:numPr>
         <w:pStyle w:val="Compact"/>
         <w:bidi w:val="1"/>
@@ -49824,7 +51087,7 @@
       <w:pPr>
         <w:numPr>
           <w:ilvl w:val="0"/>
-          <w:numId w:val="1053"/>
+          <w:numId w:val="1054"/>
         </w:numPr>
         <w:pStyle w:val="Compact"/>
         <w:bidi w:val="1"/>
@@ -49880,7 +51143,7 @@
       <w:pPr>
         <w:numPr>
           <w:ilvl w:val="0"/>
-          <w:numId w:val="1053"/>
+          <w:numId w:val="1054"/>
         </w:numPr>
         <w:pStyle w:val="Compact"/>
         <w:bidi w:val="1"/>
@@ -49891,26 +51154,52 @@
           <w:bCs/>
           <w:b/>
         </w:rPr>
-        <w:t xml:space="preserve">المتعلمون المقيَّمون:</w:t>
-      </w:r>
-      <w:r>
-        <w:rPr>
-          <w:rtl/>
-        </w:rPr>
-        <w:t xml:space="preserve"> </w:t>
-      </w:r>
-      <w:r>
-        <w:rPr>
-          <w:rtl/>
-        </w:rPr>
-        <w:t xml:space="preserve">لهم هدف واحد على الأقل في الاختبار (للمهمة المعنية)، وتفاعل واحد على الأقل في التدريب. وتُذكر نسبة المقيَّمين من المسجلين النشطين لكل (عرض، أصل).</w:t>
+        <w:t xml:space="preserve">المتعلمون المقيَّمون (D-41):</w:t>
+      </w:r>
+      <w:r>
+        <w:rPr>
+          <w:rtl/>
+        </w:rPr>
+        <w:t xml:space="preserve"> </w:t>
+      </w:r>
+      <w:r>
+        <w:rPr>
+          <w:rtl/>
+        </w:rPr>
+        <w:t xml:space="preserve">لهم هدف واحد على الأقل في الاختبار (للمهمة المعنية)، وتفاعل واحد على الأقل مع</w:t>
+      </w:r>
+      <w:r>
+        <w:rPr>
+          <w:rtl/>
+        </w:rPr>
+        <w:t xml:space="preserve"> </w:t>
+      </w:r>
+      <w:r>
+        <w:rPr>
+          <w:rtl/>
+          <w:bCs/>
+          <w:b/>
+        </w:rPr>
+        <w:t xml:space="preserve">مورد من الكتالوج</w:t>
+      </w:r>
+      <w:r>
+        <w:rPr>
+          <w:rtl/>
+        </w:rPr>
+        <w:t xml:space="preserve"> </w:t>
+      </w:r>
+      <w:r>
+        <w:rPr>
+          <w:rtl/>
+        </w:rPr>
+        <w:t xml:space="preserve">في التدريب. ومن له نقرات تنقل فقط لا يُقيَّم، ويُبلَّغ عدده. و«نسبة المقيَّمين» = المقيَّمون ÷ النشطون بنشاط غير مستبعد في نافذة الهدف، لكل (عرض، أصل).</w:t>
       </w:r>
     </w:p>
     <w:p>
       <w:pPr>
         <w:numPr>
           <w:ilvl w:val="0"/>
-          <w:numId w:val="1053"/>
+          <w:numId w:val="1054"/>
         </w:numPr>
         <w:pStyle w:val="Compact"/>
         <w:bidi w:val="1"/>
@@ -49933,7 +51222,7 @@
         <w:rPr>
           <w:rtl/>
         </w:rPr>
-        <w:t xml:space="preserve">الربع الأدنى (Q1، والتعادل عند الحد يدخل) من عدد موارد الكتالوج المختلفة في التدريب بين المقيَّمين في كل (عرض، أصل، طور)؛ ويُبلَّغ عدد من لهم أقل من 5 موارد وصفاً لكل زوج (D-28).</w:t>
+        <w:t xml:space="preserve">الربع الأدنى (n ≤ Q1، والتعادل عند الحد يدخل) من عدد موارد الكتالوج المختلفة في التدريب بين المقيَّمين في كل (عرض، أصل، مهمة)؛ وتُبلَّغ الحصة الفعلية (≈ 26.3% على التطوير) وعدد من لهم أقل من 5 موارد وحصتهم (≈ 0.7%) لكل زوج (D-28، D-45).</w:t>
       </w:r>
     </w:p>
     <w:p>
@@ -53252,7 +54541,7 @@
       <w:pPr>
         <w:numPr>
           <w:ilvl w:val="0"/>
-          <w:numId w:val="1054"/>
+          <w:numId w:val="1055"/>
         </w:numPr>
         <w:pStyle w:val="Compact"/>
         <w:bidi w:val="1"/>
@@ -53377,7 +54666,7 @@
       <w:pPr>
         <w:numPr>
           <w:ilvl w:val="0"/>
-          <w:numId w:val="1054"/>
+          <w:numId w:val="1055"/>
         </w:numPr>
         <w:pStyle w:val="Compact"/>
         <w:bidi w:val="1"/>
@@ -53658,7 +54947,7 @@
       <w:pPr>
         <w:numPr>
           <w:ilvl w:val="0"/>
-          <w:numId w:val="1054"/>
+          <w:numId w:val="1055"/>
         </w:numPr>
         <w:pStyle w:val="Compact"/>
         <w:bidi w:val="1"/>
@@ -54989,7 +56278,7 @@
       <w:pPr>
         <w:numPr>
           <w:ilvl w:val="0"/>
-          <w:numId w:val="1055"/>
+          <w:numId w:val="1056"/>
         </w:numPr>
         <w:pStyle w:val="Compact"/>
         <w:bidi w:val="1"/>
@@ -55045,7 +56334,7 @@
       <w:pPr>
         <w:numPr>
           <w:ilvl w:val="0"/>
-          <w:numId w:val="1055"/>
+          <w:numId w:val="1056"/>
         </w:numPr>
         <w:pStyle w:val="Compact"/>
         <w:bidi w:val="1"/>
@@ -55095,7 +56384,7 @@
       <w:pPr>
         <w:numPr>
           <w:ilvl w:val="0"/>
-          <w:numId w:val="1055"/>
+          <w:numId w:val="1056"/>
         </w:numPr>
         <w:pStyle w:val="Compact"/>
         <w:bidi w:val="1"/>
@@ -55125,7 +56414,7 @@
       <w:pPr>
         <w:numPr>
           <w:ilvl w:val="0"/>
-          <w:numId w:val="1055"/>
+          <w:numId w:val="1056"/>
         </w:numPr>
         <w:pStyle w:val="Compact"/>
         <w:bidi w:val="1"/>
@@ -55155,7 +56444,7 @@
       <w:pPr>
         <w:numPr>
           <w:ilvl w:val="0"/>
-          <w:numId w:val="1055"/>
+          <w:numId w:val="1056"/>
         </w:numPr>
         <w:pStyle w:val="Compact"/>
         <w:bidi w:val="1"/>
@@ -55185,7 +56474,7 @@
       <w:pPr>
         <w:numPr>
           <w:ilvl w:val="0"/>
-          <w:numId w:val="1055"/>
+          <w:numId w:val="1056"/>
         </w:numPr>
         <w:pStyle w:val="Compact"/>
         <w:bidi w:val="1"/>
@@ -55711,7 +57000,7 @@
               <w:rPr>
                 <w:rtl/>
               </w:rPr>
-              <w:t xml:space="preserve">الصف 4: الفاصل يشمل الصفر ويتجاوز δ معاً</w:t>
+              <w:t xml:space="preserve">الصف 4: الفاصل يشمل الصفر ويتجاوز δ معاً؛ + «لا يكشف التصميم بقوة 80% أثراً أصغر من MDE80 = x»</w:t>
             </w:r>
           </w:p>
         </w:tc>
@@ -55809,7 +57098,7 @@
               <w:rPr>
                 <w:rtl/>
               </w:rPr>
-              <w:t xml:space="preserve">الصف 4: الأثر ≥ δ والفاصل موجب، لكن p بعد Holm ≥ 0.05</w:t>
+              <w:t xml:space="preserve">الصف 4: الأثر ≥ δ والفاصل موجب، لكن p بعد Holm ≥ 0.05؛ + وصف MDE80 نفسه</w:t>
             </w:r>
           </w:p>
         </w:tc>
@@ -56086,7 +57375,7 @@
       <w:pPr>
         <w:numPr>
           <w:ilvl w:val="0"/>
-          <w:numId w:val="1056"/>
+          <w:numId w:val="1057"/>
         </w:numPr>
         <w:pStyle w:val="Compact"/>
         <w:bidi w:val="1"/>
@@ -56188,7 +57477,7 @@
       <w:pPr>
         <w:numPr>
           <w:ilvl w:val="0"/>
-          <w:numId w:val="1056"/>
+          <w:numId w:val="1057"/>
         </w:numPr>
         <w:pStyle w:val="Compact"/>
         <w:bidi w:val="1"/>
@@ -56211,215 +57500,6 @@
           <w:rtl/>
         </w:rPr>
         <w:t xml:space="preserve">) مسموحة لأنها معروفة مسبقاً.</w:t>
-      </w:r>
-    </w:p>
-    <w:p>
-      <w:pPr>
-        <w:numPr>
-          <w:ilvl w:val="0"/>
-          <w:numId w:val="1056"/>
-        </w:numPr>
-        <w:pStyle w:val="Compact"/>
-        <w:bidi w:val="1"/>
-      </w:pPr>
-      <w:r>
-        <w:rPr>
-          <w:rStyle w:val="VerbatimChar"/>
-          <w:rtl/>
-        </w:rPr>
-        <w:t xml:space="preserve">studentAssessment</w:t>
-      </w:r>
-      <w:r>
-        <w:rPr>
-          <w:rtl/>
-        </w:rPr>
-        <w:t xml:space="preserve"> </w:t>
-      </w:r>
-      <w:r>
-        <w:rPr>
-          <w:rtl/>
-        </w:rPr>
-        <w:t xml:space="preserve">بعد القطع و</w:t>
-      </w:r>
-      <w:r>
-        <w:rPr>
-          <w:rStyle w:val="VerbatimChar"/>
-          <w:rtl/>
-        </w:rPr>
-        <w:t xml:space="preserve">final_result</w:t>
-      </w:r>
-      <w:r>
-        <w:rPr>
-          <w:rtl/>
-        </w:rPr>
-        <w:t xml:space="preserve"> </w:t>
-      </w:r>
-      <w:r>
-        <w:rPr>
-          <w:rtl/>
-        </w:rPr>
-        <w:t xml:space="preserve">ممنوعان ملامحَ؛ ويُسمح بـ</w:t>
-      </w:r>
-      <w:r>
-        <w:rPr>
-          <w:rStyle w:val="VerbatimChar"/>
-          <w:rtl/>
-        </w:rPr>
-        <w:t xml:space="preserve">final_result</w:t>
-      </w:r>
-      <w:r>
-        <w:rPr>
-          <w:rtl/>
-        </w:rPr>
-        <w:t xml:space="preserve"> </w:t>
-      </w:r>
-      <w:r>
-        <w:rPr>
-          <w:rtl/>
-        </w:rPr>
-        <w:t xml:space="preserve">متغيرَ تحليل لاحق للشرائح فقط.</w:t>
-      </w:r>
-    </w:p>
-    <w:p>
-      <w:pPr>
-        <w:numPr>
-          <w:ilvl w:val="0"/>
-          <w:numId w:val="1056"/>
-        </w:numPr>
-        <w:pStyle w:val="Compact"/>
-        <w:bidi w:val="1"/>
-      </w:pPr>
-      <w:r>
-        <w:rPr>
-          <w:rtl/>
-          <w:bCs/>
-          <w:b/>
-        </w:rPr>
-        <w:t xml:space="preserve">التسرب على مستوى التصميم</w:t>
-      </w:r>
-      <w:r>
-        <w:rPr>
-          <w:rtl/>
-        </w:rPr>
-        <w:t xml:space="preserve"> </w:t>
-      </w:r>
-      <w:r>
-        <w:rPr>
-          <w:rtl/>
-        </w:rPr>
-        <w:t xml:space="preserve">يُمنع بفصل عروض التطوير عن التأكيد، وبالتجميد قبل تشغيل 2014 مرة واحدة. وطبقة البيانات تمنع أي قراءة لبيانات 2014 (بما فيها بنية الموارد لـE8) قبل وسم التجميد، ولا يُتجاوز المنع.</w:t>
-      </w:r>
-    </w:p>
-    <w:p>
-      <w:pPr>
-        <w:numPr>
-          <w:ilvl w:val="0"/>
-          <w:numId w:val="1056"/>
-        </w:numPr>
-        <w:pStyle w:val="Compact"/>
-        <w:bidi w:val="1"/>
-      </w:pPr>
-      <w:r>
-        <w:rPr>
-          <w:rtl/>
-          <w:bCs/>
-          <w:b/>
-        </w:rPr>
-        <w:t xml:space="preserve">اختبارات وحدة للتسرب:</w:t>
-      </w:r>
-      <w:r>
-        <w:rPr>
-          <w:rtl/>
-        </w:rPr>
-        <w:t xml:space="preserve"> </w:t>
-      </w:r>
-      <w:r>
-        <w:rPr>
-          <w:rtl/>
-        </w:rPr>
-        <w:t xml:space="preserve">تغيير أي سجل بعد</w:t>
-      </w:r>
-      <w:r>
-        <w:rPr>
-          <w:rtl/>
-        </w:rPr>
-        <w:t xml:space="preserve"> </w:t>
-      </w:r>
-      <m:oMath>
-        <m:sSub>
-          <m:e>
-            <m:r>
-              <m:t>t</m:t>
-            </m:r>
-          </m:e>
-          <m:sub>
-            <m:r>
-              <m:t>0</m:t>
-            </m:r>
-          </m:sub>
-        </m:sSub>
-      </m:oMath>
-      <w:r>
-        <w:rPr>
-          <w:rtl/>
-        </w:rPr>
-        <w:t xml:space="preserve"> </w:t>
-      </w:r>
-      <w:r>
-        <w:rPr>
-          <w:rtl/>
-        </w:rPr>
-        <w:t xml:space="preserve">لا يغير أي درجة في مرحلة الضبط؛ والمرتِّب الكامل (oracle) يعطي NDCG = 1؛ والعشوائي يعطي ≈ K/N في HR.</w:t>
-      </w:r>
-    </w:p>
-    <w:bookmarkEnd w:id="95"/>
-    <w:bookmarkStart w:id="96" w:name="تحليل-الإنصاف-الوصفي"/>
-    <w:p>
-      <w:pPr>
-        <w:pStyle w:val="Heading2"/>
-        <w:bidi w:val="1"/>
-      </w:pPr>
-      <w:r>
-        <w:rPr>
-          <w:rtl/>
-        </w:rPr>
-        <w:t xml:space="preserve">5.10 تحليل الإنصاف الوصفي</w:t>
-      </w:r>
-    </w:p>
-    <w:p>
-      <w:pPr>
-        <w:bidi w:val="1"/>
-      </w:pPr>
-      <w:r>
-        <w:rPr>
-          <w:rtl/>
-        </w:rPr>
-        <w:t xml:space="preserve">بحسب</w:t>
-      </w:r>
-      <w:r>
-        <w:rPr>
-          <w:rtl/>
-        </w:rPr>
-        <w:t xml:space="preserve"> </w:t>
-      </w:r>
-      <w:r>
-        <w:rPr>
-          <w:rStyle w:val="VerbatimChar"/>
-          <w:rtl/>
-        </w:rPr>
-        <w:t xml:space="preserve">gender, disability, imd_band, age_band</w:t>
-      </w:r>
-      <w:r>
-        <w:rPr>
-          <w:rtl/>
-        </w:rPr>
-        <w:t xml:space="preserve"> </w:t>
-      </w:r>
-      <w:r>
-        <w:rPr>
-          <w:rtl/>
-        </w:rPr>
-        <w:t xml:space="preserve">(D-21؛ ADR-002 §3.6.11):</w:t>
       </w:r>
     </w:p>
     <w:p>
@@ -56433,23 +57513,60 @@
       </w:pPr>
       <w:r>
         <w:rPr>
-          <w:rtl/>
-          <w:bCs/>
-          <w:b/>
-        </w:rPr>
-        <w:t xml:space="preserve">للتوصية:</w:t>
-      </w:r>
-      <w:r>
-        <w:rPr>
-          <w:rtl/>
-        </w:rPr>
-        <w:t xml:space="preserve"> </w:t>
-      </w:r>
-      <w:r>
-        <w:rPr>
-          <w:rtl/>
-        </w:rPr>
-        <w:t xml:space="preserve">فرق NDCG@10 وHR@10 (المهمة A) بين المجموعات، مع فاصل ثقة bootstrap.</w:t>
+          <w:rStyle w:val="VerbatimChar"/>
+          <w:rtl/>
+        </w:rPr>
+        <w:t xml:space="preserve">studentAssessment</w:t>
+      </w:r>
+      <w:r>
+        <w:rPr>
+          <w:rtl/>
+        </w:rPr>
+        <w:t xml:space="preserve"> </w:t>
+      </w:r>
+      <w:r>
+        <w:rPr>
+          <w:rtl/>
+        </w:rPr>
+        <w:t xml:space="preserve">بعد القطع و</w:t>
+      </w:r>
+      <w:r>
+        <w:rPr>
+          <w:rStyle w:val="VerbatimChar"/>
+          <w:rtl/>
+        </w:rPr>
+        <w:t xml:space="preserve">final_result</w:t>
+      </w:r>
+      <w:r>
+        <w:rPr>
+          <w:rtl/>
+        </w:rPr>
+        <w:t xml:space="preserve"> </w:t>
+      </w:r>
+      <w:r>
+        <w:rPr>
+          <w:rtl/>
+        </w:rPr>
+        <w:t xml:space="preserve">ممنوعان ملامحَ؛ ويُسمح بـ</w:t>
+      </w:r>
+      <w:r>
+        <w:rPr>
+          <w:rStyle w:val="VerbatimChar"/>
+          <w:rtl/>
+        </w:rPr>
+        <w:t xml:space="preserve">final_result</w:t>
+      </w:r>
+      <w:r>
+        <w:rPr>
+          <w:rtl/>
+        </w:rPr>
+        <w:t xml:space="preserve"> </w:t>
+      </w:r>
+      <w:r>
+        <w:rPr>
+          <w:rtl/>
+        </w:rPr>
+        <w:t xml:space="preserve">متغيرَ تحليل لاحق للشرائح فقط.</w:t>
       </w:r>
     </w:p>
     <w:p>
@@ -56467,19 +57584,70 @@
           <w:bCs/>
           <w:b/>
         </w:rPr>
-        <w:t xml:space="preserve">للمصنِّف:</w:t>
-      </w:r>
-      <w:r>
-        <w:rPr>
-          <w:rtl/>
-        </w:rPr>
-        <w:t xml:space="preserve"> </w:t>
-      </w:r>
-      <w:r>
-        <w:rPr>
-          <w:rtl/>
-        </w:rPr>
-        <w:t xml:space="preserve">FNR (نسبة المعرّضين الذين لم يُكشفوا) وFPR (نسبة غير المعرّضين الموسومين خطأً) لكل مجموعة، مع فواصل ثقة.</w:t>
+        <w:t xml:space="preserve">التسرب على مستوى التصميم</w:t>
+      </w:r>
+      <w:r>
+        <w:rPr>
+          <w:rtl/>
+        </w:rPr>
+        <w:t xml:space="preserve"> </w:t>
+      </w:r>
+      <w:r>
+        <w:rPr>
+          <w:rtl/>
+        </w:rPr>
+        <w:t xml:space="preserve">يُمنع بفصل عروض التطوير عن التأكيد، وبالتجميد قبل تشغيل 2014 مرة واحدة. وطبقة البيانات تمنع أي قراءة لبيانات 2014 (بما فيها بنية الموارد لـE8) قبل وسم التجميد، ولا يُتجاوز المنع</w:t>
+      </w:r>
+      <w:r>
+        <w:rPr>
+          <w:rtl/>
+        </w:rPr>
+        <w:t xml:space="preserve"> </w:t>
+      </w:r>
+      <w:r>
+        <w:rPr>
+          <w:rtl/>
+          <w:bCs/>
+          <w:b/>
+        </w:rPr>
+        <w:t xml:space="preserve">إلا بالاستثناء الوحيد D-47</w:t>
+      </w:r>
+      <w:r>
+        <w:rPr>
+          <w:rtl/>
+        </w:rPr>
+        <w:t xml:space="preserve"> </w:t>
+      </w:r>
+      <w:r>
+        <w:rPr>
+          <w:rtl/>
+        </w:rPr>
+        <w:t xml:space="preserve">(معرّفات الطلاب من ثلاثة أعمدة في</w:t>
+      </w:r>
+      <w:r>
+        <w:rPr>
+          <w:rtl/>
+        </w:rPr>
+        <w:t xml:space="preserve"> </w:t>
+      </w:r>
+      <w:r>
+        <w:rPr>
+          <w:rStyle w:val="VerbatimChar"/>
+          <w:rtl/>
+        </w:rPr>
+        <w:t xml:space="preserve">studentRegistration</w:t>
+      </w:r>
+      <w:r>
+        <w:rPr>
+          <w:rtl/>
+        </w:rPr>
+        <w:t xml:space="preserve"> </w:t>
+      </w:r>
+      <w:r>
+        <w:rPr>
+          <w:rtl/>
+        </w:rPr>
+        <w:t xml:space="preserve">لترشيح تدريب H4-أ، بسجل وصول واختبار وحدة؛ القسم 2.6). والمعرّفات لا تحمل سلوكاً ولا نتيجة، فلا تسرب منها.</w:t>
       </w:r>
     </w:p>
     <w:p>
@@ -56497,19 +57665,76 @@
           <w:bCs/>
           <w:b/>
         </w:rPr>
-        <w:t xml:space="preserve">بلا فرضية ولا حكم تأكيدي.</w:t>
-      </w:r>
-      <w:r>
-        <w:rPr>
-          <w:rtl/>
-        </w:rPr>
-        <w:t xml:space="preserve"> </w:t>
-      </w:r>
-      <w:r>
-        <w:rPr>
-          <w:rtl/>
-        </w:rPr>
-        <w:t xml:space="preserve">ويُناقَش أي فرق كبير مع حجم المجموعة وتداخله مع</w:t>
+        <w:t xml:space="preserve">اختبارات وحدة للتسرب:</w:t>
+      </w:r>
+      <w:r>
+        <w:rPr>
+          <w:rtl/>
+        </w:rPr>
+        <w:t xml:space="preserve"> </w:t>
+      </w:r>
+      <w:r>
+        <w:rPr>
+          <w:rtl/>
+        </w:rPr>
+        <w:t xml:space="preserve">تغيير أي سجل بعد</w:t>
+      </w:r>
+      <w:r>
+        <w:rPr>
+          <w:rtl/>
+        </w:rPr>
+        <w:t xml:space="preserve"> </w:t>
+      </w:r>
+      <m:oMath>
+        <m:sSub>
+          <m:e>
+            <m:r>
+              <m:t>t</m:t>
+            </m:r>
+          </m:e>
+          <m:sub>
+            <m:r>
+              <m:t>0</m:t>
+            </m:r>
+          </m:sub>
+        </m:sSub>
+      </m:oMath>
+      <w:r>
+        <w:rPr>
+          <w:rtl/>
+        </w:rPr>
+        <w:t xml:space="preserve"> </w:t>
+      </w:r>
+      <w:r>
+        <w:rPr>
+          <w:rtl/>
+        </w:rPr>
+        <w:t xml:space="preserve">لا يغير أي درجة في مرحلة الضبط؛ والمرتِّب الكامل (oracle) يعطي NDCG = 1؛ والعشوائي يعطي ≈ K/N في HR.</w:t>
+      </w:r>
+    </w:p>
+    <w:bookmarkEnd w:id="95"/>
+    <w:bookmarkStart w:id="96" w:name="تحليل-الإنصاف-الوصفي"/>
+    <w:p>
+      <w:pPr>
+        <w:pStyle w:val="Heading2"/>
+        <w:bidi w:val="1"/>
+      </w:pPr>
+      <w:r>
+        <w:rPr>
+          <w:rtl/>
+        </w:rPr>
+        <w:t xml:space="preserve">5.10 تحليل الإنصاف الوصفي</w:t>
+      </w:r>
+    </w:p>
+    <w:p>
+      <w:pPr>
+        <w:bidi w:val="1"/>
+      </w:pPr>
+      <w:r>
+        <w:rPr>
+          <w:rtl/>
+        </w:rPr>
+        <w:t xml:space="preserve">بحسب</w:t>
       </w:r>
       <w:r>
         <w:rPr>
@@ -56522,20 +57747,135 @@
           <w:rStyle w:val="VerbatimChar"/>
           <w:rtl/>
         </w:rPr>
-        <w:t xml:space="preserve">final_result</w:t>
-      </w:r>
-      <w:r>
-        <w:rPr>
-          <w:rtl/>
-        </w:rPr>
-        <w:t xml:space="preserve">، بلا ادعاء سببي.</w:t>
+        <w:t xml:space="preserve">gender, disability, imd_band, age_band</w:t>
+      </w:r>
+      <w:r>
+        <w:rPr>
+          <w:rtl/>
+        </w:rPr>
+        <w:t xml:space="preserve"> </w:t>
+      </w:r>
+      <w:r>
+        <w:rPr>
+          <w:rtl/>
+        </w:rPr>
+        <w:t xml:space="preserve">(D-21؛ ADR-002 §3.6.11):</w:t>
       </w:r>
     </w:p>
     <w:p>
       <w:pPr>
         <w:numPr>
           <w:ilvl w:val="0"/>
-          <w:numId w:val="1057"/>
+          <w:numId w:val="1058"/>
+        </w:numPr>
+        <w:pStyle w:val="Compact"/>
+        <w:bidi w:val="1"/>
+      </w:pPr>
+      <w:r>
+        <w:rPr>
+          <w:rtl/>
+          <w:bCs/>
+          <w:b/>
+        </w:rPr>
+        <w:t xml:space="preserve">للتوصية:</w:t>
+      </w:r>
+      <w:r>
+        <w:rPr>
+          <w:rtl/>
+        </w:rPr>
+        <w:t xml:space="preserve"> </w:t>
+      </w:r>
+      <w:r>
+        <w:rPr>
+          <w:rtl/>
+        </w:rPr>
+        <w:t xml:space="preserve">فرق NDCG@10 وHR@10 (المهمة A) بين المجموعات، مع فاصل ثقة bootstrap.</w:t>
+      </w:r>
+    </w:p>
+    <w:p>
+      <w:pPr>
+        <w:numPr>
+          <w:ilvl w:val="0"/>
+          <w:numId w:val="1058"/>
+        </w:numPr>
+        <w:pStyle w:val="Compact"/>
+        <w:bidi w:val="1"/>
+      </w:pPr>
+      <w:r>
+        <w:rPr>
+          <w:rtl/>
+          <w:bCs/>
+          <w:b/>
+        </w:rPr>
+        <w:t xml:space="preserve">للمصنِّف:</w:t>
+      </w:r>
+      <w:r>
+        <w:rPr>
+          <w:rtl/>
+        </w:rPr>
+        <w:t xml:space="preserve"> </w:t>
+      </w:r>
+      <w:r>
+        <w:rPr>
+          <w:rtl/>
+        </w:rPr>
+        <w:t xml:space="preserve">FNR (نسبة المعرّضين الذين لم يُكشفوا) وFPR (نسبة غير المعرّضين الموسومين خطأً) لكل مجموعة، مع فواصل ثقة.</w:t>
+      </w:r>
+    </w:p>
+    <w:p>
+      <w:pPr>
+        <w:numPr>
+          <w:ilvl w:val="0"/>
+          <w:numId w:val="1058"/>
+        </w:numPr>
+        <w:pStyle w:val="Compact"/>
+        <w:bidi w:val="1"/>
+      </w:pPr>
+      <w:r>
+        <w:rPr>
+          <w:rtl/>
+          <w:bCs/>
+          <w:b/>
+        </w:rPr>
+        <w:t xml:space="preserve">بلا فرضية ولا حكم تأكيدي.</w:t>
+      </w:r>
+      <w:r>
+        <w:rPr>
+          <w:rtl/>
+        </w:rPr>
+        <w:t xml:space="preserve"> </w:t>
+      </w:r>
+      <w:r>
+        <w:rPr>
+          <w:rtl/>
+        </w:rPr>
+        <w:t xml:space="preserve">ويُناقَش أي فرق كبير مع حجم المجموعة وتداخله مع</w:t>
+      </w:r>
+      <w:r>
+        <w:rPr>
+          <w:rtl/>
+        </w:rPr>
+        <w:t xml:space="preserve"> </w:t>
+      </w:r>
+      <w:r>
+        <w:rPr>
+          <w:rStyle w:val="VerbatimChar"/>
+          <w:rtl/>
+        </w:rPr>
+        <w:t xml:space="preserve">final_result</w:t>
+      </w:r>
+      <w:r>
+        <w:rPr>
+          <w:rtl/>
+        </w:rPr>
+        <w:t xml:space="preserve">، بلا ادعاء سببي.</w:t>
+      </w:r>
+    </w:p>
+    <w:p>
+      <w:pPr>
+        <w:numPr>
+          <w:ilvl w:val="0"/>
+          <w:numId w:val="1058"/>
         </w:numPr>
         <w:pStyle w:val="Compact"/>
         <w:bidi w:val="1"/>
@@ -64646,7 +65986,7 @@
               <w:rPr>
                 <w:rtl/>
               </w:rPr>
-              <w:t xml:space="preserve">يُكتب في 2.2 قبل التجميد (D-25)</w:t>
+              <w:t xml:space="preserve">جدول لكل فرضية (الجدول 2-ب) قبل التجميد (D-25، D-46)</w:t>
             </w:r>
           </w:p>
         </w:tc>
@@ -66556,7 +67896,7 @@
               <w:rPr>
                 <w:rtl/>
               </w:rPr>
-              <w:t xml:space="preserve">تقدير σ وMDE80 وكتابته في §2.2 (D-25)</w:t>
+              <w:t xml:space="preserve">σ وMDE80 لـH2-أ من زوجها (D-46)</w:t>
             </w:r>
           </w:p>
         </w:tc>
@@ -66588,7 +67928,7 @@
               <w:rPr>
                 <w:rtl/>
               </w:rPr>
-              <w:t xml:space="preserve">E2</w:t>
+              <w:t xml:space="preserve">E3</w:t>
             </w:r>
           </w:p>
         </w:tc>
@@ -67046,6 +68386,72 @@
                 <w:rtl/>
               </w:rPr>
               <w:t xml:space="preserve">E5، E7أ</w:t>
+            </w:r>
+          </w:p>
+        </w:tc>
+      </w:tr>
+      <w:tr>
+        <w:tc>
+          <w:tcPr/>
+          <w:p>
+            <w:pPr>
+              <w:pStyle w:val="Compact"/>
+              <w:bidi w:val="1"/>
+              <w:jc w:val="left"/>
+            </w:pPr>
+            <w:r>
+              <w:rPr>
+                <w:rtl/>
+              </w:rPr>
+              <w:t xml:space="preserve">—</w:t>
+            </w:r>
+          </w:p>
+        </w:tc>
+        <w:tc>
+          <w:tcPr/>
+          <w:p>
+            <w:pPr>
+              <w:pStyle w:val="Compact"/>
+              <w:bidi w:val="1"/>
+              <w:jc w:val="left"/>
+            </w:pPr>
+            <w:r>
+              <w:rPr>
+                <w:rtl/>
+              </w:rPr>
+              <w:t xml:space="preserve">جدول MDE80 الكامل (H3 بعد E5، وH4-أ بعد E6ب، وH1 بعد E7ب) في الجدول 2-ب</w:t>
+            </w:r>
+          </w:p>
+        </w:tc>
+        <w:tc>
+          <w:tcPr/>
+          <w:p>
+            <w:pPr>
+              <w:pStyle w:val="Compact"/>
+              <w:bidi w:val="1"/>
+              <w:jc w:val="left"/>
+            </w:pPr>
+            <w:r>
+              <w:rPr>
+                <w:rtl/>
+              </w:rPr>
+              <w:t xml:space="preserve">12-09 → 12-11</w:t>
+            </w:r>
+          </w:p>
+        </w:tc>
+        <w:tc>
+          <w:tcPr/>
+          <w:p>
+            <w:pPr>
+              <w:pStyle w:val="Compact"/>
+              <w:bidi w:val="1"/>
+              <w:jc w:val="left"/>
+            </w:pPr>
+            <w:r>
+              <w:rPr>
+                <w:rtl/>
+              </w:rPr>
+              <w:t xml:space="preserve">E5، E6ب، E7ب</w:t>
             </w:r>
           </w:p>
         </w:tc>
@@ -67896,7 +69302,7 @@
               <w:rPr>
                 <w:rtl/>
               </w:rPr>
-              <w:t xml:space="preserve">، وفضاءات المعاملات، وσ وMDE80</w:t>
+              <w:t xml:space="preserve">، وفضاءات المعاملات</w:t>
             </w:r>
           </w:p>
         </w:tc>
@@ -67978,7 +69384,7 @@
               <w:rPr>
                 <w:rtl/>
               </w:rPr>
-              <w:t xml:space="preserve">فضاءات τ وβ وα؛ تقدير تباين الفرق</w:t>
+              <w:t xml:space="preserve">فضاءات τ وβ وα؛ σ وMDE80 لـH2-أ (D-46)</w:t>
             </w:r>
           </w:p>
         </w:tc>
@@ -69147,7 +70553,7 @@
       <w:pPr>
         <w:numPr>
           <w:ilvl w:val="0"/>
-          <w:numId w:val="1058"/>
+          <w:numId w:val="1059"/>
         </w:numPr>
         <w:pStyle w:val="Compact"/>
         <w:bidi w:val="1"/>
@@ -69171,242 +70577,6 @@
           <w:rtl/>
         </w:rPr>
         <w:t xml:space="preserve">E0 ثم E1. لا يُشغَّل نموذج قبل أن يجتاز الحزام اختباراته (ADR-002 §5).</w:t>
-      </w:r>
-    </w:p>
-    <w:p>
-      <w:pPr>
-        <w:numPr>
-          <w:ilvl w:val="0"/>
-          <w:numId w:val="1058"/>
-        </w:numPr>
-        <w:pStyle w:val="Compact"/>
-        <w:bidi w:val="1"/>
-      </w:pPr>
-      <w:r>
-        <w:rPr>
-          <w:rtl/>
-          <w:bCs/>
-          <w:b/>
-        </w:rPr>
-        <w:t xml:space="preserve">خطوط الأساس قبل المقترح:</w:t>
-      </w:r>
-      <w:r>
-        <w:rPr>
-          <w:rtl/>
-        </w:rPr>
-        <w:t xml:space="preserve"> </w:t>
-      </w:r>
-      <w:r>
-        <w:rPr>
-          <w:rtl/>
-        </w:rPr>
-        <w:t xml:space="preserve">E2، ثم تقدير σ وMDE80، ثم E3 وE4 بالتوازي.</w:t>
-      </w:r>
-    </w:p>
-    <w:p>
-      <w:pPr>
-        <w:numPr>
-          <w:ilvl w:val="0"/>
-          <w:numId w:val="1058"/>
-        </w:numPr>
-        <w:pStyle w:val="Compact"/>
-        <w:bidi w:val="1"/>
-      </w:pPr>
-      <w:r>
-        <w:rPr>
-          <w:rtl/>
-          <w:bCs/>
-          <w:b/>
-        </w:rPr>
-        <w:t xml:space="preserve">العصبوني بعد غير العصبوني:</w:t>
-      </w:r>
-      <w:r>
-        <w:rPr>
-          <w:rtl/>
-        </w:rPr>
-        <w:t xml:space="preserve"> </w:t>
-      </w:r>
-      <w:r>
-        <w:rPr>
-          <w:rtl/>
-        </w:rPr>
-        <w:t xml:space="preserve">E5 لا يبدأ تقييمه قبل جاهزية</w:t>
-      </w:r>
-      <w:r>
-        <w:rPr>
-          <w:rtl/>
-        </w:rPr>
-        <w:t xml:space="preserve"> </w:t>
-      </w:r>
-      <m:oMath>
-        <m:sSup>
-          <m:e>
-            <m:r>
-              <m:t>S</m:t>
-            </m:r>
-          </m:e>
-          <m:sup>
-            <m:r>
-              <m:rPr>
-                <m:sty m:val="p"/>
-              </m:rPr>
-              <m:t>*</m:t>
-            </m:r>
-          </m:sup>
-        </m:sSup>
-      </m:oMath>
-      <w:r>
-        <w:rPr>
-          <w:rtl/>
-        </w:rPr>
-        <w:t xml:space="preserve"> </w:t>
-      </w:r>
-      <w:r>
-        <w:rPr>
-          <w:rtl/>
-        </w:rPr>
-        <w:t xml:space="preserve">من E4.</w:t>
-      </w:r>
-    </w:p>
-    <w:p>
-      <w:pPr>
-        <w:numPr>
-          <w:ilvl w:val="0"/>
-          <w:numId w:val="1058"/>
-        </w:numPr>
-        <w:pStyle w:val="Compact"/>
-        <w:bidi w:val="1"/>
-      </w:pPr>
-      <w:r>
-        <w:rPr>
-          <w:rtl/>
-          <w:bCs/>
-          <w:b/>
-        </w:rPr>
-        <w:t xml:space="preserve">العناقيد قبل القبول:</w:t>
-      </w:r>
-      <w:r>
-        <w:rPr>
-          <w:rtl/>
-        </w:rPr>
-        <w:t xml:space="preserve"> </w:t>
-      </w:r>
-      <w:r>
-        <w:rPr>
-          <w:rtl/>
-        </w:rPr>
-        <w:t xml:space="preserve">E6أ قبل E7أ، لأن المكوّن (7) يحتاجها.</w:t>
-      </w:r>
-    </w:p>
-    <w:p>
-      <w:pPr>
-        <w:numPr>
-          <w:ilvl w:val="0"/>
-          <w:numId w:val="1058"/>
-        </w:numPr>
-        <w:pStyle w:val="Compact"/>
-        <w:bidi w:val="1"/>
-      </w:pPr>
-      <w:r>
-        <w:rPr>
-          <w:rtl/>
-          <w:bCs/>
-          <w:b/>
-        </w:rPr>
-        <w:t xml:space="preserve">E7أ ← E5 ← E6ب ← E7ب ← مخزون ← E9.</w:t>
-      </w:r>
-      <w:r>
-        <w:rPr>
-          <w:rtl/>
-        </w:rPr>
-        <w:t xml:space="preserve"> </w:t>
-      </w:r>
-      <w:r>
-        <w:rPr>
-          <w:rtl/>
-        </w:rPr>
-        <w:t xml:space="preserve">وE8</w:t>
-      </w:r>
-      <w:r>
-        <w:rPr>
-          <w:rtl/>
-        </w:rPr>
-        <w:t xml:space="preserve"> </w:t>
-      </w:r>
-      <w:r>
-        <w:rPr>
-          <w:rtl/>
-          <w:bCs/>
-          <w:b/>
-        </w:rPr>
-        <w:t xml:space="preserve">بعد E10</w:t>
-      </w:r>
-      <w:r>
-        <w:rPr>
-          <w:rtl/>
-        </w:rPr>
-        <w:t xml:space="preserve"> </w:t>
-      </w:r>
-      <w:r>
-        <w:rPr>
-          <w:rtl/>
-        </w:rPr>
-        <w:t xml:space="preserve">لأنه يقرأ بنية موارد 2014، وطبقة البيانات تمنع أي قراءة لبيانات 2014 قبل وسم التجميد.</w:t>
-      </w:r>
-    </w:p>
-    <w:p>
-      <w:pPr>
-        <w:numPr>
-          <w:ilvl w:val="0"/>
-          <w:numId w:val="1058"/>
-        </w:numPr>
-        <w:pStyle w:val="Compact"/>
-        <w:bidi w:val="1"/>
-      </w:pPr>
-      <w:r>
-        <w:rPr>
-          <w:rtl/>
-          <w:bCs/>
-          <w:b/>
-        </w:rPr>
-        <w:t xml:space="preserve">التأكيد مرة واحدة:</w:t>
-      </w:r>
-      <w:r>
-        <w:rPr>
-          <w:rtl/>
-        </w:rPr>
-        <w:t xml:space="preserve"> </w:t>
-      </w:r>
-      <w:r>
-        <w:rPr>
-          <w:rtl/>
-        </w:rPr>
-        <w:t xml:space="preserve">E10، ثم E11–E13 تحليلات ثانوية. وأي تغيير بعد E10 يُبلَّغ تحليلاً لاحقاً (post-hoc).</w:t>
-      </w:r>
-    </w:p>
-    <w:bookmarkEnd w:id="101"/>
-    <w:bookmarkStart w:id="102" w:name="معايير-التجميد-قبل-تشغيل-2014"/>
-    <w:p>
-      <w:pPr>
-        <w:pStyle w:val="Heading2"/>
-        <w:bidi w:val="1"/>
-      </w:pPr>
-      <w:r>
-        <w:rPr>
-          <w:rtl/>
-        </w:rPr>
-        <w:t xml:space="preserve">7.3 معايير التجميد قبل تشغيل 2014</w:t>
-      </w:r>
-    </w:p>
-    <w:p>
-      <w:pPr>
-        <w:bidi w:val="1"/>
-      </w:pPr>
-      <w:r>
-        <w:rPr>
-          <w:rtl/>
-        </w:rPr>
-        <w:t xml:space="preserve">لا يبدأ E10 إلا إن تحققت كل البنود الآتية، ووُقّع عليها في محضر اجتماع التجميد 03 (12-14):</w:t>
       </w:r>
     </w:p>
     <w:p>
@@ -69421,8 +70591,22 @@
       <w:r>
         <w:rPr>
           <w:rtl/>
-        </w:rPr>
-        <w:t xml:space="preserve">☐ مجموعة الاستبعاد E بالأنواع الخمسة مطبَّقة (نهائية؛ D-38).</w:t>
+          <w:bCs/>
+          <w:b/>
+        </w:rPr>
+        <w:t xml:space="preserve">خطوط الأساس قبل المقترح:</w:t>
+      </w:r>
+      <w:r>
+        <w:rPr>
+          <w:rtl/>
+        </w:rPr>
+        <w:t xml:space="preserve"> </w:t>
+      </w:r>
+      <w:r>
+        <w:rPr>
+          <w:rtl/>
+        </w:rPr>
+        <w:t xml:space="preserve">E2، ثم E3 وE4 بالتوازي؛ وσ وMDE80 لكل فرضية من زوجها الفعلي فور جاهزيته (H2-أ بعد E3، وH3 بعد E5، وH4-أ بعد E6ب، وH1 بعد E7ب؛ D-46).</w:t>
       </w:r>
     </w:p>
     <w:p>
@@ -69437,8 +70621,57 @@
       <w:r>
         <w:rPr>
           <w:rtl/>
-        </w:rPr>
-        <w:t xml:space="preserve">☐ δ = 0.02 وδ_AUC = 0.02 مثبتان (نهائيان؛ D-25، D-27).</w:t>
+          <w:bCs/>
+          <w:b/>
+        </w:rPr>
+        <w:t xml:space="preserve">العصبوني بعد غير العصبوني:</w:t>
+      </w:r>
+      <w:r>
+        <w:rPr>
+          <w:rtl/>
+        </w:rPr>
+        <w:t xml:space="preserve"> </w:t>
+      </w:r>
+      <w:r>
+        <w:rPr>
+          <w:rtl/>
+        </w:rPr>
+        <w:t xml:space="preserve">E5 لا يبدأ تقييمه قبل جاهزية</w:t>
+      </w:r>
+      <w:r>
+        <w:rPr>
+          <w:rtl/>
+        </w:rPr>
+        <w:t xml:space="preserve"> </w:t>
+      </w:r>
+      <m:oMath>
+        <m:sSup>
+          <m:e>
+            <m:r>
+              <m:t>S</m:t>
+            </m:r>
+          </m:e>
+          <m:sup>
+            <m:r>
+              <m:rPr>
+                <m:sty m:val="p"/>
+              </m:rPr>
+              <m:t>*</m:t>
+            </m:r>
+          </m:sup>
+        </m:sSup>
+      </m:oMath>
+      <w:r>
+        <w:rPr>
+          <w:rtl/>
+        </w:rPr>
+        <w:t xml:space="preserve"> </w:t>
+      </w:r>
+      <w:r>
+        <w:rPr>
+          <w:rtl/>
+        </w:rPr>
+        <w:t xml:space="preserve">من E4.</w:t>
       </w:r>
     </w:p>
     <w:p>
@@ -69453,34 +70686,22 @@
       <w:r>
         <w:rPr>
           <w:rtl/>
-        </w:rPr>
-        <w:t xml:space="preserve">☐</w:t>
-      </w:r>
-      <w:r>
-        <w:rPr>
-          <w:rtl/>
-        </w:rPr>
-        <w:t xml:space="preserve"> </w:t>
-      </w:r>
-      <w:r>
-        <w:rPr>
-          <w:rtl/>
           <w:bCs/>
           <w:b/>
         </w:rPr>
-        <w:t xml:space="preserve">MDE80 مكتوب</w:t>
-      </w:r>
-      <w:r>
-        <w:rPr>
-          <w:rtl/>
-        </w:rPr>
-        <w:t xml:space="preserve"> </w:t>
-      </w:r>
-      <w:r>
-        <w:rPr>
-          <w:rtl/>
-        </w:rPr>
-        <w:t xml:space="preserve">في §2.2 من تباين التطوير (D-25).</w:t>
+        <w:t xml:space="preserve">العناقيد قبل القبول:</w:t>
+      </w:r>
+      <w:r>
+        <w:rPr>
+          <w:rtl/>
+        </w:rPr>
+        <w:t xml:space="preserve"> </w:t>
+      </w:r>
+      <w:r>
+        <w:rPr>
+          <w:rtl/>
+        </w:rPr>
+        <w:t xml:space="preserve">E6أ قبل E7أ، لأن المكوّن (7) يحتاجها.</w:t>
       </w:r>
     </w:p>
     <w:p>
@@ -69495,80 +70716,136 @@
       <w:r>
         <w:rPr>
           <w:rtl/>
-        </w:rPr>
-        <w:t xml:space="preserve">☐</w:t>
-      </w:r>
-      <w:r>
-        <w:rPr>
-          <w:rtl/>
-        </w:rPr>
-        <w:t xml:space="preserve"> </w:t>
-      </w:r>
-      <m:oMath>
-        <m:sSubSup>
-          <m:e>
-            <m:r>
-              <m:t>B</m:t>
-            </m:r>
-          </m:e>
-          <m:sub>
-            <m:r>
-              <m:t>n</m:t>
-            </m:r>
-            <m:r>
-              <m:t>p</m:t>
-            </m:r>
-          </m:sub>
-          <m:sup>
-            <m:r>
-              <m:rPr>
-                <m:sty m:val="p"/>
-              </m:rPr>
-              <m:t>*</m:t>
-            </m:r>
-          </m:sup>
-        </m:sSubSup>
-      </m:oMath>
-      <w:r>
-        <w:rPr>
-          <w:rtl/>
-        </w:rPr>
-        <w:t xml:space="preserve"> </w:t>
-      </w:r>
-      <w:r>
-        <w:rPr>
-          <w:rtl/>
-        </w:rPr>
-        <w:t xml:space="preserve">و</w:t>
-      </w:r>
-      <m:oMath>
-        <m:sSup>
-          <m:e>
-            <m:r>
-              <m:t>S</m:t>
-            </m:r>
-          </m:e>
-          <m:sup>
-            <m:r>
-              <m:rPr>
-                <m:sty m:val="p"/>
-              </m:rPr>
-              <m:t>*</m:t>
-            </m:r>
-          </m:sup>
-        </m:sSup>
-      </m:oMath>
-      <w:r>
-        <w:rPr>
-          <w:rtl/>
-        </w:rPr>
-        <w:t xml:space="preserve"> </w:t>
-      </w:r>
-      <w:r>
-        <w:rPr>
-          <w:rtl/>
-        </w:rPr>
-        <w:t xml:space="preserve">محددان نوعاً على نوافذ اختبار 2013 ومثبتان.</w:t>
+          <w:bCs/>
+          <w:b/>
+        </w:rPr>
+        <w:t xml:space="preserve">E7أ ← E5 ← E6ب ← E7ب ← مخزون ← E9.</w:t>
+      </w:r>
+      <w:r>
+        <w:rPr>
+          <w:rtl/>
+        </w:rPr>
+        <w:t xml:space="preserve"> </w:t>
+      </w:r>
+      <w:r>
+        <w:rPr>
+          <w:rtl/>
+        </w:rPr>
+        <w:t xml:space="preserve">وE8</w:t>
+      </w:r>
+      <w:r>
+        <w:rPr>
+          <w:rtl/>
+        </w:rPr>
+        <w:t xml:space="preserve"> </w:t>
+      </w:r>
+      <w:r>
+        <w:rPr>
+          <w:rtl/>
+          <w:bCs/>
+          <w:b/>
+        </w:rPr>
+        <w:t xml:space="preserve">بعد E10</w:t>
+      </w:r>
+      <w:r>
+        <w:rPr>
+          <w:rtl/>
+        </w:rPr>
+        <w:t xml:space="preserve"> </w:t>
+      </w:r>
+      <w:r>
+        <w:rPr>
+          <w:rtl/>
+        </w:rPr>
+        <w:t xml:space="preserve">لأنه يقرأ بنية موارد 2014، وطبقة البيانات تمنع أي قراءة لبيانات 2014 قبل وسم التجميد، باستثناء وحيد موثق (D-47): قراءة</w:t>
+      </w:r>
+      <w:r>
+        <w:rPr>
+          <w:rtl/>
+        </w:rPr>
+        <w:t xml:space="preserve"> </w:t>
+      </w:r>
+      <w:r>
+        <w:rPr>
+          <w:rStyle w:val="VerbatimChar"/>
+          <w:rtl/>
+        </w:rPr>
+        <w:t xml:space="preserve">code_module, code_presentation, id_student</w:t>
+      </w:r>
+      <w:r>
+        <w:rPr>
+          <w:rtl/>
+        </w:rPr>
+        <w:t xml:space="preserve"> </w:t>
+      </w:r>
+      <w:r>
+        <w:rPr>
+          <w:rtl/>
+        </w:rPr>
+        <w:t xml:space="preserve">من</w:t>
+      </w:r>
+      <w:r>
+        <w:rPr>
+          <w:rtl/>
+        </w:rPr>
+        <w:t xml:space="preserve"> </w:t>
+      </w:r>
+      <w:r>
+        <w:rPr>
+          <w:rStyle w:val="VerbatimChar"/>
+          <w:rtl/>
+        </w:rPr>
+        <w:t xml:space="preserve">studentRegistration</w:t>
+      </w:r>
+      <w:r>
+        <w:rPr>
+          <w:rtl/>
+        </w:rPr>
+        <w:t xml:space="preserve"> </w:t>
+      </w:r>
+      <w:r>
+        <w:rPr>
+          <w:rtl/>
+        </w:rPr>
+        <w:t xml:space="preserve">لعروض 2014 بـ</w:t>
+      </w:r>
+      <w:r>
+        <w:rPr>
+          <w:rStyle w:val="VerbatimChar"/>
+          <w:rtl/>
+        </w:rPr>
+        <w:t xml:space="preserve">usecols</w:t>
+      </w:r>
+      <w:r>
+        <w:rPr>
+          <w:rtl/>
+        </w:rPr>
+        <w:t xml:space="preserve">، بلا</w:t>
+      </w:r>
+      <w:r>
+        <w:rPr>
+          <w:rtl/>
+        </w:rPr>
+        <w:t xml:space="preserve"> </w:t>
+      </w:r>
+      <w:r>
+        <w:rPr>
+          <w:rStyle w:val="VerbatimChar"/>
+          <w:rtl/>
+        </w:rPr>
+        <w:t xml:space="preserve">date_unregistration</w:t>
+      </w:r>
+      <w:r>
+        <w:rPr>
+          <w:rtl/>
+        </w:rPr>
+        <w:t xml:space="preserve"> </w:t>
+      </w:r>
+      <w:r>
+        <w:rPr>
+          <w:rtl/>
+        </w:rPr>
+        <w:t xml:space="preserve">ولا أي تاريخ أو سلوك، لترشيح تدريب H4-أ، مع سجل وصول واختبار وحدة ومراجعة الزميل.</w:t>
       </w:r>
     </w:p>
     <w:p>
@@ -69583,15 +70860,54 @@
       <w:r>
         <w:rPr>
           <w:rtl/>
-        </w:rPr>
-        <w:t xml:space="preserve">☐ تركيبة الهجين (≤ 4 مكوّنات)، وأوزانها الابتدائية، وفضاءات كل المعاملات (بما فيها τ وβ وα وشبكة السمبلكس) مثبتة في ملفات إعداد.</w:t>
+          <w:bCs/>
+          <w:b/>
+        </w:rPr>
+        <w:t xml:space="preserve">التأكيد مرة واحدة:</w:t>
+      </w:r>
+      <w:r>
+        <w:rPr>
+          <w:rtl/>
+        </w:rPr>
+        <w:t xml:space="preserve"> </w:t>
+      </w:r>
+      <w:r>
+        <w:rPr>
+          <w:rtl/>
+        </w:rPr>
+        <w:t xml:space="preserve">E10، ثم E11–E13 تحليلات ثانوية. وأي تغيير بعد E10 يُبلَّغ تحليلاً لاحقاً (post-hoc).</w:t>
+      </w:r>
+    </w:p>
+    <w:bookmarkEnd w:id="101"/>
+    <w:bookmarkStart w:id="102" w:name="معايير-التجميد-قبل-تشغيل-2014"/>
+    <w:p>
+      <w:pPr>
+        <w:pStyle w:val="Heading2"/>
+        <w:bidi w:val="1"/>
+      </w:pPr>
+      <w:r>
+        <w:rPr>
+          <w:rtl/>
+        </w:rPr>
+        <w:t xml:space="preserve">7.3 معايير التجميد قبل تشغيل 2014</w:t>
+      </w:r>
+    </w:p>
+    <w:p>
+      <w:pPr>
+        <w:bidi w:val="1"/>
+      </w:pPr>
+      <w:r>
+        <w:rPr>
+          <w:rtl/>
+        </w:rPr>
+        <w:t xml:space="preserve">لا يبدأ E10 إلا إن تحققت كل البنود الآتية، ووُقّع عليها في محضر اجتماع التجميد 03 (12-14):</w:t>
       </w:r>
     </w:p>
     <w:p>
       <w:pPr>
         <w:numPr>
           <w:ilvl w:val="0"/>
-          <w:numId w:val="1059"/>
+          <w:numId w:val="1060"/>
         </w:numPr>
         <w:pStyle w:val="Compact"/>
         <w:bidi w:val="1"/>
@@ -69600,34 +70916,14 @@
         <w:rPr>
           <w:rtl/>
         </w:rPr>
-        <w:t xml:space="preserve">☐</w:t>
-      </w:r>
-      <w:r>
-        <w:rPr>
-          <w:rtl/>
-        </w:rPr>
-        <w:t xml:space="preserve"> </w:t>
-      </w:r>
-      <w:r>
-        <w:rPr>
-          <w:rtl/>
-          <w:bCs/>
-          <w:b/>
-        </w:rPr>
-        <w:t xml:space="preserve">حالة الأرضية في HYB* موثقة</w:t>
-      </w:r>
-      <w:r>
-        <w:rPr>
-          <w:rtl/>
-        </w:rPr>
-        <w:t xml:space="preserve">: هل دخل المكوّن الشخصي بالقبول أم بالأرضية (D-30).</w:t>
+        <w:t xml:space="preserve">☐ مجموعة الاستبعاد E بالأنواع الخمسة مطبَّقة (نهائية؛ D-38).</w:t>
       </w:r>
     </w:p>
     <w:p>
       <w:pPr>
         <w:numPr>
           <w:ilvl w:val="0"/>
-          <w:numId w:val="1059"/>
+          <w:numId w:val="1060"/>
         </w:numPr>
         <w:pStyle w:val="Compact"/>
         <w:bidi w:val="1"/>
@@ -69636,14 +70932,14 @@
         <w:rPr>
           <w:rtl/>
         </w:rPr>
-        <w:t xml:space="preserve">☐ حالة GRU-lite موثقة: اجتاز البوابات، أو «محاولة موثقة» مع H3 «غير قابلة للاختبار» وp = 1.</w:t>
+        <w:t xml:space="preserve">☐ δ = 0.02 وδ_AUC = 0.02 مثبتان (نهائيان؛ D-25، D-27).</w:t>
       </w:r>
     </w:p>
     <w:p>
       <w:pPr>
         <w:numPr>
           <w:ilvl w:val="0"/>
-          <w:numId w:val="1059"/>
+          <w:numId w:val="1060"/>
         </w:numPr>
         <w:pStyle w:val="Compact"/>
         <w:bidi w:val="1"/>
@@ -69652,14 +70948,40 @@
         <w:rPr>
           <w:rtl/>
         </w:rPr>
-        <w:t xml:space="preserve">☐ نماذج الخطر (M0 وM1 وM2 وCART) مدرَّبة على 2013 بعد حذف المتداخلين ومحفوظة، وعتبة Youden وk مثبتان.</w:t>
+        <w:t xml:space="preserve">☐</w:t>
+      </w:r>
+      <w:r>
+        <w:rPr>
+          <w:rtl/>
+        </w:rPr>
+        <w:t xml:space="preserve"> </w:t>
+      </w:r>
+      <w:r>
+        <w:rPr>
+          <w:rtl/>
+          <w:bCs/>
+          <w:b/>
+        </w:rPr>
+        <w:t xml:space="preserve">جدول MDE80 لكل فرضية مكتوب</w:t>
+      </w:r>
+      <w:r>
+        <w:rPr>
+          <w:rtl/>
+        </w:rPr>
+        <w:t xml:space="preserve"> </w:t>
+      </w:r>
+      <w:r>
+        <w:rPr>
+          <w:rtl/>
+        </w:rPr>
+        <w:t xml:space="preserve">(الجدول 2-ب) من زوجها الفعلي على نوافذ اختبار 2013، وحالة بند MDE80 &gt; 2δ محسومة لكل فرضية (D-25، D-46، D-48).</w:t>
       </w:r>
     </w:p>
     <w:p>
       <w:pPr>
         <w:numPr>
           <w:ilvl w:val="0"/>
-          <w:numId w:val="1059"/>
+          <w:numId w:val="1060"/>
         </w:numPr>
         <w:pStyle w:val="Compact"/>
         <w:bidi w:val="1"/>
@@ -69668,14 +70990,40 @@
         <w:rPr>
           <w:rtl/>
         </w:rPr>
-        <w:t xml:space="preserve">☐ عائلة Holm (m = 4)، وp ثنائية، وbootstrap-t على العروض: محسومة (D-23، D-24، D-25، D-31).</w:t>
+        <w:t xml:space="preserve">☐</w:t>
+      </w:r>
+      <w:r>
+        <w:rPr>
+          <w:rtl/>
+        </w:rPr>
+        <w:t xml:space="preserve"> </w:t>
+      </w:r>
+      <w:r>
+        <w:rPr>
+          <w:rtl/>
+          <w:bCs/>
+          <w:b/>
+        </w:rPr>
+        <w:t xml:space="preserve">سجل الوصول واختبار الاستثناء D-47</w:t>
+      </w:r>
+      <w:r>
+        <w:rPr>
+          <w:rtl/>
+        </w:rPr>
+        <w:t xml:space="preserve"> </w:t>
+      </w:r>
+      <w:r>
+        <w:rPr>
+          <w:rtl/>
+        </w:rPr>
+        <w:t xml:space="preserve">موثقان ومراجَعان من الزميل، ولا قراءة أخرى لـ2014.</w:t>
       </w:r>
     </w:p>
     <w:p>
       <w:pPr>
         <w:numPr>
           <w:ilvl w:val="0"/>
-          <w:numId w:val="1059"/>
+          <w:numId w:val="1060"/>
         </w:numPr>
         <w:pStyle w:val="Compact"/>
         <w:bidi w:val="1"/>
@@ -69684,14 +71032,86 @@
         <w:rPr>
           <w:rtl/>
         </w:rPr>
-        <w:t xml:space="preserve">☐ كل اختبارات الوحدة والتسرب تمر؛ وhash البيانات وMD5 مسجلان؛ وسجل الزمن والميزانية ضمن الهدف.</w:t>
+        <w:t xml:space="preserve">☐</w:t>
+      </w:r>
+      <w:r>
+        <w:rPr>
+          <w:rtl/>
+        </w:rPr>
+        <w:t xml:space="preserve"> </w:t>
+      </w:r>
+      <m:oMath>
+        <m:sSubSup>
+          <m:e>
+            <m:r>
+              <m:t>B</m:t>
+            </m:r>
+          </m:e>
+          <m:sub>
+            <m:r>
+              <m:t>n</m:t>
+            </m:r>
+            <m:r>
+              <m:t>p</m:t>
+            </m:r>
+          </m:sub>
+          <m:sup>
+            <m:r>
+              <m:rPr>
+                <m:sty m:val="p"/>
+              </m:rPr>
+              <m:t>*</m:t>
+            </m:r>
+          </m:sup>
+        </m:sSubSup>
+      </m:oMath>
+      <w:r>
+        <w:rPr>
+          <w:rtl/>
+        </w:rPr>
+        <w:t xml:space="preserve"> </w:t>
+      </w:r>
+      <w:r>
+        <w:rPr>
+          <w:rtl/>
+        </w:rPr>
+        <w:t xml:space="preserve">و</w:t>
+      </w:r>
+      <m:oMath>
+        <m:sSup>
+          <m:e>
+            <m:r>
+              <m:t>S</m:t>
+            </m:r>
+          </m:e>
+          <m:sup>
+            <m:r>
+              <m:rPr>
+                <m:sty m:val="p"/>
+              </m:rPr>
+              <m:t>*</m:t>
+            </m:r>
+          </m:sup>
+        </m:sSup>
+      </m:oMath>
+      <w:r>
+        <w:rPr>
+          <w:rtl/>
+        </w:rPr>
+        <w:t xml:space="preserve"> </w:t>
+      </w:r>
+      <w:r>
+        <w:rPr>
+          <w:rtl/>
+        </w:rPr>
+        <w:t xml:space="preserve">محددان نوعاً على نوافذ اختبار 2013 ومثبتان.</w:t>
       </w:r>
     </w:p>
     <w:p>
       <w:pPr>
         <w:numPr>
           <w:ilvl w:val="0"/>
-          <w:numId w:val="1059"/>
+          <w:numId w:val="1060"/>
         </w:numPr>
         <w:pStyle w:val="Compact"/>
         <w:bidi w:val="1"/>
@@ -69700,14 +71120,130 @@
         <w:rPr>
           <w:rtl/>
         </w:rPr>
-        <w:t xml:space="preserve">☐ أمر تشغيل واحد يعيد إنتاج نتائج التطوير من الصفر.</w:t>
+        <w:t xml:space="preserve">☐ تركيبة الهجين (≤ 4 مكوّنات)، وأوزانها الابتدائية، وفضاءات كل المعاملات (بما فيها τ وβ وα وشبكة السمبلكس) مثبتة في ملفات إعداد.</w:t>
       </w:r>
     </w:p>
     <w:p>
       <w:pPr>
         <w:numPr>
           <w:ilvl w:val="0"/>
-          <w:numId w:val="1059"/>
+          <w:numId w:val="1060"/>
+        </w:numPr>
+        <w:pStyle w:val="Compact"/>
+        <w:bidi w:val="1"/>
+      </w:pPr>
+      <w:r>
+        <w:rPr>
+          <w:rtl/>
+        </w:rPr>
+        <w:t xml:space="preserve">☐</w:t>
+      </w:r>
+      <w:r>
+        <w:rPr>
+          <w:rtl/>
+        </w:rPr>
+        <w:t xml:space="preserve"> </w:t>
+      </w:r>
+      <w:r>
+        <w:rPr>
+          <w:rtl/>
+          <w:bCs/>
+          <w:b/>
+        </w:rPr>
+        <w:t xml:space="preserve">حالة الأرضية في HYB* موثقة</w:t>
+      </w:r>
+      <w:r>
+        <w:rPr>
+          <w:rtl/>
+        </w:rPr>
+        <w:t xml:space="preserve">: هل دخل المكوّن الشخصي بالقبول أم بالأرضية (D-30).</w:t>
+      </w:r>
+    </w:p>
+    <w:p>
+      <w:pPr>
+        <w:numPr>
+          <w:ilvl w:val="0"/>
+          <w:numId w:val="1060"/>
+        </w:numPr>
+        <w:pStyle w:val="Compact"/>
+        <w:bidi w:val="1"/>
+      </w:pPr>
+      <w:r>
+        <w:rPr>
+          <w:rtl/>
+        </w:rPr>
+        <w:t xml:space="preserve">☐ حالة GRU-lite موثقة: اجتاز البوابات، أو «محاولة موثقة» مع H3 «غير قابلة للاختبار» وp = 1.</w:t>
+      </w:r>
+    </w:p>
+    <w:p>
+      <w:pPr>
+        <w:numPr>
+          <w:ilvl w:val="0"/>
+          <w:numId w:val="1060"/>
+        </w:numPr>
+        <w:pStyle w:val="Compact"/>
+        <w:bidi w:val="1"/>
+      </w:pPr>
+      <w:r>
+        <w:rPr>
+          <w:rtl/>
+        </w:rPr>
+        <w:t xml:space="preserve">☐ نماذج الخطر (M0 وM1 وM2 وCART) مدرَّبة على 2013 بعد حذف المتداخلين ومحفوظة، وعتبة Youden وk مثبتان.</w:t>
+      </w:r>
+    </w:p>
+    <w:p>
+      <w:pPr>
+        <w:numPr>
+          <w:ilvl w:val="0"/>
+          <w:numId w:val="1060"/>
+        </w:numPr>
+        <w:pStyle w:val="Compact"/>
+        <w:bidi w:val="1"/>
+      </w:pPr>
+      <w:r>
+        <w:rPr>
+          <w:rtl/>
+        </w:rPr>
+        <w:t xml:space="preserve">☐ عائلة Holm (m = 4)، وp ثنائية، وbootstrap-t على العروض: محسومة (D-23، D-24، D-25، D-31).</w:t>
+      </w:r>
+    </w:p>
+    <w:p>
+      <w:pPr>
+        <w:numPr>
+          <w:ilvl w:val="0"/>
+          <w:numId w:val="1060"/>
+        </w:numPr>
+        <w:pStyle w:val="Compact"/>
+        <w:bidi w:val="1"/>
+      </w:pPr>
+      <w:r>
+        <w:rPr>
+          <w:rtl/>
+        </w:rPr>
+        <w:t xml:space="preserve">☐ كل اختبارات الوحدة والتسرب تمر؛ وhash البيانات وMD5 مسجلان؛ وسجل الزمن والميزانية ضمن الهدف.</w:t>
+      </w:r>
+    </w:p>
+    <w:p>
+      <w:pPr>
+        <w:numPr>
+          <w:ilvl w:val="0"/>
+          <w:numId w:val="1060"/>
+        </w:numPr>
+        <w:pStyle w:val="Compact"/>
+        <w:bidi w:val="1"/>
+      </w:pPr>
+      <w:r>
+        <w:rPr>
+          <w:rtl/>
+        </w:rPr>
+        <w:t xml:space="preserve">☐ أمر تشغيل واحد يعيد إنتاج نتائج التطوير من الصفر.</w:t>
+      </w:r>
+    </w:p>
+    <w:p>
+      <w:pPr>
+        <w:numPr>
+          <w:ilvl w:val="0"/>
+          <w:numId w:val="1060"/>
         </w:numPr>
         <w:pStyle w:val="Compact"/>
         <w:bidi w:val="1"/>
@@ -70892,7 +72428,7 @@
         <w:rPr>
           <w:rtl/>
         </w:rPr>
-        <w:t xml:space="preserve">(1) CBF ضعيف بنيوياً على OULAD لغياب النصوص؛ (2) GRU-lite ضحل بطبقة واحدة، و«الشبكات العميقة» معدَّلة بقرار (D-18)؛ (3) لا تقييم بشري للواجهة ولا للتفسير (D-22)؛ (4) الأدوات بديلة عن TensorFlow وscikit-learn بقيد بيئي موثق (ADR-003)؛ (5) قيمة MD5 المرجعية لـOULAD من طرف ثالث (D-08)؛ (6) التفسير لمكوّن GRU عام وغير شفاف؛ (7) GRU-lite بلا ميزات زمنية، والسياق الزمني وظيفة المكوّن (1) (D-35)؛ (8) RQ4-ب يُجاب وصفياً، وδ_AUC اتفاقي معلن.</w:t>
+        <w:t xml:space="preserve">(1) CBF ضعيف بنيوياً على OULAD لغياب النصوص؛ (2) GRU-lite ضحل بطبقة واحدة، و«الشبكات العميقة» معدَّلة بقرار (D-18)؛ (3) لا تقييم بشري للواجهة ولا للتفسير (D-22)؛ (4) الأدوات بديلة عن TensorFlow وscikit-learn بقيد بيئي موثق (ADR-003)؛ (5) قيمة MD5 المرجعية لـOULAD من طرف ثالث (D-08)؛ (6) التفسير لمكوّن GRU عام وغير شفاف؛ (7) GRU-lite بلا ميزات زمنية، والسياق الزمني وظيفة المكوّن (1) (D-35)؛ (8) RQ4-ب يُجاب وصفياً، وδ_AUC اتفاقي معلن؛ (9) واجهة إعادة التشغيل توضيحية: تستعمل معاملات أقرب قطع ≤ t، ولا يُستخرج منها رقم تقييم (D-49)؛ (10) MDE80 التوضيحي على التطوير ≈ 0.053 &gt; 2δ، فـ«غير حاسمة» متوقعة لبعض الفرضيات، وتُوصف بنص D-48.</w:t>
       </w:r>
     </w:p>
     <w:bookmarkEnd w:id="104"/>
@@ -71578,9 +73114,592 @@
       <w:r>
         <w:rPr>
           <w:rtl/>
+        </w:rPr>
+        <w:t xml:space="preserve">وصدرت بعد الاجتماع 02 قرارات تنفيذية لتثبيت منصة التجارب (ADR-004 §4-مكرر)، وطُبّقت كذلك:</w:t>
+      </w:r>
+    </w:p>
+    <w:p>
+      <w:pPr>
+        <w:bidi w:val="1"/>
+      </w:pPr>
+      <w:r>
+        <w:rPr>
+          <w:rtl/>
           <w:bCs/>
           <w:b/>
         </w:rPr>
+        <w:t xml:space="preserve">جدول 28 (تابع): القرارات التنفيذية D-41…D-49 ومواضعها في الوثيقة</w:t>
+      </w:r>
+    </w:p>
+    <w:tbl>
+      <w:tblPr>
+        <w:tblStyle w:val="Table"/>
+        <w:tblW w:type="pct" w:w="5000"/>
+        <w:tblLook w:firstRow="1" w:lastRow="0" w:firstColumn="0" w:lastColumn="0" w:noHBand="0" w:noVBand="0" w:val="0020"/>
+        <w:jc w:val="center"/>
+        <w:bidiVisual w:val="1"/>
+        <w:tblBorders>
+          <w:top w:val="single" w:sz="4" w:space="0" w:color="808080"/>
+          <w:left w:val="single" w:sz="4" w:space="0" w:color="808080"/>
+          <w:bottom w:val="single" w:sz="4" w:space="0" w:color="808080"/>
+          <w:right w:val="single" w:sz="4" w:space="0" w:color="808080"/>
+          <w:insideH w:val="single" w:sz="4" w:space="0" w:color="808080"/>
+          <w:insideV w:val="single" w:sz="4" w:space="0" w:color="808080"/>
+        </w:tblBorders>
+      </w:tblPr>
+      <w:tblGrid>
+        <w:gridCol w:w="2640"/>
+        <w:gridCol w:w="2640"/>
+        <w:gridCol w:w="2640"/>
+      </w:tblGrid>
+      <w:tr>
+        <w:trPr>
+          <w:tblHeader w:val="true"/>
+        </w:trPr>
+        <w:tc>
+          <w:tcPr>
+            <w:shd w:val="clear" w:color="auto" w:fill="D9E2F3"/>
+          </w:tcPr>
+          <w:p>
+            <w:pPr>
+              <w:pStyle w:val="Compact"/>
+              <w:bidi w:val="1"/>
+              <w:jc w:val="left"/>
+            </w:pPr>
+            <w:r>
+              <w:rPr>
+                <w:b/>
+                <w:rtl/>
+              </w:rPr>
+              <w:t xml:space="preserve">القرار</w:t>
+            </w:r>
+          </w:p>
+        </w:tc>
+        <w:tc>
+          <w:tcPr>
+            <w:shd w:val="clear" w:color="auto" w:fill="D9E2F3"/>
+          </w:tcPr>
+          <w:p>
+            <w:pPr>
+              <w:pStyle w:val="Compact"/>
+              <w:bidi w:val="1"/>
+              <w:jc w:val="left"/>
+            </w:pPr>
+            <w:r>
+              <w:rPr>
+                <w:b/>
+                <w:rtl/>
+              </w:rPr>
+              <w:t xml:space="preserve">المضمون</w:t>
+            </w:r>
+          </w:p>
+        </w:tc>
+        <w:tc>
+          <w:tcPr>
+            <w:shd w:val="clear" w:color="auto" w:fill="D9E2F3"/>
+          </w:tcPr>
+          <w:p>
+            <w:pPr>
+              <w:pStyle w:val="Compact"/>
+              <w:bidi w:val="1"/>
+              <w:jc w:val="left"/>
+            </w:pPr>
+            <w:r>
+              <w:rPr>
+                <w:b/>
+                <w:rtl/>
+              </w:rPr>
+              <w:t xml:space="preserve">الموضع</w:t>
+            </w:r>
+          </w:p>
+        </w:tc>
+      </w:tr>
+      <w:tr>
+        <w:tc>
+          <w:tcPr/>
+          <w:p>
+            <w:pPr>
+              <w:pStyle w:val="Compact"/>
+              <w:bidi w:val="1"/>
+              <w:jc w:val="left"/>
+            </w:pPr>
+            <w:r>
+              <w:rPr>
+                <w:rtl/>
+              </w:rPr>
+              <w:t xml:space="preserve">D-41</w:t>
+            </w:r>
+          </w:p>
+        </w:tc>
+        <w:tc>
+          <w:tcPr/>
+          <w:p>
+            <w:pPr>
+              <w:pStyle w:val="Compact"/>
+              <w:bidi w:val="1"/>
+              <w:jc w:val="left"/>
+            </w:pPr>
+            <w:r>
+              <w:rPr>
+                <w:rtl/>
+              </w:rPr>
+              <w:t xml:space="preserve">المقيَّم = تفاعل مع مورد من الكتالوج في التدريب + هدف؛ صاحب التنقل وحده يُعدّ ولا يُقيَّم</w:t>
+            </w:r>
+          </w:p>
+        </w:tc>
+        <w:tc>
+          <w:tcPr/>
+          <w:p>
+            <w:pPr>
+              <w:pStyle w:val="Compact"/>
+              <w:bidi w:val="1"/>
+              <w:jc w:val="left"/>
+            </w:pPr>
+            <w:r>
+              <w:rPr>
+                <w:rtl/>
+              </w:rPr>
+              <w:t xml:space="preserve">§3.8 الخطوة 8، §5.2</w:t>
+            </w:r>
+          </w:p>
+        </w:tc>
+      </w:tr>
+      <w:tr>
+        <w:tc>
+          <w:tcPr/>
+          <w:p>
+            <w:pPr>
+              <w:pStyle w:val="Compact"/>
+              <w:bidi w:val="1"/>
+              <w:jc w:val="left"/>
+            </w:pPr>
+            <w:r>
+              <w:rPr>
+                <w:rtl/>
+              </w:rPr>
+              <w:t xml:space="preserve">D-42</w:t>
+            </w:r>
+          </w:p>
+        </w:tc>
+        <w:tc>
+          <w:tcPr/>
+          <w:p>
+            <w:pPr>
+              <w:pStyle w:val="Compact"/>
+              <w:bidi w:val="1"/>
+              <w:jc w:val="left"/>
+            </w:pPr>
+            <w:r>
+              <w:rPr>
+                <w:rtl/>
+              </w:rPr>
+              <w:t xml:space="preserve">اختيار الإعداد لكل (عرض، أصل، مهمة)؛ الفرضيات والهجين على المهمة A وحدها</w:t>
+            </w:r>
+          </w:p>
+        </w:tc>
+        <w:tc>
+          <w:tcPr/>
+          <w:p>
+            <w:pPr>
+              <w:pStyle w:val="Compact"/>
+              <w:bidi w:val="1"/>
+              <w:jc w:val="left"/>
+            </w:pPr>
+            <w:r>
+              <w:rPr>
+                <w:rtl/>
+              </w:rPr>
+              <w:t xml:space="preserve">§4.4.2</w:t>
+            </w:r>
+          </w:p>
+        </w:tc>
+      </w:tr>
+      <w:tr>
+        <w:tc>
+          <w:tcPr/>
+          <w:p>
+            <w:pPr>
+              <w:pStyle w:val="Compact"/>
+              <w:bidi w:val="1"/>
+              <w:jc w:val="left"/>
+            </w:pPr>
+            <w:r>
+              <w:rPr>
+                <w:rtl/>
+              </w:rPr>
+              <w:t xml:space="preserve">D-43</w:t>
+            </w:r>
+          </w:p>
+        </w:tc>
+        <w:tc>
+          <w:tcPr/>
+          <w:p>
+            <w:pPr>
+              <w:pStyle w:val="Compact"/>
+              <w:bidi w:val="1"/>
+              <w:jc w:val="left"/>
+            </w:pPr>
+            <w:r>
+              <w:rPr>
+                <w:rtl/>
+              </w:rPr>
+              <w:t xml:space="preserve">تشابه Item-kNN على الأعمدة الثنائية، والإشارة في التجميع فقط</w:t>
+            </w:r>
+          </w:p>
+        </w:tc>
+        <w:tc>
+          <w:tcPr/>
+          <w:p>
+            <w:pPr>
+              <w:pStyle w:val="Compact"/>
+              <w:bidi w:val="1"/>
+              <w:jc w:val="left"/>
+            </w:pPr>
+            <w:r>
+              <w:rPr>
+                <w:rtl/>
+              </w:rPr>
+              <w:t xml:space="preserve">§4.2.4</w:t>
+            </w:r>
+          </w:p>
+        </w:tc>
+      </w:tr>
+      <w:tr>
+        <w:tc>
+          <w:tcPr/>
+          <w:p>
+            <w:pPr>
+              <w:pStyle w:val="Compact"/>
+              <w:bidi w:val="1"/>
+              <w:jc w:val="left"/>
+            </w:pPr>
+            <w:r>
+              <w:rPr>
+                <w:rtl/>
+              </w:rPr>
+              <w:t xml:space="preserve">D-44</w:t>
+            </w:r>
+          </w:p>
+        </w:tc>
+        <w:tc>
+          <w:tcPr/>
+          <w:p>
+            <w:pPr>
+              <w:pStyle w:val="Compact"/>
+              <w:bidi w:val="1"/>
+              <w:jc w:val="left"/>
+            </w:pPr>
+            <w:r>
+              <w:rPr>
+                <w:rtl/>
+              </w:rPr>
+              <w:t xml:space="preserve">ملف القرب في CBF مطبَّع لكل مورد إلى مجموع 1</w:t>
+            </w:r>
+          </w:p>
+        </w:tc>
+        <w:tc>
+          <w:tcPr/>
+          <w:p>
+            <w:pPr>
+              <w:pStyle w:val="Compact"/>
+              <w:bidi w:val="1"/>
+              <w:jc w:val="left"/>
+            </w:pPr>
+            <w:r>
+              <w:rPr>
+                <w:rtl/>
+              </w:rPr>
+              <w:t xml:space="preserve">§4.2.9</w:t>
+            </w:r>
+          </w:p>
+        </w:tc>
+      </w:tr>
+      <w:tr>
+        <w:tc>
+          <w:tcPr/>
+          <w:p>
+            <w:pPr>
+              <w:pStyle w:val="Compact"/>
+              <w:bidi w:val="1"/>
+              <w:jc w:val="left"/>
+            </w:pPr>
+            <w:r>
+              <w:rPr>
+                <w:rtl/>
+              </w:rPr>
+              <w:t xml:space="preserve">D-45</w:t>
+            </w:r>
+          </w:p>
+        </w:tc>
+        <w:tc>
+          <w:tcPr/>
+          <w:p>
+            <w:pPr>
+              <w:pStyle w:val="Compact"/>
+              <w:bidi w:val="1"/>
+              <w:jc w:val="left"/>
+            </w:pPr>
+            <w:r>
+              <w:rPr>
+                <w:rtl/>
+              </w:rPr>
+              <w:t xml:space="preserve">شريحة «قليلي التاريخ» n ≤ Q1، والحصة الفعلية (≈ 26.3%) تُبلَّغ</w:t>
+            </w:r>
+          </w:p>
+        </w:tc>
+        <w:tc>
+          <w:tcPr/>
+          <w:p>
+            <w:pPr>
+              <w:pStyle w:val="Compact"/>
+              <w:bidi w:val="1"/>
+              <w:jc w:val="left"/>
+            </w:pPr>
+            <w:r>
+              <w:rPr>
+                <w:rtl/>
+              </w:rPr>
+              <w:t xml:space="preserve">§2.6، §5.2</w:t>
+            </w:r>
+          </w:p>
+        </w:tc>
+      </w:tr>
+      <w:tr>
+        <w:tc>
+          <w:tcPr/>
+          <w:p>
+            <w:pPr>
+              <w:pStyle w:val="Compact"/>
+              <w:bidi w:val="1"/>
+              <w:jc w:val="left"/>
+            </w:pPr>
+            <w:r>
+              <w:rPr>
+                <w:rtl/>
+              </w:rPr>
+              <w:t xml:space="preserve">D-46</w:t>
+            </w:r>
+          </w:p>
+        </w:tc>
+        <w:tc>
+          <w:tcPr/>
+          <w:p>
+            <w:pPr>
+              <w:pStyle w:val="Compact"/>
+              <w:bidi w:val="1"/>
+              <w:jc w:val="left"/>
+            </w:pPr>
+            <w:r>
+              <w:rPr>
+                <w:rtl/>
+              </w:rPr>
+              <w:t xml:space="preserve">σ وMDE80 لكل فرضية من زوجها الفعلي على نوافذ اختبار 2013؛ جدول MDE80 قبل التجميد؛ B5−B3 توضيحي</w:t>
+            </w:r>
+          </w:p>
+        </w:tc>
+        <w:tc>
+          <w:tcPr/>
+          <w:p>
+            <w:pPr>
+              <w:pStyle w:val="Compact"/>
+              <w:bidi w:val="1"/>
+              <w:jc w:val="left"/>
+            </w:pPr>
+            <w:r>
+              <w:rPr>
+                <w:rtl/>
+              </w:rPr>
+              <w:t xml:space="preserve">§2.2 (الجدول 2-ب)، الجدول 26، §7.2، §7.3</w:t>
+            </w:r>
+          </w:p>
+        </w:tc>
+      </w:tr>
+      <w:tr>
+        <w:tc>
+          <w:tcPr/>
+          <w:p>
+            <w:pPr>
+              <w:pStyle w:val="Compact"/>
+              <w:bidi w:val="1"/>
+              <w:jc w:val="left"/>
+            </w:pPr>
+            <w:r>
+              <w:rPr>
+                <w:rtl/>
+              </w:rPr>
+              <w:t xml:space="preserve">D-47</w:t>
+            </w:r>
+          </w:p>
+        </w:tc>
+        <w:tc>
+          <w:tcPr/>
+          <w:p>
+            <w:pPr>
+              <w:pStyle w:val="Compact"/>
+              <w:bidi w:val="1"/>
+              <w:jc w:val="left"/>
+            </w:pPr>
+            <w:r>
+              <w:rPr>
+                <w:rtl/>
+              </w:rPr>
+              <w:t xml:space="preserve">استثناء القراءة المحدودة (ثلاثة أعمدة من</w:t>
+            </w:r>
+            <w:r>
+              <w:rPr>
+                <w:rtl/>
+              </w:rPr>
+              <w:t xml:space="preserve"> </w:t>
+            </w:r>
+            <w:r>
+              <w:rPr>
+                <w:rStyle w:val="VerbatimChar"/>
+                <w:rtl/>
+              </w:rPr>
+              <w:t xml:space="preserve">studentRegistration</w:t>
+            </w:r>
+            <w:r>
+              <w:rPr>
+                <w:rtl/>
+              </w:rPr>
+              <w:t xml:space="preserve"> </w:t>
+            </w:r>
+            <w:r>
+              <w:rPr>
+                <w:rtl/>
+              </w:rPr>
+              <w:t xml:space="preserve">لـ2014) لترشيح تدريب H4-أ</w:t>
+            </w:r>
+          </w:p>
+        </w:tc>
+        <w:tc>
+          <w:tcPr/>
+          <w:p>
+            <w:pPr>
+              <w:pStyle w:val="Compact"/>
+              <w:bidi w:val="1"/>
+              <w:jc w:val="left"/>
+            </w:pPr>
+            <w:r>
+              <w:rPr>
+                <w:rtl/>
+              </w:rPr>
+              <w:t xml:space="preserve">§2.6، §5.9، §7.2، §7.3</w:t>
+            </w:r>
+          </w:p>
+        </w:tc>
+      </w:tr>
+      <w:tr>
+        <w:tc>
+          <w:tcPr/>
+          <w:p>
+            <w:pPr>
+              <w:pStyle w:val="Compact"/>
+              <w:bidi w:val="1"/>
+              <w:jc w:val="left"/>
+            </w:pPr>
+            <w:r>
+              <w:rPr>
+                <w:rtl/>
+              </w:rPr>
+              <w:t xml:space="preserve">D-48</w:t>
+            </w:r>
+          </w:p>
+        </w:tc>
+        <w:tc>
+          <w:tcPr/>
+          <w:p>
+            <w:pPr>
+              <w:pStyle w:val="Compact"/>
+              <w:bidi w:val="1"/>
+              <w:jc w:val="left"/>
+            </w:pPr>
+            <w:r>
+              <w:rPr>
+                <w:rtl/>
+              </w:rPr>
+              <w:t xml:space="preserve">δ يبقى؛ وصف مسجل يُلحق بـ«غير حاسمة»؛ بند MDE80 &gt; 2δ مفعَّل مؤقتاً</w:t>
+            </w:r>
+          </w:p>
+        </w:tc>
+        <w:tc>
+          <w:tcPr/>
+          <w:p>
+            <w:pPr>
+              <w:pStyle w:val="Compact"/>
+              <w:bidi w:val="1"/>
+              <w:jc w:val="left"/>
+            </w:pPr>
+            <w:r>
+              <w:rPr>
+                <w:rtl/>
+              </w:rPr>
+              <w:t xml:space="preserve">§2.2 (الجداول 2 و2-ب و3)، §5.7.1، §8</w:t>
+            </w:r>
+          </w:p>
+        </w:tc>
+      </w:tr>
+      <w:tr>
+        <w:tc>
+          <w:tcPr/>
+          <w:p>
+            <w:pPr>
+              <w:pStyle w:val="Compact"/>
+              <w:bidi w:val="1"/>
+              <w:jc w:val="left"/>
+            </w:pPr>
+            <w:r>
+              <w:rPr>
+                <w:rtl/>
+              </w:rPr>
+              <w:t xml:space="preserve">D-49</w:t>
+            </w:r>
+          </w:p>
+        </w:tc>
+        <w:tc>
+          <w:tcPr/>
+          <w:p>
+            <w:pPr>
+              <w:pStyle w:val="Compact"/>
+              <w:bidi w:val="1"/>
+              <w:jc w:val="left"/>
+            </w:pPr>
+            <w:r>
+              <w:rPr>
+                <w:rtl/>
+              </w:rPr>
+              <w:t xml:space="preserve">قواعد إعادة التشغيل في الواجهة</w:t>
+            </w:r>
+          </w:p>
+        </w:tc>
+        <w:tc>
+          <w:tcPr/>
+          <w:p>
+            <w:pPr>
+              <w:pStyle w:val="Compact"/>
+              <w:bidi w:val="1"/>
+              <w:jc w:val="left"/>
+            </w:pPr>
+            <w:r>
+              <w:rPr>
+                <w:rtl/>
+              </w:rPr>
+              <w:t xml:space="preserve">§4.8، §8</w:t>
+            </w:r>
+          </w:p>
+        </w:tc>
+      </w:tr>
+    </w:tbl>
+    <w:p>
+      <w:pPr>
+        <w:bidi w:val="1"/>
+      </w:pPr>
+      <w:r>
+        <w:rPr>
+          <w:rtl/>
+          <w:bCs/>
+          <w:b/>
+        </w:rPr>
         <w:t xml:space="preserve">ما بقي مفتوحاً:</w:t>
       </w:r>
       <w:r>
@@ -71593,7 +73712,33 @@
         <w:rPr>
           <w:rtl/>
         </w:rPr>
-        <w:t xml:space="preserve">لا نقطة معلّقة تحتاج قراراً جديداً. وتبقى متابعات مجدولة سلفاً لا تغيّر أي عتبة أو قاعدة: كتابة MDE80 في §2.2 (11-13)، وتوثيق حالة الأرضية بعد E7أ (11-25)، وحالة GRU-lite بعد E5 (12-03)، وتحقق T5 من المراجع [39]–[57] قبل الاستشهاد بها في الرسالة (T17، 11-10).</w:t>
+        <w:t xml:space="preserve">نقطة واحدة تحتاج تأكيداً صريحاً من المشرف: أن D-46 (σ لـH1 من زوجها الفعلي بعد E7ب)</w:t>
+      </w:r>
+      <w:r>
+        <w:rPr>
+          <w:rtl/>
+        </w:rPr>
+        <w:t xml:space="preserve"> </w:t>
+      </w:r>
+      <w:r>
+        <w:rPr>
+          <w:rtl/>
+          <w:bCs/>
+          <w:b/>
+        </w:rPr>
+        <w:t xml:space="preserve">يجُبّ موعد 11-13</w:t>
+      </w:r>
+      <w:r>
+        <w:rPr>
+          <w:rtl/>
+        </w:rPr>
+        <w:t xml:space="preserve"> </w:t>
+      </w:r>
+      <w:r>
+        <w:rPr>
+          <w:rtl/>
+        </w:rPr>
+        <w:t xml:space="preserve">الوارد في D-25 بالنسبة إلى H1، فيبقى 11-13 لـH2-أ وحدها (وقد كُتبت الوثيقة على هذا الفهم). وما عدا ذلك متابعات مجدولة سلفاً لا تغيّر أي عتبة أو قاعدة: جدول MDE80 الكامل قبل التجميد (12-09 → 12-11)، وتوثيق حالة الأرضية بعد E7أ (11-25)، وحالة GRU-lite بعد E5 (12-03)، وتحقق T5 من المراجع [39]–[57] قبل الاستشهاد بها في الرسالة (T17، 11-10).</w:t>
       </w:r>
     </w:p>
     <w:bookmarkEnd w:id="105"/>
@@ -74199,12 +76344,6 @@
     <w:abstractNumId w:val="991"/>
   </w:num>
   <w:num w:numId="1052">
-    <w:abstractNumId w:val="991"/>
-  </w:num>
-  <w:num w:numId="1053">
-    <w:abstractNumId w:val="991"/>
-  </w:num>
-  <w:num w:numId="1054">
     <w:abstractNumId w:val="99411"/>
     <w:lvlOverride w:ilvl="0">
       <w:startOverride w:val="1"/>
@@ -74234,16 +76373,13 @@
       <w:startOverride w:val="1"/>
     </w:lvlOverride>
   </w:num>
-  <w:num w:numId="1055">
+  <w:num w:numId="1053">
     <w:abstractNumId w:val="991"/>
   </w:num>
-  <w:num w:numId="1056">
+  <w:num w:numId="1054">
     <w:abstractNumId w:val="991"/>
   </w:num>
-  <w:num w:numId="1057">
-    <w:abstractNumId w:val="991"/>
-  </w:num>
-  <w:num w:numId="1058">
+  <w:num w:numId="1055">
     <w:abstractNumId w:val="99411"/>
     <w:lvlOverride w:ilvl="0">
       <w:startOverride w:val="1"/>
@@ -74273,7 +76409,46 @@
       <w:startOverride w:val="1"/>
     </w:lvlOverride>
   </w:num>
+  <w:num w:numId="1056">
+    <w:abstractNumId w:val="991"/>
+  </w:num>
+  <w:num w:numId="1057">
+    <w:abstractNumId w:val="991"/>
+  </w:num>
+  <w:num w:numId="1058">
+    <w:abstractNumId w:val="991"/>
+  </w:num>
   <w:num w:numId="1059">
+    <w:abstractNumId w:val="99411"/>
+    <w:lvlOverride w:ilvl="0">
+      <w:startOverride w:val="1"/>
+    </w:lvlOverride>
+    <w:lvlOverride w:ilvl="1">
+      <w:startOverride w:val="1"/>
+    </w:lvlOverride>
+    <w:lvlOverride w:ilvl="2">
+      <w:startOverride w:val="1"/>
+    </w:lvlOverride>
+    <w:lvlOverride w:ilvl="3">
+      <w:startOverride w:val="1"/>
+    </w:lvlOverride>
+    <w:lvlOverride w:ilvl="4">
+      <w:startOverride w:val="1"/>
+    </w:lvlOverride>
+    <w:lvlOverride w:ilvl="5">
+      <w:startOverride w:val="1"/>
+    </w:lvlOverride>
+    <w:lvlOverride w:ilvl="6">
+      <w:startOverride w:val="1"/>
+    </w:lvlOverride>
+    <w:lvlOverride w:ilvl="7">
+      <w:startOverride w:val="1"/>
+    </w:lvlOverride>
+    <w:lvlOverride w:ilvl="8">
+      <w:startOverride w:val="1"/>
+    </w:lvlOverride>
+  </w:num>
+  <w:num w:numId="1060">
     <w:abstractNumId w:val="991"/>
   </w:num>
 </w:numbering>

</xml_diff>

<commit_message>
Phase 2 accepted by supervisor: hypotheses, algorithms and glossary (D-50 deadline update)
Co-Authored-By: Claude Fable 5.1 <noreply@anthropic.com>
Claude-Session: https://claude.ai/code/session_01Y5Ccgz17Pq2brpK5TTSYa7
</commit_message>
<xml_diff>
--- a/deliverables/02-hypotheses-algorithms/الفرضيات-والخوارزميات.docx
+++ b/deliverables/02-hypotheses-algorithms/الفرضيات-والخوارزميات.docx
@@ -4297,7 +4297,7 @@
               <w:rPr>
                 <w:rtl/>
               </w:rPr>
-              <w:t xml:space="preserve">بعد E3 (الموعد المسجل 11-13)</w:t>
+              <w:t xml:space="preserve">بعد E3 (الموعد المسجل 11-19 وفق D-50)</w:t>
             </w:r>
           </w:p>
         </w:tc>
@@ -67912,7 +67912,7 @@
               <w:rPr>
                 <w:rtl/>
               </w:rPr>
-              <w:t xml:space="preserve">11-13</w:t>
+              <w:t xml:space="preserve">11-19</w:t>
             </w:r>
           </w:p>
         </w:tc>
@@ -73712,33 +73712,7 @@
         <w:rPr>
           <w:rtl/>
         </w:rPr>
-        <w:t xml:space="preserve">نقطة واحدة تحتاج تأكيداً صريحاً من المشرف: أن D-46 (σ لـH1 من زوجها الفعلي بعد E7ب)</w:t>
-      </w:r>
-      <w:r>
-        <w:rPr>
-          <w:rtl/>
-        </w:rPr>
-        <w:t xml:space="preserve"> </w:t>
-      </w:r>
-      <w:r>
-        <w:rPr>
-          <w:rtl/>
-          <w:bCs/>
-          <w:b/>
-        </w:rPr>
-        <w:t xml:space="preserve">يجُبّ موعد 11-13</w:t>
-      </w:r>
-      <w:r>
-        <w:rPr>
-          <w:rtl/>
-        </w:rPr>
-        <w:t xml:space="preserve"> </w:t>
-      </w:r>
-      <w:r>
-        <w:rPr>
-          <w:rtl/>
-        </w:rPr>
-        <w:t xml:space="preserve">الوارد في D-25 بالنسبة إلى H1، فيبقى 11-13 لـH2-أ وحدها (وقد كُتبت الوثيقة على هذا الفهم). وما عدا ذلك متابعات مجدولة سلفاً لا تغيّر أي عتبة أو قاعدة: جدول MDE80 الكامل قبل التجميد (12-09 → 12-11)، وتوثيق حالة الأرضية بعد E7أ (11-25)، وحالة GRU-lite بعد E5 (12-03)، وتحقق T5 من المراجع [39]–[57] قبل الاستشهاد بها في الرسالة (T17، 11-10).</w:t>
+        <w:t xml:space="preserve">لا شيء؛ حُسمت النقطة بالقرار D-50: يجُبّ D-46 موعد 11-13 لكل الفرضيات لا لـH1 وحدها (المواعيد المعتمدة: H2-أ 11-19، H3 12-03، H4-أ 12-08، H1 12-09، مع تقدير مؤقت لـH1 بعد E7أ في 11-25 للإنذار المبكر فقط). وما عدا ذلك متابعات مجدولة سلفاً لا تغيّر أي عتبة أو قاعدة: جدول MDE80 الكامل قبل التجميد (12-09 → 12-11)، وتوثيق حالة الأرضية بعد E7أ (11-25)، وحالة GRU-lite بعد E5 (12-03)، وتحقق T5 من المراجع [39]–[57] قبل الاستشهاد بها في الرسالة (T17، 11-10).</w:t>
       </w:r>
     </w:p>
     <w:bookmarkEnd w:id="105"/>

</xml_diff>

<commit_message>
Word builder: keep relational symbols (≤ ≥ ⊂ ∈ …) unmirrored in RTL text; rebuild phase 1-2 documents
Co-Authored-By: Claude Fable 5.1 <noreply@anthropic.com>
Claude-Session: https://claude.ai/code/session_01Y5Ccgz17Pq2brpK5TTSYa7
</commit_message>
<xml_diff>
--- a/deliverables/02-hypotheses-algorithms/الفرضيات-والخوارزميات.docx
+++ b/deliverables/02-hypotheses-algorithms/الفرضيات-والخوارزميات.docx
@@ -1596,7 +1596,7 @@
         <w:rPr>
           <w:rtl/>
         </w:rPr>
-        <w:t xml:space="preserve">يوم القطع t ∈ {70, 126, 182}.</w:t>
+        <w:t xml:space="preserve">يوم القطع t ‎∈‎ {70, 126, 182}.</w:t>
       </w:r>
     </w:p>
     <w:bookmarkEnd w:id="24"/>
@@ -1800,7 +1800,7 @@
         <w:rPr>
           <w:rtl/>
         </w:rPr>
-        <w:t xml:space="preserve">، لأن شريحة «أقل من 5 موارد» شبه فارغة في OULAD عند أصولنا (من 0 إلى 35 متعلماً في عروض 2013 التسعة بحسب فحص الزميل الاستكشافي)، فتُعرَّف الشريحة تعريفاً نسبياً (القسم 2.6)، ويبقى العدد المطلق «&lt; 5» وصفاً.</w:t>
+        <w:t xml:space="preserve">، لأن شريحة «أقل من 5 موارد» شبه فارغة في OULAD عند أصولنا (من 0 إلى 35 متعلماً في عروض 2013 التسعة بحسب فحص الزميل الاستكشافي)، فتُعرَّف الشريحة تعريفاً نسبياً (القسم 2.6)، ويبقى العدد المطلق «‎&lt;‎ 5» وصفاً.</w:t>
       </w:r>
     </w:p>
     <w:bookmarkEnd w:id="27"/>
@@ -2848,7 +2848,7 @@
               <w:rPr>
                 <w:rtl/>
               </w:rPr>
-              <w:t xml:space="preserve">، والحد الأدنى للفاصل &gt; 0، وp بعد Holm &lt; 0.05</w:t>
+              <w:t xml:space="preserve">، والحد الأدنى للفاصل ‎&gt;‎ 0، وp بعد Holm ‎&lt;‎ 0.05</w:t>
             </w:r>
           </w:p>
         </w:tc>
@@ -2900,7 +2900,7 @@
               <w:rPr>
                 <w:rtl/>
               </w:rPr>
-              <w:t xml:space="preserve">الحد الأعلى للفاصل &lt; 0</w:t>
+              <w:t xml:space="preserve">الحد الأعلى للفاصل ‎&lt;‎ 0</w:t>
             </w:r>
           </w:p>
         </w:tc>
@@ -2952,7 +2952,7 @@
               <w:rPr>
                 <w:rtl/>
               </w:rPr>
-              <w:t xml:space="preserve">الحد الأعلى للفاصل &lt; δ</w:t>
+              <w:t xml:space="preserve">الحد الأعلى للفاصل ‎&lt;‎ δ</w:t>
             </w:r>
           </w:p>
         </w:tc>
@@ -3026,7 +3026,7 @@
           <w:bCs/>
           <w:b/>
         </w:rPr>
-        <w:t xml:space="preserve">مدحوضة عملياً (استُبعد أثر ≥ δ)</w:t>
+        <w:t xml:space="preserve">مدحوضة عملياً (استُبعد أثر ‎≥‎ δ)</w:t>
       </w:r>
       <w:r>
         <w:rPr>
@@ -3341,7 +3341,7 @@
         <w:rPr>
           <w:rtl/>
         </w:rPr>
-        <w:t xml:space="preserve">» إن كان الحد الأدنى للفاصل &gt; δ، دون تغيير الحكم.</w:t>
+        <w:t xml:space="preserve">» إن كان الحد الأدنى للفاصل ‎&gt;‎ δ، دون تغيير الحكم.</w:t>
       </w:r>
     </w:p>
     <w:p>
@@ -3984,7 +3984,7 @@
         <w:rPr>
           <w:rtl/>
         </w:rPr>
-        <w:t xml:space="preserve">، لا بسبب صغر العينة وحده: فالحكم يشترط أن يكون الأثر المقدَّر نفسه ≥ δ، والمتوسط المقدَّر يقع فوق قيمته الحقيقية في نصف الحالات. فالقوة المعتبرة هي عند 1.5δ و2δ: مثلاً 0.96 عند μ = 1.5δ إن كان σ = 0.02، و0.72–0.85 إن كان σ = 0.03.</w:t>
+        <w:t xml:space="preserve">، لا بسبب صغر العينة وحده: فالحكم يشترط أن يكون الأثر المقدَّر نفسه ‎≥‎ δ، والمتوسط المقدَّر يقع فوق قيمته الحقيقية في نصف الحالات. فالقوة المعتبرة هي عند 1.5δ و2δ: مثلاً 0.96 عند μ = 1.5δ إن كان σ = 0.02، و0.72–0.85 إن كان σ = 0.03.</w:t>
       </w:r>
     </w:p>
     <w:p>
@@ -4088,7 +4088,7 @@
         <w:rPr>
           <w:rtl/>
         </w:rPr>
-        <w:t xml:space="preserve">عبر العروض التسعة)، ويُحسب MDE80، أي أصغر μ يعطي احتمال تأكيد ≥ 0.8 بالمحاكاة نفسها، بالدالة</w:t>
+        <w:t xml:space="preserve">عبر العروض التسعة)، ويُحسب MDE80، أي أصغر μ يعطي احتمال تأكيد ‎≥‎ 0.8 بالمحاكاة نفسها، بالدالة</w:t>
       </w:r>
       <w:r>
         <w:rPr>
@@ -4636,7 +4636,7 @@
         <w:rPr>
           <w:rtl/>
         </w:rPr>
-        <w:t xml:space="preserve">من زوج بديل B5 − B3 على التطوير (SKNN 0.531 مقابل Recent-Pop 0.541، Δ = −0.010، [−0.057، +0.024]) بلغ MDE80 التوضيحي ≈ 0.053، أي أكثر من 2δ (ADR-004 §4-مكرر).</w:t>
+        <w:t xml:space="preserve">من زوج بديل B5 − B3 على التطوير (SKNN 0.531 مقابل Recent-Pop 0.541، Δ = −0.010، [−0.057، +0.024]) بلغ MDE80 التوضيحي ‎≈‎ 0.053، أي أكثر من 2δ (ADR-004 §4-مكرر).</w:t>
       </w:r>
     </w:p>
     <w:p>
@@ -4654,7 +4654,7 @@
           <w:bCs/>
           <w:b/>
         </w:rPr>
-        <w:t xml:space="preserve">بند MDE80 &gt; 2δ (D-25) مفعَّل مؤقتاً (D-48):</w:t>
+        <w:t xml:space="preserve">بند MDE80 ‎&gt;‎ 2δ (D-25) مفعَّل مؤقتاً (D-48):</w:t>
       </w:r>
       <w:r>
         <w:rPr>
@@ -5266,7 +5266,7 @@
         <w:rPr>
           <w:rtl/>
         </w:rPr>
-        <w:t xml:space="preserve">يُختار من بين خطوط الأساس غير الشخصية في D-10 حرفياً، أي B1 (Random) وB2 (Pop) وB3 (Recent-Pop بنافذة w ∈ {3، 7، 14، 21، 28}؛ D-29)، بأعلى متوسط NDCG@10</w:t>
+        <w:t xml:space="preserve">يُختار من بين خطوط الأساس غير الشخصية في D-10 حرفياً، أي B1 (Random) وB2 (Pop) وB3 (Recent-Pop بنافذة w ‎∈‎ {3، 7، 14، 21، 28}؛ D-29)، بأعلى متوسط NDCG@10</w:t>
       </w:r>
       <w:r>
         <w:rPr>
@@ -5783,7 +5783,7 @@
         <w:rPr>
           <w:rtl/>
         </w:rPr>
-        <w:t xml:space="preserve">كلاهما يضبط عدد العوامل f ∈ {16، 32، 64} ومعامل التنظيم λ وα بالميزانية نفسها (D-34). والفرق الوحيد بينهما تمثيل الإشارة، فهي استئصال نظيف.</w:t>
+        <w:t xml:space="preserve">كلاهما يضبط عدد العوامل f ‎∈‎ {16، 32، 64} ومعامل التنظيم λ وα بالميزانية نفسها (D-34). والفرق الوحيد بينهما تمثيل الإشارة، فهي استئصال نظيف.</w:t>
       </w:r>
     </w:p>
     <w:p>
@@ -5952,7 +5952,7 @@
         <w:rPr>
           <w:rtl/>
         </w:rPr>
-        <w:t xml:space="preserve">منحنى الاستئصال على مستويات العائلة الأربعة L0 ⊂ L1 ⊂ L2 ⊂ L3 (القسم 5.11)، ليُعرف أي مستوى يحمل الأثر إن وُجد.</w:t>
+        <w:t xml:space="preserve">منحنى الاستئصال على مستويات العائلة الأربعة L0 ‎⊂‎ L1 ‎⊂‎ L2 ‎⊂‎ L3 (القسم 5.11)، ليُعرف أي مستوى يحمل الأثر إن وُجد.</w:t>
       </w:r>
     </w:p>
     <w:bookmarkEnd w:id="30"/>
@@ -6521,7 +6521,7 @@
               <w:rPr>
                 <w:rtl/>
               </w:rPr>
-              <w:t xml:space="preserve">، والحد الأدنى للفاصل &gt; 0، وp(Holm) &lt; 0.05</w:t>
+              <w:t xml:space="preserve">، والحد الأدنى للفاصل ‎&gt;‎ 0، وp(Holm) ‎&lt;‎ 0.05</w:t>
             </w:r>
           </w:p>
         </w:tc>
@@ -6598,7 +6598,7 @@
               <w:rPr>
                 <w:rtl/>
               </w:rPr>
-              <w:t xml:space="preserve">، والحد الأعلى للفاصل &lt; 0، وp(Holm) &lt; 0.05</w:t>
+              <w:t xml:space="preserve">، والحد الأعلى للفاصل ‎&lt;‎ 0، وp(Holm) ‎&lt;‎ 0.05</w:t>
             </w:r>
           </w:p>
         </w:tc>
@@ -6740,7 +6740,7 @@
               <w:rPr>
                 <w:rtl/>
               </w:rPr>
-              <w:t xml:space="preserve">الحد الأعلى للفاصل &lt; 0</w:t>
+              <w:t xml:space="preserve">الحد الأعلى للفاصل ‎&lt;‎ 0</w:t>
             </w:r>
           </w:p>
         </w:tc>
@@ -6790,7 +6790,7 @@
               <w:rPr>
                 <w:rtl/>
               </w:rPr>
-              <w:t xml:space="preserve">الحد الأعلى للفاصل &lt; δ</w:t>
+              <w:t xml:space="preserve">الحد الأعلى للفاصل ‎&lt;‎ δ</w:t>
             </w:r>
           </w:p>
         </w:tc>
@@ -6854,7 +6854,7 @@
         <w:rPr>
           <w:rtl/>
         </w:rPr>
-        <w:t xml:space="preserve">الجدول شامل ومتنافٍ بالترتيب: فالفاصل الذي يقع كله في السالب مع p(Holm) ≥ 0.05 يقع في الصف 3 (إن كان داخل ±δ) أو في الصف 4.</w:t>
+        <w:t xml:space="preserve">الجدول شامل ومتنافٍ بالترتيب: فالفاصل الذي يقع كله في السالب مع p(Holm) ‎≥‎ 0.05 يقع في الصف 3 (إن كان داخل ±δ) أو في الصف 4.</w:t>
       </w:r>
     </w:p>
     <w:bookmarkEnd w:id="31"/>
@@ -8176,7 +8176,7 @@
           <w:bCs/>
           <w:b/>
         </w:rPr>
-        <w:t xml:space="preserve">n ≤ Q1</w:t>
+        <w:t xml:space="preserve">n ‎≤‎ Q1</w:t>
       </w:r>
       <w:r>
         <w:rPr>
@@ -8214,7 +8214,7 @@
         <w:rPr>
           <w:rtl/>
         </w:rPr>
-        <w:t xml:space="preserve">للشريحة من المقيَّمين (≈ 26.3% على التطوير) ومعها حصة «&lt; 5 موارد» (≈ 0.7%) (D-45). فهذه الشريحة «الأقل تاريخاً نسبياً»، لا «جديدة» بالمعنى المطلق، ويُكتب ذلك صراحة.</w:t>
+        <w:t xml:space="preserve">للشريحة من المقيَّمين (‎≈‎ 26.3% على التطوير) ومعها حصة «‎&lt;‎ 5 موارد» (‎≈‎ 0.7%) (D-45). فهذه الشريحة «الأقل تاريخاً نسبياً»، لا «جديدة» بالمعنى المطلق، ويُكتب ذلك صراحة.</w:t>
       </w:r>
     </w:p>
     <w:p>
@@ -10501,7 +10501,7 @@
               <w:rPr>
                 <w:rtl/>
               </w:rPr>
-              <w:t xml:space="preserve">غير حاسمة على الأرجح (MDE80 التوضيحي ≈ 0.053 &gt; 2δ؛ D-48)، أو مؤكَّدة بهامش صغير</w:t>
+              <w:t xml:space="preserve">غير حاسمة على الأرجح (MDE80 التوضيحي ‎≈‎ 0.053 ‎&gt;‎ 2δ؛ D-48)، أو مؤكَّدة بهامش صغير</w:t>
             </w:r>
           </w:p>
         </w:tc>
@@ -11783,7 +11783,7 @@
         <w:rPr>
           <w:rtl/>
         </w:rPr>
-        <w:t xml:space="preserve">: تدخل حصص النقر بحسب النوع، وعدد الأيام النشطة، وانتظام النشاط، وملامح التجميع. ويُختبر أثرها في تحليل الحساسية (E∖{page}، وبلا استبعاد؛ القسم 5.11). و</w:t>
+        <w:t xml:space="preserve">: تدخل حصص النقر بحسب النوع، وعدد الأيام النشطة، وانتظام النشاط، وملامح التجميع. ويُختبر أثرها في تحليل الحساسية (E‎∖‎{page}، وبلا استبعاد؛ القسم 5.11). و</w:t>
       </w:r>
       <w:r>
         <w:rPr>
@@ -11803,7 +11803,7 @@
         <w:rPr>
           <w:rtl/>
         </w:rPr>
-        <w:t xml:space="preserve">للتحليل الرئيسي (D-38)، والبديلان (E∖{page}، وبلا استبعاد) حساسيتان فقط؛ وتُعرض أرقام EDA عن الأنواع وصفاً لا أساساً لتعديل E.</w:t>
+        <w:t xml:space="preserve">للتحليل الرئيسي (D-38)، والبديلان (E‎∖‎{page}، وبلا استبعاد) حساسيتان فقط؛ وتُعرض أرقام EDA عن الأنواع وصفاً لا أساساً لتعديل E.</w:t>
       </w:r>
     </w:p>
     <w:p>
@@ -16153,39 +16153,39 @@
               <w:rPr>
                 <w:rtl/>
               </w:rPr>
-              <w:t xml:space="preserve">i1 &gt; i2 &gt; i3 = i4</w:t>
-            </w:r>
-          </w:p>
-        </w:tc>
-        <w:tc>
-          <w:tcPr/>
-          <w:p>
-            <w:pPr>
-              <w:pStyle w:val="Compact"/>
-              <w:bidi w:val="1"/>
-              <w:jc w:val="left"/>
-            </w:pPr>
-            <w:r>
-              <w:rPr>
-                <w:rtl/>
-              </w:rPr>
-              <w:t xml:space="preserve">i1 &gt; i3 &gt; i2 &gt; i4</w:t>
-            </w:r>
-          </w:p>
-        </w:tc>
-        <w:tc>
-          <w:tcPr/>
-          <w:p>
-            <w:pPr>
-              <w:pStyle w:val="Compact"/>
-              <w:bidi w:val="1"/>
-              <w:jc w:val="left"/>
-            </w:pPr>
-            <w:r>
-              <w:rPr>
-                <w:rtl/>
-              </w:rPr>
-              <w:t xml:space="preserve">i1 &gt; i3 &gt; i2 &gt; i4</w:t>
+              <w:t xml:space="preserve">i1 ‎&gt;‎ i2 ‎&gt;‎ i3 = i4</w:t>
+            </w:r>
+          </w:p>
+        </w:tc>
+        <w:tc>
+          <w:tcPr/>
+          <w:p>
+            <w:pPr>
+              <w:pStyle w:val="Compact"/>
+              <w:bidi w:val="1"/>
+              <w:jc w:val="left"/>
+            </w:pPr>
+            <w:r>
+              <w:rPr>
+                <w:rtl/>
+              </w:rPr>
+              <w:t xml:space="preserve">i1 ‎&gt;‎ i3 ‎&gt;‎ i2 ‎&gt;‎ i4</w:t>
+            </w:r>
+          </w:p>
+        </w:tc>
+        <w:tc>
+          <w:tcPr/>
+          <w:p>
+            <w:pPr>
+              <w:pStyle w:val="Compact"/>
+              <w:bidi w:val="1"/>
+              <w:jc w:val="left"/>
+            </w:pPr>
+            <w:r>
+              <w:rPr>
+                <w:rtl/>
+              </w:rPr>
+              <w:t xml:space="preserve">i1 ‎&gt;‎ i3 ‎&gt;‎ i2 ‎&gt;‎ i4</w:t>
             </w:r>
           </w:p>
         </w:tc>
@@ -17167,7 +17167,7 @@
               <w:rPr>
                 <w:rtl/>
               </w:rPr>
-              <w:t xml:space="preserve">مصنَّفاً في فئات {0–3، 4–7، 8–14، &gt; 14} يوماً</w:t>
+              <w:t xml:space="preserve">مصنَّفاً في فئات {0–3، 4–7، 8–14، ‎&gt;‎ 14} يوماً</w:t>
             </w:r>
           </w:p>
         </w:tc>
@@ -17663,7 +17663,7 @@
         <w:rPr>
           <w:rtl/>
         </w:rPr>
-        <w:t xml:space="preserve">يوماً (الفئة &gt; 14). أما عند t = 40 فيكون</w:t>
+        <w:t xml:space="preserve">يوماً (الفئة ‎&gt;‎ 14). أما عند t = 40 فيكون</w:t>
       </w:r>
       <w:r>
         <w:rPr>
@@ -18947,7 +18947,7 @@
         <w:rPr>
           <w:rtl/>
         </w:rPr>
-        <w:t xml:space="preserve">&lt;</w:t>
+        <w:t xml:space="preserve">‎&lt;‎</w:t>
       </w:r>
       <w:r>
         <w:rPr>
@@ -20398,7 +20398,7 @@
         <w:rPr>
           <w:rtl/>
         </w:rPr>
-        <w:t xml:space="preserve">الشعبية = (3، 2، 1، 3، 2) للموارد i1–i5. فترتيب مرشحي u4: i2 (2) = i5 (2) &gt; i3 (1)، ويُكسر التعادل بين i2 وi5 بمفتاح حتمي ثابت مشتق من (العرض، الأصل، المتعلم، المورد) (D-32).</w:t>
+        <w:t xml:space="preserve">الشعبية = (3، 2، 1، 3، 2) للموارد i1–i5. فترتيب مرشحي u4: i2 (2) = i5 (2) ‎&gt;‎ i3 (1)، ويُكسر التعادل بين i2 وi5 بمفتاح حتمي ثابت مشتق من (العرض، الأصل، المتعلم، المورد) (D-32).</w:t>
       </w:r>
     </w:p>
     <w:p>
@@ -20959,7 +20959,7 @@
         <w:rPr>
           <w:rtl/>
         </w:rPr>
-        <w:t xml:space="preserve">لنفترض أن عدد المتعلمين في آخر 7 أيام: i1 = 0، وi2 = 2، وi3 = 1، وi4 = 1، وi5 = 0. فترتيب مرشحي u4: i2 &gt; i3 &gt; i5. لاحظ أن i5 الذي تعادل مع i2 في الشعبية الكلية صار الأخير، لأنه «خارج الأسبوع الحالي».</w:t>
+        <w:t xml:space="preserve">لنفترض أن عدد المتعلمين في آخر 7 أيام: i1 = 0، وi2 = 2، وi3 = 1، وi4 = 1، وi5 = 0. فترتيب مرشحي u4: i2 ‎&gt;‎ i3 ‎&gt;‎ i5. لاحظ أن i5 الذي تعادل مع i2 في الشعبية الكلية صار الأخير، لأنه «خارج الأسبوع الحالي».</w:t>
       </w:r>
     </w:p>
     <w:p>
@@ -21058,7 +21058,7 @@
         <w:rPr>
           <w:rtl/>
         </w:rPr>
-        <w:t xml:space="preserve">w ∈ {3، 7، 14، 21، 28} (خمس نوافذ، لتقليص اللاتكافؤ مع ضبط الهجين).</w:t>
+        <w:t xml:space="preserve">w ‎∈‎ {3، 7، 14، 21، 28} (خمس نوافذ، لتقليص اللاتكافؤ مع ضبط الهجين).</w:t>
       </w:r>
     </w:p>
     <w:bookmarkEnd w:id="49"/>
@@ -22875,7 +22875,7 @@
         <w:rPr>
           <w:rtl/>
         </w:rPr>
-        <w:t xml:space="preserve">الترتيب في الحالتين i2 &gt; i5 &gt; i3، لكن الفجوة بين i3 وi5 تضيق بالإشارة الموزونة لأن u4 زار i1 (جار i3) أكثر من i4. وهذا مثال على كيف يغيّر الترجيح الدرجات دون أن يغيّر الترتيب دائماً؛ فقياس أثره تجريبياً هو موضوع H2.</w:t>
+        <w:t xml:space="preserve">الترتيب في الحالتين i2 ‎&gt;‎ i5 ‎&gt;‎ i3، لكن الفجوة بين i3 وi5 تضيق بالإشارة الموزونة لأن u4 زار i1 (جار i3) أكثر من i4. وهذا مثال على كيف يغيّر الترجيح الدرجات دون أن يغيّر الترتيب دائماً؛ فقياس أثره تجريبياً هو موضوع H2.</w:t>
       </w:r>
     </w:p>
     <w:p>
@@ -23123,7 +23123,7 @@
         <w:rPr>
           <w:rtl/>
         </w:rPr>
-        <w:t xml:space="preserve">k ∈ {20, 50, 100, الكل}، وλ ∈ {0, 10, 50, 100}، ومستوى الإشارة ∈ {L0, …, L3} في التجميع وحده (D-43).</w:t>
+        <w:t xml:space="preserve">k ‎∈‎ {20, 50, 100, الكل}، وλ ‎∈‎ {0, 10, 50, 100}، ومستوى الإشارة ‎∈‎ {L0, …, L3} في التجميع وحده (D-43).</w:t>
       </w:r>
     </w:p>
     <w:bookmarkEnd w:id="50"/>
@@ -23193,7 +23193,7 @@
         <w:rPr>
           <w:rtl/>
         </w:rPr>
-        <w:t xml:space="preserve">سلال آخر L يوماً نشطاً للمتعلم (L ∈ {1, 3, 7})، و</w:t>
+        <w:t xml:space="preserve">سلال آخر L يوماً نشطاً للمتعلم (L ‎∈‎ {1, 3, 7})، و</w:t>
       </w:r>
       <w:r>
         <w:rPr>
@@ -24648,7 +24648,7 @@
           <w:bCs/>
           <w:b/>
         </w:rPr>
-        <w:t xml:space="preserve">i5 &gt; i2 &gt; i3</w:t>
+        <w:t xml:space="preserve">i5 ‎&gt;‎ i2 ‎&gt;‎ i3</w:t>
       </w:r>
       <w:r>
         <w:rPr>
@@ -24934,7 +24934,7 @@
         <w:rPr>
           <w:rtl/>
         </w:rPr>
-        <w:t xml:space="preserve">: 0.3922. الدرجات: i2 = 0.8006، وi3 = 0.4804، وi5 = 0.8726. الترتيب i5 &gt; i2 &gt; i3، مع صعود i3 لأن i1 المتكرر في الاستعلام يشترك معه في</w:t>
+        <w:t xml:space="preserve">: 0.3922. الدرجات: i2 = 0.8006، وi3 = 0.4804، وi5 = 0.8726. الترتيب i5 ‎&gt;‎ i2 ‎&gt;‎ i3، مع صعود i3 لأن i1 المتكرر في الاستعلام يشترك معه في</w:t>
       </w:r>
       <w:r>
         <w:rPr>
@@ -25104,7 +25104,7 @@
         <w:rPr>
           <w:rtl/>
         </w:rPr>
-        <w:t xml:space="preserve">L ∈ {1, 3, 7}، وk ∈ {50, 100, 200, 500}، وM ∈ {1000, 5000, الكل}، ونوع الاضمحلال (خطي لـV-SKNN).</w:t>
+        <w:t xml:space="preserve">L ‎∈‎ {1, 3, 7}، وk ‎∈‎ {50, 100, 200, 500}، وM ‎∈‎ {1000, 5000, الكل}، ونوع الاضمحلال (خطي لـV-SKNN).</w:t>
       </w:r>
     </w:p>
     <w:bookmarkEnd w:id="51"/>
@@ -25927,7 +25927,7 @@
         <w:rPr>
           <w:rtl/>
         </w:rPr>
-        <w:t xml:space="preserve">، وi5 = (0.2727 + 0.2727)/2 = 0.2727، وi3 = (0.2727 + 0.0909)/2 = 0.1818. الترتيب: i2 &gt; i5 &gt; i3.</w:t>
+        <w:t xml:space="preserve">، وi5 = (0.2727 + 0.2727)/2 = 0.2727، وi3 = (0.2727 + 0.0909)/2 = 0.1818. الترتيب: i2 ‎&gt;‎ i5 ‎&gt;‎ i3.</w:t>
       </w:r>
     </w:p>
     <w:p>
@@ -26156,7 +26156,7 @@
         <w:rPr>
           <w:rtl/>
         </w:rPr>
-        <w:t xml:space="preserve">γ ∈ {0.01, 0.1, 0.5, 1}، ومتغير «السلة الأخيرة» مقابل اتحاد آخر L سلة.</w:t>
+        <w:t xml:space="preserve">γ ‎∈‎ {0.01, 0.1, 0.5, 1}، ومتغير «السلة الأخيرة» مقابل اتحاد آخر L سلة.</w:t>
       </w:r>
     </w:p>
     <w:bookmarkEnd w:id="52"/>
@@ -29027,7 +29027,7 @@
         <w:rPr>
           <w:rtl/>
         </w:rPr>
-        <w:t xml:space="preserve">، وi5 = 0.1418. الترتيب: i3 &gt; i5 &gt; i2.</w:t>
+        <w:t xml:space="preserve">، وi5 = 0.1418. الترتيب: i3 ‎&gt;‎ i5 ‎&gt;‎ i2.</w:t>
       </w:r>
     </w:p>
     <w:p>
@@ -29392,7 +29392,7 @@
         <w:rPr>
           <w:rtl/>
         </w:rPr>
-        <w:t xml:space="preserve">f ∈ {16، 32، 64} (D-34؛ f = 128 أغلى بنحو 4.6 أضعاف بلا حاجة مع كتالوج ≤ 445)، وλ ∈ {0.01, 0.1, 1, 10}، وα (القسم 3.4)، والتكرارات نقاط تفتيش {10، 15، 25} من تشغيل واحد (لا تُعدّ إعدادات)، ومستوى الإشارة. والعشوائية في التهيئة وحدها (الضبط ببذرة 0، والتقرير بخمس).</w:t>
+        <w:t xml:space="preserve">f ‎∈‎ {16، 32، 64} (D-34؛ f = 128 أغلى بنحو 4.6 أضعاف بلا حاجة مع كتالوج ‎≤‎ 445)، وλ ‎∈‎ {0.01, 0.1, 1, 10}، وα (القسم 3.4)، والتكرارات نقاط تفتيش {10، 15، 25} من تشغيل واحد (لا تُعدّ إعدادات)، ومستوى الإشارة. والعشوائية في التهيئة وحدها (الضبط ببذرة 0، والتقرير بخمس).</w:t>
       </w:r>
     </w:p>
     <w:bookmarkEnd w:id="53"/>
@@ -29540,7 +29540,7 @@
         <w:rPr>
           <w:rtl/>
         </w:rPr>
-        <w:t xml:space="preserve">في مثال الجدول 8 يكون الترتيب i1 &gt; i3 &gt; i2 &gt; i4 (قيم L2).</w:t>
+        <w:t xml:space="preserve">في مثال الجدول 8 يكون الترتيب i1 ‎&gt;‎ i3 ‎&gt;‎ i2 ‎&gt;‎ i4 (قيم L2).</w:t>
       </w:r>
       <w:r>
         <w:rPr>
@@ -29725,7 +29725,7 @@
         <w:rPr>
           <w:rtl/>
         </w:rPr>
-        <w:t xml:space="preserve">، فيمثل الملف شكل استخدام المورد زمنياً لا مستواه، لأن المستوى شعبية تحملها المكوّنات (1) و(6)؛ والأيام بعد آخر موعد معروف تقع في الفئة &gt; 14؛ D-44). ملف المتعلم متوسط سمات ما زاره موزوناً بـ</w:t>
+        <w:t xml:space="preserve">، فيمثل الملف شكل استخدام المورد زمنياً لا مستواه، لأن المستوى شعبية تحملها المكوّنات (1) و(6)؛ والأيام بعد آخر موعد معروف تقع في الفئة ‎&gt;‎ 14؛ D-44). ملف المتعلم متوسط سمات ما زاره موزوناً بـ</w:t>
       </w:r>
       <m:oMath>
         <m:r>
@@ -30239,7 +30239,7 @@
         <w:rPr>
           <w:rtl/>
         </w:rPr>
-        <w:t xml:space="preserve">أوزان مجموعات السمات الثلاث ∈ {0, 0.5, 1} ضمن الميزانية.</w:t>
+        <w:t xml:space="preserve">أوزان مجموعات السمات الثلاث ‎∈‎ {0, 0.5, 1} ضمن الميزانية.</w:t>
       </w:r>
     </w:p>
     <w:bookmarkEnd w:id="55"/>
@@ -30759,7 +30759,7 @@
         <w:rPr>
           <w:rtl/>
         </w:rPr>
-        <w:t xml:space="preserve">(وقطرها أصفار)، درجات u4 الذي زار i1 وi4: i2 = 0.4444، وi5 = 0.1250، وi3 = 0.0984. الترتيب: i2 &gt; i5 &gt; i3.</w:t>
+        <w:t xml:space="preserve">(وقطرها أصفار)، درجات u4 الذي زار i1 وi4: i2 = 0.4444، وi5 = 0.1250، وi3 = 0.0984. الترتيب: i2 ‎&gt;‎ i5 ‎&gt;‎ i3.</w:t>
       </w:r>
     </w:p>
     <w:p>
@@ -30954,7 +30954,7 @@
         <w:rPr>
           <w:rtl/>
         </w:rPr>
-        <w:t xml:space="preserve">λ ∈ {1، 10، 50، 100، 500}، وX ثنائية.</w:t>
+        <w:t xml:space="preserve">λ ‎∈‎ {1، 10، 50، 100، 500}، وX ثنائية.</w:t>
       </w:r>
     </w:p>
     <w:p>
@@ -31912,7 +31912,7 @@
               <w:rPr>
                 <w:rtl/>
               </w:rPr>
-              <w:t xml:space="preserve">B7 WRMF-ALS (f ≤ 64)</w:t>
+              <w:t xml:space="preserve">B7 WRMF-ALS (f ‎≤‎ 64)</w:t>
             </w:r>
           </w:p>
         </w:tc>
@@ -33249,7 +33249,7 @@
         <w:rPr>
           <w:rtl/>
         </w:rPr>
-        <w:t xml:space="preserve">مورد quiz معدلاته في التدريب: الفئة 0–3 أيام = 0.12، و4–7 = 0.08، و8–14 = 0.03، و&gt; 14 = 0.01 (قيم توضيحية). عند t = 40 في</w:t>
+        <w:t xml:space="preserve">مورد quiz معدلاته في التدريب: الفئة 0–3 أيام = 0.12، و4–7 = 0.08، و8–14 = 0.03، و‎&gt;‎ 14 = 0.01 (قيم توضيحية). عند t = 40 في</w:t>
       </w:r>
       <w:r>
         <w:rPr>
@@ -33436,7 +33436,7 @@
         <w:rPr>
           <w:rtl/>
         </w:rPr>
-        <w:t xml:space="preserve">حدود الفئات (ثابتة: {0–3، 4–7، 8–14، &gt; 14}).</w:t>
+        <w:t xml:space="preserve">حدود الفئات (ثابتة: {0–3، 4–7، 8–14، ‎&gt;‎ 14}).</w:t>
       </w:r>
     </w:p>
     <w:bookmarkEnd w:id="58"/>
@@ -35060,7 +35060,7 @@
         <w:rPr>
           <w:rtl/>
         </w:rPr>
-        <w:t xml:space="preserve">(t، t+14]: متوسط الأصول لفرق NDCG@10 (المهمة A) بين «القاعدة + m» والقاعدة. فالرفع خارج العينة، لا ≥ 0 بالبناء كما لو قيس على نافذة الضبط (D-30).</w:t>
+        <w:t xml:space="preserve">(t، t+14]: متوسط الأصول لفرق NDCG@10 (المهمة A) بين «القاعدة + m» والقاعدة. فالرفع خارج العينة، لا ‎≥‎ 0 بالبناء كما لو قيس على نافذة الضبط (D-30).</w:t>
       </w:r>
     </w:p>
     <w:p>
@@ -35118,7 +35118,7 @@
         <w:rPr>
           <w:rtl/>
         </w:rPr>
-        <w:t xml:space="preserve">يُقبل m إن كان الحد الأدنى للفاصل &gt; 0، وكان الرفع (للمكوّن العشوائي) أكبر من الانحراف المعياري عبر بذور التقرير الخمس.</w:t>
+        <w:t xml:space="preserve">يُقبل m إن كان الحد الأدنى للفاصل ‎&gt;‎ 0، وكان الرفع (للمكوّن العشوائي) أكبر من الانحراف المعياري عبر بذور التقرير الخمس.</w:t>
       </w:r>
     </w:p>
     <w:p>
@@ -35164,7 +35164,7 @@
         <w:rPr>
           <w:rtl/>
         </w:rPr>
-        <w:t xml:space="preserve">إن انتهى الإجراء بلا مكوّن شخصي من {(2) WRMF، (3) Item-kNN، (4) التسلسلي، (5) CBF}، يُضاف صاحب أكبر رفع مقدَّر منها، ويُوسم «دخل بالأرضية لا بالقبول». والمكوّنات غير الشخصية ثلاثة على الأكثر ((1) و(6) و(7))، فيبقى الحد ≤ 4. والهجين «بالقبول وحده» يُبلَّغ ثانوياً.</w:t>
+        <w:t xml:space="preserve">إن انتهى الإجراء بلا مكوّن شخصي من {(2) WRMF، (3) Item-kNN، (4) التسلسلي، (5) CBF}، يُضاف صاحب أكبر رفع مقدَّر منها، ويُوسم «دخل بالأرضية لا بالقبول». والمكوّنات غير الشخصية ثلاثة على الأكثر ((1) و(6) و(7))، فيبقى الحد ‎≤‎ 4. والهجين «بالقبول وحده» يُبلَّغ ثانوياً.</w:t>
       </w:r>
     </w:p>
     <w:p>
@@ -35981,7 +35981,7 @@
         <w:rPr>
           <w:rtl/>
         </w:rPr>
-        <w:t xml:space="preserve">لكل متعلم للترتيب، مضروباً في عدد نقاط الشبكة على التحقق (≤ 20).</w:t>
+        <w:t xml:space="preserve">لكل متعلم للترتيب، مضروباً في عدد نقاط الشبكة على التحقق (‎≤‎ 20).</w:t>
       </w:r>
     </w:p>
     <w:bookmarkEnd w:id="64"/>
@@ -36102,7 +36102,7 @@
         <w:rPr>
           <w:rtl/>
         </w:rPr>
-        <w:t xml:space="preserve">GRU-lite في numpy، لا يُبدأ بتقييمه قبل جاهزية المستوى 1، كي لا يُقارن بأساس ضعيف. والمدة ≤ 6 أيام عمل.</w:t>
+        <w:t xml:space="preserve">GRU-lite في numpy، لا يُبدأ بتقييمه قبل جاهزية المستوى 1، كي لا يُقارن بأساس ضعيف. والمدة ‎≤‎ 6 أيام عمل.</w:t>
       </w:r>
     </w:p>
     <w:bookmarkEnd w:id="66"/>
@@ -39585,7 +39585,7 @@
         <w:rPr>
           <w:rtl/>
         </w:rPr>
-        <w:t xml:space="preserve">≤ 6 أيام عمل (D-12)، من 11-26 إلى 12-03.</w:t>
+        <w:t xml:space="preserve">‎≤‎ 6 أيام عمل (D-12)، من 11-26 إلى 12-03.</w:t>
       </w:r>
     </w:p>
     <w:p>
@@ -42202,7 +42202,7 @@
               <w:rPr>
                 <w:rtl/>
               </w:rPr>
-              <w:t xml:space="preserve">، على 3 تسلسلات بأطوال {1، 3، 5} محشوة بقناع، وT ≥ أطول تسلسل (بلا قطع)، و</w:t>
+              <w:t xml:space="preserve">، على 3 تسلسلات بأطوال {1، 3، 5} محشوة بقناع، وT ‎≥‎ أطول تسلسل (بلا قطع)، و</w:t>
             </w:r>
             <m:oMath>
               <m:sSub>
@@ -42283,7 +42283,7 @@
               <w:rPr>
                 <w:rtl/>
               </w:rPr>
-              <w:t xml:space="preserve">، وL2 مفعَّل؛ ≥ 20 إحداثية من كل مصفوفة (أو كلها إن كانت أقل)</w:t>
+              <w:t xml:space="preserve">، وL2 مفعَّل؛ ‎≥‎ 20 إحداثية من كل مصفوفة (أو كلها إن كانت أقل)</w:t>
             </w:r>
           </w:p>
         </w:tc>
@@ -42473,7 +42473,7 @@
               <w:rPr>
                 <w:rtl/>
               </w:rPr>
-              <w:t xml:space="preserve">؛ ومعه اختبار وحدة: القطع بـT ≥ الطول يطابق الحساب الكامل</w:t>
+              <w:t xml:space="preserve">؛ ومعه اختبار وحدة: القطع بـT ‎≥‎ الطول يطابق الحساب الكامل</w:t>
             </w:r>
           </w:p>
         </w:tc>
@@ -42651,7 +42651,7 @@
               <w:rPr>
                 <w:rtl/>
               </w:rPr>
-              <w:t xml:space="preserve">nat، وHR@10 للتدريب ≥ 0.99</w:t>
+              <w:t xml:space="preserve">nat، وHR@10 للتدريب ‎≥‎ 0.99</w:t>
             </w:r>
           </w:p>
         </w:tc>
@@ -42781,7 +42781,7 @@
               <w:rPr>
                 <w:rtl/>
               </w:rPr>
-              <w:t xml:space="preserve">≤ 0.10، وNDCG@10 ≥ NDCG@10(Markov المقدَّر) − 0.01</w:t>
+              <w:t xml:space="preserve">‎≤‎ 0.10، وNDCG@10 ‎≥‎ NDCG@10(Markov المقدَّر) − 0.01</w:t>
             </w:r>
           </w:p>
         </w:tc>
@@ -42847,7 +42847,7 @@
               <w:rPr>
                 <w:rtl/>
               </w:rPr>
-              <w:t xml:space="preserve">لا NaN ولا Inf، وخسارة التدريب الأخيرة ≤ 0.9 × الأولى، ومنحنى التحقق مسجل</w:t>
+              <w:t xml:space="preserve">لا NaN ولا Inf، وخسارة التدريب الأخيرة ‎≤‎ 0.9 × الأولى، ومنحنى التحقق مسجل</w:t>
             </w:r>
           </w:p>
         </w:tc>
@@ -42913,7 +42913,7 @@
               <w:rPr>
                 <w:rtl/>
               </w:rPr>
-              <w:t xml:space="preserve">انحراف NDCG@10 ≤ δ/4 = 0.005 يُبلَّغ؛ وتجاوزه يُوثَّق ولا يُسقط النموذج</w:t>
+              <w:t xml:space="preserve">انحراف NDCG@10 ‎≤‎ δ/4 = 0.005 يُبلَّغ؛ وتجاوزه يُوثَّق ولا يُسقط النموذج</w:t>
             </w:r>
           </w:p>
         </w:tc>
@@ -43054,7 +43054,7 @@
         <w:rPr>
           <w:rtl/>
         </w:rPr>
-        <w:t xml:space="preserve">ولا بوابة r، ولهذا يشترط S1 أطوالاً ≥ 3 و</w:t>
+        <w:t xml:space="preserve">ولا بوابة r، ولهذا يشترط S1 أطوالاً ‎≥‎ 3 و</w:t>
       </w:r>
       <m:oMath>
         <m:sSub>
@@ -44212,7 +44212,7 @@
           <w:bCs/>
           <w:b/>
         </w:rPr>
-        <w:t xml:space="preserve">اختيار k ∈ [2..8]</w:t>
+        <w:t xml:space="preserve">اختيار k ‎∈‎ [2..8]</w:t>
       </w:r>
       <w:r>
         <w:rPr>
@@ -44659,7 +44659,7 @@
         <w:rPr>
           <w:rtl/>
         </w:rPr>
-        <w:t xml:space="preserve">أصغر k يقع ضمن أفضل اثنين في silhouette وDBI، ومتوسط ARI ≥ 0.8؛ وإلا فأفضل silhouette مع الإبلاغ عن عدم الاستقرار. (مُقرّة بـD-39-ب، والحالة الاحتياطية رسمية ومتوقعة لأن ARI ≥ 0.8 صعب على ملامح متصلة.)</w:t>
+        <w:t xml:space="preserve">أصغر k يقع ضمن أفضل اثنين في silhouette وDBI، ومتوسط ARI ‎≥‎ 0.8؛ وإلا فأفضل silhouette مع الإبلاغ عن عدم الاستقرار. (مُقرّة بـD-39-ب، والحالة الاحتياطية رسمية ومتوقعة لأن ARI ‎≥‎ 0.8 صعب على ملامح متصلة.)</w:t>
       </w:r>
     </w:p>
     <w:p>
@@ -45297,7 +45297,7 @@
         <w:rPr>
           <w:rtl/>
         </w:rPr>
-        <w:t xml:space="preserve">يُحل بالانحدار التدرجي أو نيوتن، وλ ∈ {10⁻³، 10⁻²، 10⁻¹، 1، 10} بتحقق متقاطع داخل عروض 2013 مجمَّعاً بالعرض.</w:t>
+        <w:t xml:space="preserve">يُحل بالانحدار التدرجي أو نيوتن، وλ ‎∈‎ {10⁻³، 10⁻²، 10⁻¹، 1، 10} بتحقق متقاطع داخل عروض 2013 مجمَّعاً بالعرض.</w:t>
       </w:r>
       <w:r>
         <w:rPr>
@@ -45552,7 +45552,7 @@
           <w:bCs/>
           <w:b/>
         </w:rPr>
-        <w:t xml:space="preserve">CART بعمق ≤ 4 (للتفسير)</w:t>
+        <w:t xml:space="preserve">CART بعمق ‎≤‎ 4 (للتفسير)</w:t>
       </w:r>
       <w:r>
         <w:rPr>
@@ -45730,7 +45730,7 @@
         <w:rPr>
           <w:rtl/>
         </w:rPr>
-        <w:t xml:space="preserve">. والتقسيم «الأيام النشطة ≤ 10» يعطي يساراً 4 متعلمين (3 معرّضون، G = 0.375) ويميناً 6 (معرّض واحد، G = 0.278)، فالمتوسط الموزون 0.4·0.375 + 0.6·0.278 = 0.317، والكسب 0.163.</w:t>
+        <w:t xml:space="preserve">. والتقسيم «الأيام النشطة ‎≤‎ 10» يعطي يساراً 4 متعلمين (3 معرّضون، G = 0.375) ويميناً 6 (معرّض واحد، G = 0.278)، فالمتوسط الموزون 0.4·0.375 + 0.6·0.278 = 0.317، والكسب 0.163.</w:t>
       </w:r>
       <w:r>
         <w:rPr>
@@ -46967,7 +46967,7 @@
         <w:rPr>
           <w:rtl/>
         </w:rPr>
-        <w:t xml:space="preserve">تعرض واجهة المتعلم توصيات تسجيل ما عند يوم مختار t (نمط إعادة التشغيل؛ D-22) بالقواعد الآتية، وكلها لا تستعمل إلا ما هو ≤ t فلا تسرب:</w:t>
+        <w:t xml:space="preserve">تعرض واجهة المتعلم توصيات تسجيل ما عند يوم مختار t (نمط إعادة التشغيل؛ D-22) بالقواعد الآتية، وكلها لا تستعمل إلا ما هو ‎≤‎ t فلا تسرب:</w:t>
       </w:r>
     </w:p>
     <w:p>
@@ -46997,7 +46997,7 @@
           <w:bCs/>
           <w:b/>
         </w:rPr>
-        <w:t xml:space="preserve">أقرب قطع c ≤ t</w:t>
+        <w:t xml:space="preserve">أقرب قطع c ‎≤‎ t</w:t>
       </w:r>
       <w:r>
         <w:rPr>
@@ -47171,7 +47171,7 @@
         <w:rPr>
           <w:rtl/>
         </w:rPr>
-        <w:t xml:space="preserve">عند t &lt; 70 لا مكوّن ثقيل متاح: يُستعمل المتاح مع</w:t>
+        <w:t xml:space="preserve">عند t ‎&lt;‎ 70 لا مكوّن ثقيل متاح: يُستعمل المتاح مع</w:t>
       </w:r>
       <w:r>
         <w:rPr>
@@ -47270,7 +47270,7 @@
         <w:rPr>
           <w:rtl/>
         </w:rPr>
-        <w:t xml:space="preserve">الحمل الكلي: 22 عرضاً × 3 أصول × مرحلتان (ضبط واختبار) × النماذج × حتى 20 إعداداً. وهو مقبول لأن الكتالوج صغير (≤ 445) وعدد التسجيلات في العرض بالآلاف. فأثقل خطوة هي softmax في GRU،</w:t>
+        <w:t xml:space="preserve">الحمل الكلي: 22 عرضاً × 3 أصول × مرحلتان (ضبط واختبار) × النماذج × حتى 20 إعداداً. وهو مقبول لأن الكتالوج صغير (‎≤‎ 445) وعدد التسجيلات في العرض بالآلاف. فأثقل خطوة هي softmax في GRU،</w:t>
       </w:r>
       <w:r>
         <w:rPr>
@@ -47485,7 +47485,7 @@
               <w:rPr>
                 <w:rtl/>
               </w:rPr>
-              <w:t xml:space="preserve">خمس بذور {0..4} للنماذج العشوائية (B1، وWRMF، وGRU-lite، وk-means)؛ وشرط «الرفع &gt; انحراف البذور» في القبول يُحسب منها</w:t>
+              <w:t xml:space="preserve">خمس بذور {0..4} للنماذج العشوائية (B1، وWRMF، وGRU-lite، وk-means)؛ وشرط «الرفع ‎&gt;‎ انحراف البذور» في القبول يُحسب منها</w:t>
             </w:r>
           </w:p>
         </w:tc>
@@ -47519,7 +47519,7 @@
               <w:rPr>
                 <w:rtl/>
               </w:rPr>
-              <w:t xml:space="preserve">≤ 20 لكل نموذج ولكل (عرض، أصل)، بما فيها أوزان الهجين؛ والتكرارات ونقاط التفتيش والدورات لا تُعدّ إعدادات</w:t>
+              <w:t xml:space="preserve">‎≤‎ 20 لكل نموذج ولكل (عرض، أصل)، بما فيها أوزان الهجين؛ والتكرارات ونقاط التفتيش والدورات لا تُعدّ إعدادات</w:t>
             </w:r>
           </w:p>
         </w:tc>
@@ -47553,7 +47553,7 @@
               <w:rPr>
                 <w:rtl/>
               </w:rPr>
-              <w:t xml:space="preserve">f ∈ {16، 32، 64}</w:t>
+              <w:t xml:space="preserve">f ‎∈‎ {16، 32، 64}</w:t>
             </w:r>
           </w:p>
         </w:tc>
@@ -47696,7 +47696,7 @@
               <w:rPr>
                 <w:rtl/>
               </w:rPr>
-              <w:t xml:space="preserve">≤ 8 ساعات CPU لتشغيل التطوير الرسمي الكامل (E2–E7، 27 زوجاً)، و≤ 8 ساعات CPU لـE10؛ وتقدير المشرف الاستكشافي 3.5–4.5 ساعة</w:t>
+              <w:t xml:space="preserve">‎≤‎ 8 ساعات CPU لتشغيل التطوير الرسمي الكامل (E2–E7، 27 زوجاً)، و‎≤‎ 8 ساعات CPU لـE10؛ وتقدير المشرف الاستكشافي 3.5–4.5 ساعة</w:t>
             </w:r>
           </w:p>
         </w:tc>
@@ -47798,7 +47798,7 @@
               <w:rPr>
                 <w:rtl/>
               </w:rPr>
-              <w:t xml:space="preserve">يُطبَّق بالترتيب إن تجاوز التطوير الهدف، قبل التجميد فقط، ويُوثَّق: (1) η لـGRU ثابتة على أفضل قيمة تطوير؛ (2) WRMF f ≤ 32؛ (3) SKNN M = 5000؛ (4) GRU بحد 20 دورة</w:t>
+              <w:t xml:space="preserve">يُطبَّق بالترتيب إن تجاوز التطوير الهدف، قبل التجميد فقط، ويُوثَّق: (1) η لـGRU ثابتة على أفضل قيمة تطوير؛ (2) WRMF f ‎≤‎ 32؛ (3) SKNN M = 5000؛ (4) GRU بحد 20 دورة</w:t>
             </w:r>
           </w:p>
         </w:tc>
@@ -47974,7 +47974,7 @@
               <w:rPr>
                 <w:rtl/>
               </w:rPr>
-              <w:t xml:space="preserve">τ ∈ {7، 14، 28، 56، ∞}؛ β ∈ {0، 0.5، 1، 2}</w:t>
+              <w:t xml:space="preserve">τ ‎∈‎ {7، 14، 28، 56، ∞}؛ β ‎∈‎ {0، 0.5، 1، 2}</w:t>
             </w:r>
           </w:p>
         </w:tc>
@@ -48040,7 +48040,7 @@
               <w:rPr>
                 <w:rtl/>
               </w:rPr>
-              <w:t xml:space="preserve">w ∈ {3، 7، 14، 21، 28}</w:t>
+              <w:t xml:space="preserve">w ‎∈‎ {3، 7، 14، 21، 28}</w:t>
             </w:r>
           </w:p>
         </w:tc>
@@ -48106,7 +48106,7 @@
               <w:rPr>
                 <w:rtl/>
               </w:rPr>
-              <w:t xml:space="preserve">k ∈ {20، 50، 100، الكل}؛ λ ∈ {0، 10، 50، 100}؛ مستوى الإشارة</w:t>
+              <w:t xml:space="preserve">k ‎∈‎ {20، 50، 100، الكل}؛ λ ‎∈‎ {0، 10، 50، 100}؛ مستوى الإشارة</w:t>
             </w:r>
           </w:p>
         </w:tc>
@@ -48172,7 +48172,7 @@
               <w:rPr>
                 <w:rtl/>
               </w:rPr>
-              <w:t xml:space="preserve">L ∈ {1، 3، 7}؛ k ∈ {50، 100، 200، 500}؛ M ∈ {1000، 5000، الكل}؛ النوع؛ بلا سلال المستعلِم</w:t>
+              <w:t xml:space="preserve">L ‎∈‎ {1، 3، 7}؛ k ‎∈‎ {50، 100، 200، 500}؛ M ‎∈‎ {1000، 5000، الكل}؛ النوع؛ بلا سلال المستعلِم</w:t>
             </w:r>
           </w:p>
         </w:tc>
@@ -48238,7 +48238,7 @@
               <w:rPr>
                 <w:rtl/>
               </w:rPr>
-              <w:t xml:space="preserve">γ ∈ {0.01، 0.1، 0.5، 1}؛ السلة الأخيرة أو اتحاد L ∈ {1، 3}</w:t>
+              <w:t xml:space="preserve">γ ‎∈‎ {0.01، 0.1، 0.5، 1}؛ السلة الأخيرة أو اتحاد L ‎∈‎ {1، 3}</w:t>
             </w:r>
           </w:p>
         </w:tc>
@@ -48304,7 +48304,7 @@
               <w:rPr>
                 <w:rtl/>
               </w:rPr>
-              <w:t xml:space="preserve">f ∈ {16، 32، 64}؛ λ ∈ {0.01، 0.1، 1، 10}؛ α ∈ {1، 2، 5، 10، 20، 40}؛ نقاط تفتيش التكرارات {10، 15، 25} (لا تُعدّ إعدادات)؛ الإشارة</w:t>
+              <w:t xml:space="preserve">f ‎∈‎ {16، 32، 64}؛ λ ‎∈‎ {0.01، 0.1، 1، 10}؛ α ‎∈‎ {1، 2، 5، 10، 20، 40}؛ نقاط تفتيش التكرارات {10، 15، 25} (لا تُعدّ إعدادات)؛ الإشارة</w:t>
             </w:r>
           </w:p>
         </w:tc>
@@ -48436,7 +48436,7 @@
               <w:rPr>
                 <w:rtl/>
               </w:rPr>
-              <w:t xml:space="preserve">أوزان مجموعات السمات الثلاث ∈ {0، 0.5، 1}</w:t>
+              <w:t xml:space="preserve">أوزان مجموعات السمات الثلاث ‎∈‎ {0، 0.5، 1}</w:t>
             </w:r>
           </w:p>
         </w:tc>
@@ -48502,7 +48502,7 @@
               <w:rPr>
                 <w:rtl/>
               </w:rPr>
-              <w:t xml:space="preserve">λ ∈ {1، 10، 50، 100، 500}؛ X ثنائية</w:t>
+              <w:t xml:space="preserve">λ ‎∈‎ {1، 10، 50، 100، 500}؛ X ثنائية</w:t>
             </w:r>
           </w:p>
         </w:tc>
@@ -48568,7 +48568,7 @@
               <w:rPr>
                 <w:rtl/>
               </w:rPr>
-              <w:t xml:space="preserve">η ∈ {0.001، 0.003، 0.01}؛ الهدف ∈ {next، next-new}؛</w:t>
+              <w:t xml:space="preserve">η ‎∈‎ {0.001، 0.003، 0.01}؛ الهدف ‎∈‎ {next، next-new}؛</w:t>
             </w:r>
             <w:r>
               <w:rPr>
@@ -48754,7 +48754,7 @@
               <w:rPr>
                 <w:rtl/>
               </w:rPr>
-              <w:t xml:space="preserve">شبكي كامل (≤ 20)</w:t>
+              <w:t xml:space="preserve">شبكي كامل (‎≤‎ 20)</w:t>
             </w:r>
           </w:p>
         </w:tc>
@@ -48788,7 +48788,7 @@
               <w:rPr>
                 <w:rtl/>
               </w:rPr>
-              <w:t xml:space="preserve">λ ∈ {0.001، 0.01، 0.1، 1، 10}</w:t>
+              <w:t xml:space="preserve">λ ‎∈‎ {0.001، 0.01، 0.1، 1، 10}</w:t>
             </w:r>
           </w:p>
         </w:tc>
@@ -48854,7 +48854,7 @@
               <w:rPr>
                 <w:rtl/>
               </w:rPr>
-              <w:t xml:space="preserve">العمق ∈ {2، 3، 4}؛ أدنى حجم ورقة ∈ {20، 50، 100}</w:t>
+              <w:t xml:space="preserve">العمق ‎∈‎ {2، 3، 4}؛ أدنى حجم ورقة ‎∈‎ {20، 50، 100}</w:t>
             </w:r>
           </w:p>
         </w:tc>
@@ -48920,7 +48920,7 @@
               <w:rPr>
                 <w:rtl/>
               </w:rPr>
-              <w:t xml:space="preserve">k ∈ [2..8]، 10 إعادات</w:t>
+              <w:t xml:space="preserve">k ‎∈‎ [2..8]، 10 إعادات</w:t>
             </w:r>
           </w:p>
         </w:tc>
@@ -49149,7 +49149,7 @@
               <w:rPr>
                 <w:rtl/>
               </w:rPr>
-              <w:t xml:space="preserve">قيم الجدول 19 بالضبط؛ الأوراكل = 1؛ العشوائي ≈ القيمة النظرية</w:t>
+              <w:t xml:space="preserve">قيم الجدول 19 بالضبط؛ الأوراكل = 1؛ العشوائي ‎≈‎ القيمة النظرية</w:t>
             </w:r>
           </w:p>
         </w:tc>
@@ -49899,7 +49899,7 @@
               <w:rPr>
                 <w:rtl/>
               </w:rPr>
-              <w:t xml:space="preserve">فصل خطي تام يعطي دقة ≈ 1؛ تبديل الوسوم يعطي AUC ≈ 0.5؛ تطابق مع الحل المغلق في حالة بعد واحد</w:t>
+              <w:t xml:space="preserve">فصل خطي تام يعطي دقة ‎≈‎ 1؛ تبديل الوسوم يعطي AUC ‎≈‎ 0.5؛ تطابق مع الحل المغلق في حالة بعد واحد</w:t>
             </w:r>
           </w:p>
         </w:tc>
@@ -50353,7 +50353,7 @@
               <w:rPr>
                 <w:rtl/>
               </w:rPr>
-              <w:t xml:space="preserve">≤ 56</w:t>
+              <w:t xml:space="preserve">‎≤‎ 56</w:t>
             </w:r>
           </w:p>
         </w:tc>
@@ -50385,7 +50385,7 @@
               <w:rPr>
                 <w:rtl/>
               </w:rPr>
-              <w:t xml:space="preserve">≤ 70</w:t>
+              <w:t xml:space="preserve">‎≤‎ 70</w:t>
             </w:r>
           </w:p>
         </w:tc>
@@ -50435,7 +50435,7 @@
               <w:rPr>
                 <w:rtl/>
               </w:rPr>
-              <w:t xml:space="preserve">≤ 112</w:t>
+              <w:t xml:space="preserve">‎≤‎ 112</w:t>
             </w:r>
           </w:p>
         </w:tc>
@@ -50467,7 +50467,7 @@
               <w:rPr>
                 <w:rtl/>
               </w:rPr>
-              <w:t xml:space="preserve">≤ 126</w:t>
+              <w:t xml:space="preserve">‎≤‎ 126</w:t>
             </w:r>
           </w:p>
         </w:tc>
@@ -50517,7 +50517,7 @@
               <w:rPr>
                 <w:rtl/>
               </w:rPr>
-              <w:t xml:space="preserve">≤ 168</w:t>
+              <w:t xml:space="preserve">‎≤‎ 168</w:t>
             </w:r>
           </w:p>
         </w:tc>
@@ -50549,7 +50549,7 @@
               <w:rPr>
                 <w:rtl/>
               </w:rPr>
-              <w:t xml:space="preserve">≤ 182</w:t>
+              <w:t xml:space="preserve">‎≤‎ 182</w:t>
             </w:r>
           </w:p>
         </w:tc>
@@ -51222,7 +51222,7 @@
         <w:rPr>
           <w:rtl/>
         </w:rPr>
-        <w:t xml:space="preserve">الربع الأدنى (n ≤ Q1، والتعادل عند الحد يدخل) من عدد موارد الكتالوج المختلفة في التدريب بين المقيَّمين في كل (عرض، أصل، مهمة)؛ وتُبلَّغ الحصة الفعلية (≈ 26.3% على التطوير) وعدد من لهم أقل من 5 موارد وحصتهم (≈ 0.7%) لكل زوج (D-28، D-45).</w:t>
+        <w:t xml:space="preserve">الربع الأدنى (n ‎≤‎ Q1، والتعادل عند الحد يدخل) من عدد موارد الكتالوج المختلفة في التدريب بين المقيَّمين في كل (عرض، أصل، مهمة)؛ وتُبلَّغ الحصة الفعلية (‎≈‎ 26.3% على التطوير) وعدد من لهم أقل من 5 موارد وحصتهم (‎≈‎ 0.7%) لكل زوج (D-28، D-45).</w:t>
       </w:r>
     </w:p>
     <w:p>
@@ -51247,7 +51247,7 @@
         <w:rPr>
           <w:rtl/>
         </w:rPr>
-        <w:t xml:space="preserve">لأن نحو نصف أزواج الاختبار إعادات (53–63% في فحص الزميل)، وخلطها يجعل Pop يبدو «شبه كامل» (HR@10 ≈ 0.999 مع التنقل والإعادات في الفحص نفسه). فالمهمة A هي ما يعنيه «التوصية» تربوياً: إرشاد المتعلم إلى ما لم يكتشفه.</w:t>
+        <w:t xml:space="preserve">لأن نحو نصف أزواج الاختبار إعادات (53–63% في فحص الزميل)، وخلطها يجعل Pop يبدو «شبه كامل» (HR@10 ‎≈‎ 0.999 مع التنقل والإعادات في الفحص نفسه). فالمهمة A هي ما يعنيه «التوصية» تربوياً: إرشاد المتعلم إلى ما لم يكتشفه.</w:t>
       </w:r>
     </w:p>
     <w:p>
@@ -55830,7 +55830,7 @@
         <w:rPr>
           <w:rtl/>
         </w:rPr>
-        <w:t xml:space="preserve">الفروق السابقة متوسطها 0.015. ومن بين 16 تركيبة إشارات تعطي أربع تركيبات متوسطاً مطلقاً ≥ 0.015 (±0.015 و±0.0175)، فـp = 4/16 = 0.25. فأربعة عروض لا تكفي لأي دلالة، إذ أصغر p ممكنة 2/16 = 0.125. أما مع 13 عرضاً فأصغر p ثنائية الطرف</w:t>
+        <w:t xml:space="preserve">الفروق السابقة متوسطها 0.015. ومن بين 16 تركيبة إشارات تعطي أربع تركيبات متوسطاً مطلقاً ‎≥‎ 0.015 (±0.015 و±0.0175)، فـp = 4/16 = 0.25. فأربعة عروض لا تكفي لأي دلالة، إذ أصغر p ممكنة 2/16 = 0.125. أما مع 13 عرضاً فأصغر p ثنائية الطرف</w:t>
       </w:r>
       <w:r>
         <w:rPr>
@@ -56357,7 +56357,7 @@
         <w:rPr>
           <w:rtl/>
         </w:rPr>
-        <w:t xml:space="preserve">نحو 5% نسبياً من مستوى Recent-Pop المتوقع على الموارد الجديدة (≈ 0.42 في فحص الزميل الاستكشافي)، وأكبر من فروق الضبط العشوائي المتوقعة. و</w:t>
+        <w:t xml:space="preserve">نحو 5% نسبياً من مستوى Recent-Pop المتوقع على الموارد الجديدة (‎≈‎ 0.42 في فحص الزميل الاستكشافي)، وأكبر من فروق الضبط العشوائي المتوقعة. و</w:t>
       </w:r>
       <w:r>
         <w:rPr>
@@ -56804,7 +56804,7 @@
               <w:rPr>
                 <w:rtl/>
               </w:rPr>
-              <w:t xml:space="preserve">الصف 1: الأثر ≥ δ، والحد الأدنى &gt; 0، وp &lt; 0.05</w:t>
+              <w:t xml:space="preserve">الصف 1: الأثر ‎≥‎ δ، والحد الأدنى ‎&gt;‎ 0، وp ‎&lt;‎ 0.05</w:t>
             </w:r>
           </w:p>
         </w:tc>
@@ -56902,7 +56902,7 @@
               <w:rPr>
                 <w:rtl/>
               </w:rPr>
-              <w:t xml:space="preserve">الصف 3: الحد الأعلى 0.015 &lt; δ = 0.02، فاستُبعد أثر ≥ δ</w:t>
+              <w:t xml:space="preserve">الصف 3: الحد الأعلى 0.015 ‎&lt;‎ δ = 0.02، فاستُبعد أثر ‎≥‎ δ</w:t>
             </w:r>
           </w:p>
         </w:tc>
@@ -57098,7 +57098,7 @@
               <w:rPr>
                 <w:rtl/>
               </w:rPr>
-              <w:t xml:space="preserve">الصف 4: الأثر ≥ δ والفاصل موجب، لكن p بعد Holm ≥ 0.05؛ + وصف MDE80 نفسه</w:t>
+              <w:t xml:space="preserve">الصف 4: الأثر ‎≥‎ δ والفاصل موجب، لكن p بعد Holm ‎≥‎ 0.05؛ + وصف MDE80 نفسه</w:t>
             </w:r>
           </w:p>
         </w:tc>
@@ -57196,7 +57196,7 @@
               <w:rPr>
                 <w:rtl/>
               </w:rPr>
-              <w:t xml:space="preserve">الصف 2: الحد الأعلى &lt; 0، فخط الأساس أفضل (نتيجة رئيسية بحسب D-16)</w:t>
+              <w:t xml:space="preserve">الصف 2: الحد الأعلى ‎&lt;‎ 0، فخط الأساس أفضل (نتيجة رئيسية بحسب D-16)</w:t>
             </w:r>
           </w:p>
         </w:tc>
@@ -57294,7 +57294,7 @@
               <w:rPr>
                 <w:rtl/>
               </w:rPr>
-              <w:t xml:space="preserve">الصف 1؛ والحد الأدنى 0.024 &gt; δ فيُضاف الوصف «بهامش» دون تغيير الحكم</w:t>
+              <w:t xml:space="preserve">الصف 1؛ والحد الأدنى 0.024 ‎&gt;‎ δ فيُضاف الوصف «بهامش» دون تغيير الحكم</w:t>
             </w:r>
           </w:p>
         </w:tc>
@@ -57709,7 +57709,7 @@
         <w:rPr>
           <w:rtl/>
         </w:rPr>
-        <w:t xml:space="preserve">لا يغير أي درجة في مرحلة الضبط؛ والمرتِّب الكامل (oracle) يعطي NDCG = 1؛ والعشوائي يعطي ≈ K/N في HR.</w:t>
+        <w:t xml:space="preserve">لا يغير أي درجة في مرحلة الضبط؛ والمرتِّب الكامل (oracle) يعطي NDCG = 1؛ والعشوائي يعطي ‎≈‎ K/N في HR.</w:t>
       </w:r>
     </w:p>
     <w:bookmarkEnd w:id="95"/>
@@ -58054,7 +58054,7 @@
               <w:rPr>
                 <w:rtl/>
               </w:rPr>
-              <w:t xml:space="preserve">E∖{page}، أي إعادة page إلى الكتالوج</w:t>
+              <w:t xml:space="preserve">E‎∖‎{page}، أي إعادة page إلى الكتالوج</w:t>
             </w:r>
           </w:p>
         </w:tc>
@@ -58186,7 +58186,7 @@
               <w:rPr>
                 <w:rtl/>
               </w:rPr>
-              <w:t xml:space="preserve">L0 ⊂ L1 ⊂ L2 ⊂ L3</w:t>
+              <w:t xml:space="preserve">L0 ‎⊂‎ L1 ‎⊂‎ L2 ‎⊂‎ L3</w:t>
             </w:r>
           </w:p>
         </w:tc>
@@ -58350,7 +58350,7 @@
               <w:rPr>
                 <w:rtl/>
               </w:rPr>
-              <w:t xml:space="preserve">أثر عدم استقلال عروض المقرر الواحد؛ للمتانة لا للحكم، لأن أصغر p ممكنة على 7 مقررات = 2/128 = 0.0156 &gt; 0.0125 (D-31)</w:t>
+              <w:t xml:space="preserve">أثر عدم استقلال عروض المقرر الواحد؛ للمتانة لا للحكم، لأن أصغر p ممكنة على 7 مقررات = 2/128 = 0.0156 ‎&gt;‎ 0.0125 (D-31)</w:t>
             </w:r>
           </w:p>
         </w:tc>
@@ -60170,7 +60170,7 @@
               <w:rPr>
                 <w:rtl/>
               </w:rPr>
-              <w:t xml:space="preserve">ثنائية ⊂ أيام ⊂ حداثة ⊂ شدة</w:t>
+              <w:t xml:space="preserve">ثنائية ‎⊂‎ أيام ‎⊂‎ حداثة ‎⊂‎ شدة</w:t>
             </w:r>
           </w:p>
         </w:tc>
@@ -62302,7 +62302,7 @@
               <w:rPr>
                 <w:rtl/>
               </w:rPr>
-              <w:t xml:space="preserve">ضبط أوزان الهجين بخطوة 1/4 أو 1/3 (≤ 20 نقطة؛ D-29)</w:t>
+              <w:t xml:space="preserve">ضبط أوزان الهجين بخطوة 1/4 أو 1/3 (‎≤‎ 20 نقطة؛ D-29)</w:t>
             </w:r>
           </w:p>
         </w:tc>
@@ -64156,7 +64156,7 @@
               <w:rPr>
                 <w:rtl/>
               </w:rPr>
-              <w:t xml:space="preserve">تدريب ≤ 70، اختبار (70، 84]</w:t>
+              <w:t xml:space="preserve">تدريب ‎≤‎ 70، اختبار (70، 84]</w:t>
             </w:r>
           </w:p>
         </w:tc>
@@ -65236,7 +65236,7 @@
               <w:rPr>
                 <w:rtl/>
               </w:rPr>
-              <w:t xml:space="preserve">الربع الأدنى من الموارد المختلفة في التدريب (و«&lt; 5» وصفاً)</w:t>
+              <w:t xml:space="preserve">الربع الأدنى من الموارد المختلفة في التدريب (و«‎&lt;‎ 5» وصفاً)</w:t>
             </w:r>
           </w:p>
         </w:tc>
@@ -65642,7 +65642,7 @@
               <w:rPr>
                 <w:rtl/>
               </w:rPr>
-              <w:t xml:space="preserve">«مؤكَّدة بهامش» إن كان الحد الأدنى &gt; δ</w:t>
+              <w:t xml:space="preserve">«مؤكَّدة بهامش» إن كان الحد الأدنى ‎&gt;‎ δ</w:t>
             </w:r>
           </w:p>
         </w:tc>
@@ -65954,7 +65954,7 @@
               <w:rPr>
                 <w:rtl/>
               </w:rPr>
-              <w:t xml:space="preserve">أصغر أثر حقيقي يُؤكَّد باحتمال ≥ 0.8 تحت القاعدة</w:t>
+              <w:t xml:space="preserve">أصغر أثر حقيقي يُؤكَّد باحتمال ‎≥‎ 0.8 تحت القاعدة</w:t>
             </w:r>
           </w:p>
         </w:tc>
@@ -66888,23 +66888,23 @@
               <w:rPr>
                 <w:rtl/>
               </w:rPr>
-              <w:t xml:space="preserve">كسب 0.163 للتقسيم «الأيام ≤ 10»</w:t>
-            </w:r>
-          </w:p>
-        </w:tc>
-        <w:tc>
-          <w:tcPr/>
-          <w:p>
-            <w:pPr>
-              <w:pStyle w:val="Compact"/>
-              <w:bidi w:val="1"/>
-              <w:jc w:val="left"/>
-            </w:pPr>
-            <w:r>
-              <w:rPr>
-                <w:rtl/>
-              </w:rPr>
-              <w:t xml:space="preserve">مصنِّف تفسيري بعمق ≤ 4</w:t>
+              <w:t xml:space="preserve">كسب 0.163 للتقسيم «الأيام ‎≤‎ 10»</w:t>
+            </w:r>
+          </w:p>
+        </w:tc>
+        <w:tc>
+          <w:tcPr/>
+          <w:p>
+            <w:pPr>
+              <w:pStyle w:val="Compact"/>
+              <w:bidi w:val="1"/>
+              <w:jc w:val="left"/>
+            </w:pPr>
+            <w:r>
+              <w:rPr>
+                <w:rtl/>
+              </w:rPr>
+              <w:t xml:space="preserve">مصنِّف تفسيري بعمق ‎≤‎ 4</w:t>
             </w:r>
           </w:p>
         </w:tc>
@@ -69113,7 +69113,7 @@
               <w:rPr>
                 <w:rtl/>
               </w:rPr>
-              <w:t xml:space="preserve">جداول EDA: الذيل الطويل، والإعادات، والتنقل، والأهداف غير القابلة للوصول، وأعداد «&lt; 5 موارد»</w:t>
+              <w:t xml:space="preserve">جداول EDA: الذيل الطويل، والإعادات، والتنقل، والأهداف غير القابلة للوصول، وأعداد «‎&lt;‎ 5 موارد»</w:t>
             </w:r>
           </w:p>
         </w:tc>
@@ -69179,7 +69179,7 @@
               <w:rPr>
                 <w:rtl/>
               </w:rPr>
-              <w:t xml:space="preserve">NDCG = 1 للأوراكل، HR ≈ المتوقع للعشوائي؛ تغطية bootstrap-t</w:t>
+              <w:t xml:space="preserve">NDCG = 1 للأوراكل، HR ‎≈‎ المتوقع للعشوائي؛ تغطية bootstrap-t</w:t>
             </w:r>
           </w:p>
         </w:tc>
@@ -69245,7 +69245,7 @@
               <w:rPr>
                 <w:rtl/>
               </w:rPr>
-              <w:t xml:space="preserve">B1–B10 بميزانية ≤ 20، ونوافذ اختبار 2013</w:t>
+              <w:t xml:space="preserve">B1–B10 بميزانية ‎≤‎ 20، ونوافذ اختبار 2013</w:t>
             </w:r>
           </w:p>
         </w:tc>
@@ -69930,7 +69930,7 @@
               <w:rPr>
                 <w:rtl/>
               </w:rPr>
-              <w:t xml:space="preserve">التركيبة المجمَّدة HYB* (≤ 4)</w:t>
+              <w:t xml:space="preserve">التركيبة المجمَّدة HYB* (‎≤‎ 4)</w:t>
             </w:r>
           </w:p>
         </w:tc>
@@ -70532,7 +70532,7 @@
         <w:rPr>
           <w:rtl/>
         </w:rPr>
-        <w:t xml:space="preserve">الجدول 17-ج (≤ 8 ساعات CPU لتشغيل التطوير الرسمي الكامل، و≤ 8 ساعات CPU لـE10؛ الضبط ببذرة واحدة والتقرير بخمس؛ وسلّم التقليص المسجل).</w:t>
+        <w:t xml:space="preserve">الجدول 17-ج (‎≤‎ 8 ساعات CPU لتشغيل التطوير الرسمي الكامل، و‎≤‎ 8 ساعات CPU لـE10؛ الضبط ببذرة واحدة والتقرير بخمس؛ وسلّم التقليص المسجل).</w:t>
       </w:r>
     </w:p>
     <w:bookmarkEnd w:id="100"/>
@@ -70974,7 +70974,7 @@
         <w:rPr>
           <w:rtl/>
         </w:rPr>
-        <w:t xml:space="preserve">(الجدول 2-ب) من زوجها الفعلي على نوافذ اختبار 2013، وحالة بند MDE80 &gt; 2δ محسومة لكل فرضية (D-25، D-46، D-48).</w:t>
+        <w:t xml:space="preserve">(الجدول 2-ب) من زوجها الفعلي على نوافذ اختبار 2013، وحالة بند MDE80 ‎&gt;‎ 2δ محسومة لكل فرضية (D-25، D-46، D-48).</w:t>
       </w:r>
     </w:p>
     <w:p>
@@ -71120,7 +71120,7 @@
         <w:rPr>
           <w:rtl/>
         </w:rPr>
-        <w:t xml:space="preserve">☐ تركيبة الهجين (≤ 4 مكوّنات)، وأوزانها الابتدائية، وفضاءات كل المعاملات (بما فيها τ وβ وα وشبكة السمبلكس) مثبتة في ملفات إعداد.</w:t>
+        <w:t xml:space="preserve">☐ تركيبة الهجين (‎≤‎ 4 مكوّنات)، وأوزانها الابتدائية، وفضاءات كل المعاملات (بما فيها τ وβ وα وشبكة السمبلكس) مثبتة في ملفات إعداد.</w:t>
       </w:r>
     </w:p>
     <w:p>
@@ -71537,7 +71537,7 @@
               <w:rPr>
                 <w:rtl/>
               </w:rPr>
-              <w:t xml:space="preserve">ميزانية ≤ 20 للجميع بما فيها أوزان الهجين؛ خمس نوافذ لـRecent-Pop؛ SKNN بلا سلال المستعلِم؛ EASE مرجعياً</w:t>
+              <w:t xml:space="preserve">ميزانية ‎≤‎ 20 للجميع بما فيها أوزان الهجين؛ خمس نوافذ لـRecent-Pop؛ SKNN بلا سلال المستعلِم؛ EASE مرجعياً</w:t>
             </w:r>
           </w:p>
         </w:tc>
@@ -71587,7 +71587,7 @@
               <w:rPr>
                 <w:rtl/>
               </w:rPr>
-              <w:t xml:space="preserve">شبكة ≤ 20 نقطة؛ فجوة التفاؤل مبلَّغة؛ الرفع في القبول خارج العينة على نوافذ اختبار 2013؛ ≤ 4 مكوّنات؛ تجميد ثم تأكيد على سنة مستقلة</w:t>
+              <w:t xml:space="preserve">شبكة ‎≤‎ 20 نقطة؛ فجوة التفاؤل مبلَّغة؛ الرفع في القبول خارج العينة على نوافذ اختبار 2013؛ ‎≤‎ 4 مكوّنات؛ تجميد ثم تأكيد على سنة مستقلة</w:t>
             </w:r>
           </w:p>
         </w:tc>
@@ -71837,7 +71837,7 @@
               <w:rPr>
                 <w:rtl/>
               </w:rPr>
-              <w:t xml:space="preserve">حساسية E∖{page} وبلا استبعاد</w:t>
+              <w:t xml:space="preserve">حساسية E‎∖‎{page} وبلا استبعاد</w:t>
             </w:r>
           </w:p>
         </w:tc>
@@ -71937,7 +71937,7 @@
               <w:rPr>
                 <w:rtl/>
               </w:rPr>
-              <w:t xml:space="preserve">التسمية الصادقة؛ عدّ «&lt; 5» وصفاً؛ H4-ب استكشافية</w:t>
+              <w:t xml:space="preserve">التسمية الصادقة؛ عدّ «‎&lt;‎ 5» وصفاً؛ H4-ب استكشافية</w:t>
             </w:r>
           </w:p>
         </w:tc>
@@ -72428,7 +72428,7 @@
         <w:rPr>
           <w:rtl/>
         </w:rPr>
-        <w:t xml:space="preserve">(1) CBF ضعيف بنيوياً على OULAD لغياب النصوص؛ (2) GRU-lite ضحل بطبقة واحدة، و«الشبكات العميقة» معدَّلة بقرار (D-18)؛ (3) لا تقييم بشري للواجهة ولا للتفسير (D-22)؛ (4) الأدوات بديلة عن TensorFlow وscikit-learn بقيد بيئي موثق (ADR-003)؛ (5) قيمة MD5 المرجعية لـOULAD من طرف ثالث (D-08)؛ (6) التفسير لمكوّن GRU عام وغير شفاف؛ (7) GRU-lite بلا ميزات زمنية، والسياق الزمني وظيفة المكوّن (1) (D-35)؛ (8) RQ4-ب يُجاب وصفياً، وδ_AUC اتفاقي معلن؛ (9) واجهة إعادة التشغيل توضيحية: تستعمل معاملات أقرب قطع ≤ t، ولا يُستخرج منها رقم تقييم (D-49)؛ (10) MDE80 التوضيحي على التطوير ≈ 0.053 &gt; 2δ، فـ«غير حاسمة» متوقعة لبعض الفرضيات، وتُوصف بنص D-48.</w:t>
+        <w:t xml:space="preserve">(1) CBF ضعيف بنيوياً على OULAD لغياب النصوص؛ (2) GRU-lite ضحل بطبقة واحدة، و«الشبكات العميقة» معدَّلة بقرار (D-18)؛ (3) لا تقييم بشري للواجهة ولا للتفسير (D-22)؛ (4) الأدوات بديلة عن TensorFlow وscikit-learn بقيد بيئي موثق (ADR-003)؛ (5) قيمة MD5 المرجعية لـOULAD من طرف ثالث (D-08)؛ (6) التفسير لمكوّن GRU عام وغير شفاف؛ (7) GRU-lite بلا ميزات زمنية، والسياق الزمني وظيفة المكوّن (1) (D-35)؛ (8) RQ4-ب يُجاب وصفياً، وδ_AUC اتفاقي معلن؛ (9) واجهة إعادة التشغيل توضيحية: تستعمل معاملات أقرب قطع ‎≤‎ t، ولا يُستخرج منها رقم تقييم (D-49)؛ (10) MDE80 التوضيحي على التطوير ‎≈‎ 0.053 ‎&gt;‎ 2δ، فـ«غير حاسمة» متوقعة لبعض الفرضيات، وتُوصف بنص D-48.</w:t>
       </w:r>
     </w:p>
     <w:bookmarkEnd w:id="104"/>
@@ -72629,7 +72629,7 @@
               <w:rPr>
                 <w:rtl/>
               </w:rPr>
-              <w:t xml:space="preserve">D-29: السمبلكس بخطوة 1/4 و1/3 (≤ 20 نقطة)؛ B3 بخمس نوافذ؛ فجوة التفاؤل</w:t>
+              <w:t xml:space="preserve">D-29: السمبلكس بخطوة 1/4 و1/3 (‎≤‎ 20 نقطة)؛ B3 بخمس نوافذ؛ فجوة التفاؤل</w:t>
             </w:r>
           </w:p>
         </w:tc>
@@ -72765,7 +72765,7 @@
               <w:rPr>
                 <w:rtl/>
               </w:rPr>
-              <w:t xml:space="preserve">D-30: الرفع والاختيار البنيوي على نوافذ اختبار 2013؛ أرضية الشخصنة؛ B_np* ∈ {B1، B2، B3}</w:t>
+              <w:t xml:space="preserve">D-30: الرفع والاختيار البنيوي على نوافذ اختبار 2013؛ أرضية الشخصنة؛ B_np* ‎∈‎ {B1، B2، B3}</w:t>
             </w:r>
           </w:p>
         </w:tc>
@@ -72999,7 +72999,7 @@
               <w:rPr>
                 <w:rtl/>
               </w:rPr>
-              <w:t xml:space="preserve">D-34: بذرة للضبط وخمس للتقرير، مع ميزانية ≤ 8 ساعات CPU</w:t>
+              <w:t xml:space="preserve">D-34: بذرة للضبط وخمس للتقرير، مع ميزانية ‎≤‎ 8 ساعات CPU</w:t>
             </w:r>
           </w:p>
         </w:tc>
@@ -73443,7 +73443,7 @@
               <w:rPr>
                 <w:rtl/>
               </w:rPr>
-              <w:t xml:space="preserve">شريحة «قليلي التاريخ» n ≤ Q1، والحصة الفعلية (≈ 26.3%) تُبلَّغ</w:t>
+              <w:t xml:space="preserve">شريحة «قليلي التاريخ» n ‎≤‎ Q1، والحصة الفعلية (‎≈‎ 26.3%) تُبلَّغ</w:t>
             </w:r>
           </w:p>
         </w:tc>
@@ -73618,7 +73618,7 @@
               <w:rPr>
                 <w:rtl/>
               </w:rPr>
-              <w:t xml:space="preserve">δ يبقى؛ وصف مسجل يُلحق بـ«غير حاسمة»؛ بند MDE80 &gt; 2δ مفعَّل مؤقتاً</w:t>
+              <w:t xml:space="preserve">δ يبقى؛ وصف مسجل يُلحق بـ«غير حاسمة»؛ بند MDE80 ‎&gt;‎ 2δ مفعَّل مؤقتاً</w:t>
             </w:r>
           </w:p>
         </w:tc>

</xml_diff>

<commit_message>
Hypotheses doc: frozen H1 values (sigma, delta, MDE80) and HYB* dev performance filled (freeze condition 9); Word rebuilt
Co-Authored-By: Claude Fable 5.1 <noreply@anthropic.com>
Claude-Session: https://claude.ai/code/session_01Y5Ccgz17Pq2brpK5TTSYa7
</commit_message>
<xml_diff>
--- a/deliverables/02-hypotheses-algorithms/الفرضيات-والخوارزميات.docx
+++ b/deliverables/02-hypotheses-algorithms/الفرضيات-والخوارزميات.docx
@@ -253,7 +253,7 @@
           <w:rStyle w:val="VerbatimChar"/>
           <w:rtl/>
         </w:rPr>
-        <w:t xml:space="preserve">docs/meetings/2026-10-24-review-hypotheses-algorithms.md</w:t>
+        <w:t xml:space="preserve">‎docs/meetings/2026-10-24-review-hypotheses-algorithms.md‎</w:t>
       </w:r>
       <w:r>
         <w:rPr>
@@ -404,7 +404,7 @@
           <w:rStyle w:val="VerbatimChar"/>
           <w:rtl/>
         </w:rPr>
-        <w:t xml:space="preserve">src/</w:t>
+        <w:t xml:space="preserve">‎src/‎</w:t>
       </w:r>
       <w:r>
         <w:rPr>
@@ -867,7 +867,7 @@
                 <w:rStyle w:val="VerbatimChar"/>
                 <w:rtl/>
               </w:rPr>
-              <w:t xml:space="preserve">studentVle</w:t>
+              <w:t xml:space="preserve">‎studentVle‎</w:t>
             </w:r>
             <w:r>
               <w:rPr>
@@ -1444,7 +1444,7 @@
           <w:rStyle w:val="VerbatimChar"/>
           <w:rtl/>
         </w:rPr>
-        <w:t xml:space="preserve">FFF_2013J</w:t>
+        <w:t xml:space="preserve">‎FFF_2013J‎</w:t>
       </w:r>
       <w:r>
         <w:rPr>
@@ -1487,7 +1487,7 @@
           <w:rStyle w:val="VerbatimChar"/>
           <w:rtl/>
         </w:rPr>
-        <w:t xml:space="preserve">code_module, code_presentation, id_student</w:t>
+        <w:t xml:space="preserve">‎code_module, code_presentation, id_student‎</w:t>
       </w:r>
       <w:r>
         <w:rPr>
@@ -1530,7 +1530,7 @@
           <w:rStyle w:val="VerbatimChar"/>
           <w:rtl/>
         </w:rPr>
-        <w:t xml:space="preserve">id_site</w:t>
+        <w:t xml:space="preserve">‎id_site‎</w:t>
       </w:r>
       <w:r>
         <w:rPr>
@@ -3405,7 +3405,7 @@
           <w:rStyle w:val="VerbatimChar"/>
           <w:rtl/>
         </w:rPr>
-        <w:t xml:space="preserve">src/</w:t>
+        <w:t xml:space="preserve">‎src/‎</w:t>
       </w:r>
       <w:r>
         <w:rPr>
@@ -4101,7 +4101,7 @@
           <w:rStyle w:val="VerbatimChar"/>
           <w:rtl/>
         </w:rPr>
-        <w:t xml:space="preserve">stats.mde80</w:t>
+        <w:t xml:space="preserve">‎stats.mde80‎</w:t>
       </w:r>
       <w:r>
         <w:rPr>
@@ -4139,7 +4139,26 @@
         <w:rPr>
           <w:rtl/>
         </w:rPr>
-        <w:t xml:space="preserve">(كُتب في الاجتماع 03، D-61؛ وخانة H1 تُعاد بعد تطبيق D-51)، مع التنبيه إلى أن σ المقدَّر من 9 وحدات تقريبي. ولا يُعدَّل δ ولا القاعدة بناءً عليه.</w:t>
+        <w:t xml:space="preserve">(كُتب في الاجتماع 03، D-61؛ وأُعيدت خانة H1 بعد تطبيق D-51 من</w:t>
+      </w:r>
+      <w:r>
+        <w:rPr>
+          <w:rtl/>
+        </w:rPr>
+        <w:t xml:space="preserve"> </w:t>
+      </w:r>
+      <w:r>
+        <w:rPr>
+          <w:rStyle w:val="VerbatimChar"/>
+          <w:rtl/>
+        </w:rPr>
+        <w:t xml:space="preserve">‎mde80.json‎</w:t>
+      </w:r>
+      <w:r>
+        <w:rPr>
+          <w:rtl/>
+        </w:rPr>
+        <w:t xml:space="preserve">)، مع التنبيه إلى أن σ المقدَّر من 9 وحدات تقريبي. ولا يُعدَّل δ ولا القاعدة بناءً عليه.</w:t>
       </w:r>
     </w:p>
     <w:p>
@@ -4207,7 +4226,7 @@
           <w:bCs/>
           <w:b/>
         </w:rPr>
-        <w:t xml:space="preserve">stats.mde80</w:t>
+        <w:t xml:space="preserve">‎stats.mde80‎</w:t>
       </w:r>
       <w:r>
         <w:rPr>
@@ -4496,23 +4515,23 @@
               <w:rPr>
                 <w:rtl/>
               </w:rPr>
-              <w:t xml:space="preserve">[تُعاد بعد D-51]</w:t>
-            </w:r>
-          </w:p>
-        </w:tc>
-        <w:tc>
-          <w:tcPr/>
-          <w:p>
-            <w:pPr>
-              <w:pStyle w:val="Compact"/>
-              <w:bidi w:val="1"/>
-              <w:jc w:val="left"/>
-            </w:pPr>
-            <w:r>
-              <w:rPr>
-                <w:rtl/>
-              </w:rPr>
-              <w:t xml:space="preserve">[تُعاد بعد D-51]</w:t>
+              <w:t xml:space="preserve">0.0336</w:t>
+            </w:r>
+          </w:p>
+        </w:tc>
+        <w:tc>
+          <w:tcPr/>
+          <w:p>
+            <w:pPr>
+              <w:pStyle w:val="Compact"/>
+              <w:bidi w:val="1"/>
+              <w:jc w:val="left"/>
+            </w:pPr>
+            <w:r>
+              <w:rPr>
+                <w:rtl/>
+              </w:rPr>
+              <w:t xml:space="preserve">+0.0196</w:t>
             </w:r>
           </w:p>
         </w:tc>
@@ -4530,39 +4549,39 @@
                 <w:bCs/>
                 <w:b/>
               </w:rPr>
-              <w:t xml:space="preserve">[تُعاد بعد D-51]</w:t>
-            </w:r>
-          </w:p>
-        </w:tc>
-        <w:tc>
-          <w:tcPr/>
-          <w:p>
-            <w:pPr>
-              <w:pStyle w:val="Compact"/>
-              <w:bidi w:val="1"/>
-              <w:jc w:val="left"/>
-            </w:pPr>
-            <w:r>
-              <w:rPr>
-                <w:rtl/>
-              </w:rPr>
-              <w:t xml:space="preserve">[تُعاد بعد D-51]</w:t>
-            </w:r>
-          </w:p>
-        </w:tc>
-        <w:tc>
-          <w:tcPr/>
-          <w:p>
-            <w:pPr>
-              <w:pStyle w:val="Compact"/>
-              <w:bidi w:val="1"/>
-              <w:jc w:val="left"/>
-            </w:pPr>
-            <w:r>
-              <w:rPr>
-                <w:rtl/>
-              </w:rPr>
-              <w:t xml:space="preserve">[تُعاد بعد D-51]</w:t>
+              <w:t xml:space="preserve">0.0375</w:t>
+            </w:r>
+          </w:p>
+        </w:tc>
+        <w:tc>
+          <w:tcPr/>
+          <w:p>
+            <w:pPr>
+              <w:pStyle w:val="Compact"/>
+              <w:bidi w:val="1"/>
+              <w:jc w:val="left"/>
+            </w:pPr>
+            <w:r>
+              <w:rPr>
+                <w:rtl/>
+              </w:rPr>
+              <w:t xml:space="preserve">1.87</w:t>
+            </w:r>
+          </w:p>
+        </w:tc>
+        <w:tc>
+          <w:tcPr/>
+          <w:p>
+            <w:pPr>
+              <w:pStyle w:val="Compact"/>
+              <w:bidi w:val="1"/>
+              <w:jc w:val="left"/>
+            </w:pPr>
+            <w:r>
+              <w:rPr>
+                <w:rtl/>
+              </w:rPr>
+              <w:t xml:space="preserve">غير مفعَّل</w:t>
             </w:r>
           </w:p>
         </w:tc>
@@ -7731,7 +7750,7 @@
           <w:rStyle w:val="VerbatimChar"/>
           <w:rtl/>
         </w:rPr>
-        <w:t xml:space="preserve">num_of_prev_attempts</w:t>
+        <w:t xml:space="preserve">‎num_of_prev_attempts‎</w:t>
       </w:r>
       <w:r>
         <w:rPr>
@@ -7744,7 +7763,7 @@
           <w:rStyle w:val="VerbatimChar"/>
           <w:rtl/>
         </w:rPr>
-        <w:t xml:space="preserve">studied_credits</w:t>
+        <w:t xml:space="preserve">‎studied_credits‎</w:t>
       </w:r>
       <w:r>
         <w:rPr>
@@ -7757,7 +7776,7 @@
           <w:rStyle w:val="VerbatimChar"/>
           <w:rtl/>
         </w:rPr>
-        <w:t xml:space="preserve">date_registration</w:t>
+        <w:t xml:space="preserve">‎date_registration‎</w:t>
       </w:r>
       <w:r>
         <w:rPr>
@@ -8016,7 +8035,7 @@
           <w:rStyle w:val="VerbatimChar"/>
           <w:rtl/>
         </w:rPr>
-        <w:t xml:space="preserve">id_student</w:t>
+        <w:t xml:space="preserve">‎id_student‎</w:t>
       </w:r>
       <w:r>
         <w:rPr>
@@ -8061,7 +8080,7 @@
           <w:rStyle w:val="VerbatimChar"/>
           <w:rtl/>
         </w:rPr>
-        <w:t xml:space="preserve">studentRegistration.csv</w:t>
+        <w:t xml:space="preserve">‎studentRegistration.csv‎</w:t>
       </w:r>
       <w:r>
         <w:rPr>
@@ -8086,7 +8105,7 @@
           <w:rStyle w:val="VerbatimChar"/>
           <w:rtl/>
         </w:rPr>
-        <w:t xml:space="preserve">code_module, code_presentation, id_student</w:t>
+        <w:t xml:space="preserve">‎code_module, code_presentation, id_student‎</w:t>
       </w:r>
       <w:r>
         <w:rPr>
@@ -8105,7 +8124,7 @@
           <w:rStyle w:val="VerbatimChar"/>
           <w:rtl/>
         </w:rPr>
-        <w:t xml:space="preserve">usecols</w:t>
+        <w:t xml:space="preserve">‎usecols‎</w:t>
       </w:r>
       <w:r>
         <w:rPr>
@@ -8124,7 +8143,7 @@
           <w:rStyle w:val="VerbatimChar"/>
           <w:rtl/>
         </w:rPr>
-        <w:t xml:space="preserve">date_registration</w:t>
+        <w:t xml:space="preserve">‎date_registration‎</w:t>
       </w:r>
       <w:r>
         <w:rPr>
@@ -8149,7 +8168,7 @@
           <w:rStyle w:val="VerbatimChar"/>
           <w:rtl/>
         </w:rPr>
-        <w:t xml:space="preserve">date_unregistration</w:t>
+        <w:t xml:space="preserve">‎date_unregistration‎</w:t>
       </w:r>
       <w:r>
         <w:rPr>
@@ -8168,7 +8187,7 @@
           <w:rStyle w:val="VerbatimChar"/>
           <w:rtl/>
         </w:rPr>
-        <w:t xml:space="preserve">results/access_log.jsonl</w:t>
+        <w:t xml:space="preserve">‎results/access_log.jsonl‎</w:t>
       </w:r>
       <w:r>
         <w:rPr>
@@ -9305,7 +9324,7 @@
           <w:rStyle w:val="VerbatimChar"/>
           <w:rtl/>
         </w:rPr>
-        <w:t xml:space="preserve">gender, disability, imd_band, age_band</w:t>
+        <w:t xml:space="preserve">‎gender, disability, imd_band, age_band‎</w:t>
       </w:r>
       <w:r>
         <w:rPr>
@@ -11533,7 +11552,7 @@
                 <w:rStyle w:val="VerbatimChar"/>
                 <w:rtl/>
               </w:rPr>
-              <w:t xml:space="preserve">studentVle</w:t>
+              <w:t xml:space="preserve">‎studentVle‎</w:t>
             </w:r>
           </w:p>
         </w:tc>
@@ -11550,7 +11569,7 @@
                 <w:rStyle w:val="VerbatimChar"/>
                 <w:rtl/>
               </w:rPr>
-              <w:t xml:space="preserve">code_module, code_presentation, id_student, id_site, date, sum_click</w:t>
+              <w:t xml:space="preserve">‎code_module, code_presentation, id_student, id_site, date, sum_click‎</w:t>
             </w:r>
           </w:p>
         </w:tc>
@@ -11601,7 +11620,7 @@
                 <w:rStyle w:val="VerbatimChar"/>
                 <w:rtl/>
               </w:rPr>
-              <w:t xml:space="preserve">vle</w:t>
+              <w:t xml:space="preserve">‎vle‎</w:t>
             </w:r>
           </w:p>
         </w:tc>
@@ -11618,7 +11637,7 @@
                 <w:rStyle w:val="VerbatimChar"/>
                 <w:rtl/>
               </w:rPr>
-              <w:t xml:space="preserve">id_site, code_module, code_presentation, activity_type, week_from, week_to</w:t>
+              <w:t xml:space="preserve">‎id_site, code_module, code_presentation, activity_type, week_from, week_to‎</w:t>
             </w:r>
           </w:p>
         </w:tc>
@@ -11669,7 +11688,7 @@
                 <w:rStyle w:val="VerbatimChar"/>
                 <w:rtl/>
               </w:rPr>
-              <w:t xml:space="preserve">assessments</w:t>
+              <w:t xml:space="preserve">‎assessments‎</w:t>
             </w:r>
           </w:p>
         </w:tc>
@@ -11686,7 +11705,7 @@
                 <w:rStyle w:val="VerbatimChar"/>
                 <w:rtl/>
               </w:rPr>
-              <w:t xml:space="preserve">code_module, code_presentation, id_assessment, assessment_type, date, weight</w:t>
+              <w:t xml:space="preserve">‎code_module, code_presentation, id_assessment, assessment_type, date, weight‎</w:t>
             </w:r>
           </w:p>
         </w:tc>
@@ -11737,7 +11756,7 @@
                 <w:rStyle w:val="VerbatimChar"/>
                 <w:rtl/>
               </w:rPr>
-              <w:t xml:space="preserve">studentAssessment</w:t>
+              <w:t xml:space="preserve">‎studentAssessment‎</w:t>
             </w:r>
           </w:p>
         </w:tc>
@@ -11754,7 +11773,7 @@
                 <w:rStyle w:val="VerbatimChar"/>
                 <w:rtl/>
               </w:rPr>
-              <w:t xml:space="preserve">id_assessment, id_student, date_submitted, score, is_banked</w:t>
+              <w:t xml:space="preserve">‎id_assessment, id_student, date_submitted, score, is_banked‎</w:t>
             </w:r>
           </w:p>
         </w:tc>
@@ -11805,7 +11824,7 @@
                 <w:rStyle w:val="VerbatimChar"/>
                 <w:rtl/>
               </w:rPr>
-              <w:t xml:space="preserve">studentRegistration</w:t>
+              <w:t xml:space="preserve">‎studentRegistration‎</w:t>
             </w:r>
           </w:p>
         </w:tc>
@@ -11822,7 +11841,7 @@
                 <w:rStyle w:val="VerbatimChar"/>
                 <w:rtl/>
               </w:rPr>
-              <w:t xml:space="preserve">date_registration, date_unregistration</w:t>
+              <w:t xml:space="preserve">‎date_registration, date_unregistration‎</w:t>
             </w:r>
           </w:p>
         </w:tc>
@@ -11873,7 +11892,7 @@
                 <w:rStyle w:val="VerbatimChar"/>
                 <w:rtl/>
               </w:rPr>
-              <w:t xml:space="preserve">studentInfo</w:t>
+              <w:t xml:space="preserve">‎studentInfo‎</w:t>
             </w:r>
           </w:p>
         </w:tc>
@@ -11890,7 +11909,7 @@
                 <w:rStyle w:val="VerbatimChar"/>
                 <w:rtl/>
               </w:rPr>
-              <w:t xml:space="preserve">num_of_prev_attempts, studied_credits, final_result</w:t>
+              <w:t xml:space="preserve">‎num_of_prev_attempts, studied_credits, final_result‎</w:t>
             </w:r>
             <w:r>
               <w:rPr>
@@ -11953,7 +11972,7 @@
                 <w:rStyle w:val="VerbatimChar"/>
                 <w:rtl/>
               </w:rPr>
-              <w:t xml:space="preserve">courses</w:t>
+              <w:t xml:space="preserve">‎courses‎</w:t>
             </w:r>
           </w:p>
         </w:tc>
@@ -11970,7 +11989,7 @@
                 <w:rStyle w:val="VerbatimChar"/>
                 <w:rtl/>
               </w:rPr>
-              <w:t xml:space="preserve">module_presentation_length</w:t>
+              <w:t xml:space="preserve">‎module_presentation_length‎</w:t>
             </w:r>
           </w:p>
         </w:tc>
@@ -12029,7 +12048,7 @@
           <w:rStyle w:val="VerbatimChar"/>
           <w:rtl/>
         </w:rPr>
-        <w:t xml:space="preserve">date</w:t>
+        <w:t xml:space="preserve">‎date‎</w:t>
       </w:r>
       <w:r>
         <w:rPr>
@@ -12054,7 +12073,7 @@
           <w:rStyle w:val="VerbatimChar"/>
           <w:rtl/>
         </w:rPr>
-        <w:t xml:space="preserve">week_from/to</w:t>
+        <w:t xml:space="preserve">‎week_from/to‎</w:t>
       </w:r>
       <w:r>
         <w:rPr>
@@ -12136,7 +12155,7 @@
           <w:bCs/>
           <w:b/>
         </w:rPr>
-        <w:t xml:space="preserve">id_site</w:t>
+        <w:t xml:space="preserve">‎id_site‎</w:t>
       </w:r>
       <w:r>
         <w:rPr>
@@ -12191,7 +12210,7 @@
           <w:rStyle w:val="VerbatimChar"/>
           <w:rtl/>
         </w:rPr>
-        <w:t xml:space="preserve">id_site</w:t>
+        <w:t xml:space="preserve">‎id_site‎</w:t>
       </w:r>
       <w:r>
         <w:rPr>
@@ -14733,7 +14752,7 @@
           <w:rStyle w:val="VerbatimChar"/>
           <w:rtl/>
         </w:rPr>
-        <w:t xml:space="preserve">resource</w:t>
+        <w:t xml:space="preserve">‎resource‎</w:t>
       </w:r>
       <w:r>
         <w:rPr>
@@ -14752,7 +14771,7 @@
           <w:rStyle w:val="VerbatimChar"/>
           <w:rtl/>
         </w:rPr>
-        <w:t xml:space="preserve">quiz</w:t>
+        <w:t xml:space="preserve">‎quiz‎</w:t>
       </w:r>
       <w:r>
         <w:rPr>
@@ -15251,7 +15270,7 @@
           <w:rStyle w:val="VerbatimChar"/>
           <w:rtl/>
         </w:rPr>
-        <w:t xml:space="preserve">forumng</w:t>
+        <w:t xml:space="preserve">‎forumng‎</w:t>
       </w:r>
       <w:r>
         <w:rPr>
@@ -15270,7 +15289,7 @@
           <w:rStyle w:val="VerbatimChar"/>
           <w:rtl/>
         </w:rPr>
-        <w:t xml:space="preserve">oucontent</w:t>
+        <w:t xml:space="preserve">‎oucontent‎</w:t>
       </w:r>
       <w:r>
         <w:rPr>
@@ -15289,7 +15308,7 @@
           <w:rStyle w:val="VerbatimChar"/>
           <w:rtl/>
         </w:rPr>
-        <w:t xml:space="preserve">quiz</w:t>
+        <w:t xml:space="preserve">‎quiz‎</w:t>
       </w:r>
       <w:r>
         <w:rPr>
@@ -15308,7 +15327,7 @@
           <w:rStyle w:val="VerbatimChar"/>
           <w:rtl/>
         </w:rPr>
-        <w:t xml:space="preserve">resource</w:t>
+        <w:t xml:space="preserve">‎resource‎</w:t>
       </w:r>
       <w:r>
         <w:rPr>
@@ -17557,7 +17576,7 @@
                 <w:rStyle w:val="VerbatimChar"/>
                 <w:rtl/>
               </w:rPr>
-              <w:t xml:space="preserve">studentVle</w:t>
+              <w:t xml:space="preserve">‎studentVle‎</w:t>
             </w:r>
             <w:r>
               <w:rPr>
@@ -17745,7 +17764,7 @@
                 <w:rStyle w:val="VerbatimChar"/>
                 <w:rtl/>
               </w:rPr>
-              <w:t xml:space="preserve">assessments.date</w:t>
+              <w:t xml:space="preserve">‎assessments.date‎</w:t>
             </w:r>
             <w:r>
               <w:rPr>
@@ -17808,7 +17827,7 @@
                 <w:rStyle w:val="VerbatimChar"/>
                 <w:rtl/>
               </w:rPr>
-              <w:t xml:space="preserve">activity_type(i)</w:t>
+              <w:t xml:space="preserve">‎activity_type(i)‎</w:t>
             </w:r>
           </w:p>
         </w:tc>
@@ -17825,7 +17844,7 @@
                 <w:rStyle w:val="VerbatimChar"/>
                 <w:rtl/>
               </w:rPr>
-              <w:t xml:space="preserve">vle</w:t>
+              <w:t xml:space="preserve">‎vle‎</w:t>
             </w:r>
           </w:p>
         </w:tc>
@@ -17987,7 +18006,7 @@
                 <w:rStyle w:val="VerbatimChar"/>
                 <w:rtl/>
               </w:rPr>
-              <w:t xml:space="preserve">studentVle</w:t>
+              <w:t xml:space="preserve">‎studentVle‎</w:t>
             </w:r>
             <w:r>
               <w:rPr>
@@ -18148,7 +18167,7 @@
           <w:rStyle w:val="VerbatimChar"/>
           <w:rtl/>
         </w:rPr>
-        <w:t xml:space="preserve">FFF_2013J</w:t>
+        <w:t xml:space="preserve">‎FFF_2013J‎</w:t>
       </w:r>
       <w:r>
         <w:rPr>
@@ -18173,7 +18192,7 @@
           <w:rStyle w:val="VerbatimChar"/>
           <w:rtl/>
         </w:rPr>
-        <w:t xml:space="preserve">assessments.csv</w:t>
+        <w:t xml:space="preserve">‎assessments.csv‎</w:t>
       </w:r>
       <w:r>
         <w:rPr>
@@ -18282,7 +18301,7 @@
           <w:rStyle w:val="VerbatimChar"/>
           <w:rtl/>
         </w:rPr>
-        <w:t xml:space="preserve">studentAssessment</w:t>
+        <w:t xml:space="preserve">‎studentAssessment‎</w:t>
       </w:r>
       <w:r>
         <w:rPr>
@@ -18301,7 +18320,7 @@
           <w:rStyle w:val="VerbatimChar"/>
           <w:rtl/>
         </w:rPr>
-        <w:t xml:space="preserve">final_result</w:t>
+        <w:t xml:space="preserve">‎final_result‎</w:t>
       </w:r>
       <w:r>
         <w:rPr>
@@ -18465,7 +18484,7 @@
                 <w:rStyle w:val="VerbatimChar"/>
                 <w:rtl/>
               </w:rPr>
-              <w:t xml:space="preserve">gender</w:t>
+              <w:t xml:space="preserve">‎gender‎</w:t>
             </w:r>
           </w:p>
         </w:tc>
@@ -18516,7 +18535,7 @@
                 <w:rStyle w:val="VerbatimChar"/>
                 <w:rtl/>
               </w:rPr>
-              <w:t xml:space="preserve">disability</w:t>
+              <w:t xml:space="preserve">‎disability‎</w:t>
             </w:r>
           </w:p>
         </w:tc>
@@ -18567,7 +18586,7 @@
                 <w:rStyle w:val="VerbatimChar"/>
                 <w:rtl/>
               </w:rPr>
-              <w:t xml:space="preserve">imd_band</w:t>
+              <w:t xml:space="preserve">‎imd_band‎</w:t>
             </w:r>
           </w:p>
         </w:tc>
@@ -18618,7 +18637,7 @@
                 <w:rStyle w:val="VerbatimChar"/>
                 <w:rtl/>
               </w:rPr>
-              <w:t xml:space="preserve">age_band</w:t>
+              <w:t xml:space="preserve">‎age_band‎</w:t>
             </w:r>
           </w:p>
         </w:tc>
@@ -18669,7 +18688,7 @@
                 <w:rStyle w:val="VerbatimChar"/>
                 <w:rtl/>
               </w:rPr>
-              <w:t xml:space="preserve">region</w:t>
+              <w:t xml:space="preserve">‎region‎</w:t>
             </w:r>
           </w:p>
         </w:tc>
@@ -18720,7 +18739,7 @@
                 <w:rStyle w:val="VerbatimChar"/>
                 <w:rtl/>
               </w:rPr>
-              <w:t xml:space="preserve">highest_education</w:t>
+              <w:t xml:space="preserve">‎highest_education‎</w:t>
             </w:r>
           </w:p>
         </w:tc>
@@ -18773,7 +18792,7 @@
           <w:rStyle w:val="VerbatimChar"/>
           <w:rtl/>
         </w:rPr>
-        <w:t xml:space="preserve">num_of_prev_attempts</w:t>
+        <w:t xml:space="preserve">‎num_of_prev_attempts‎</w:t>
       </w:r>
       <w:r>
         <w:rPr>
@@ -18792,7 +18811,7 @@
           <w:rStyle w:val="VerbatimChar"/>
           <w:rtl/>
         </w:rPr>
-        <w:t xml:space="preserve">studied_credits</w:t>
+        <w:t xml:space="preserve">‎studied_credits‎</w:t>
       </w:r>
       <w:r>
         <w:rPr>
@@ -18811,7 +18830,7 @@
           <w:rStyle w:val="VerbatimChar"/>
           <w:rtl/>
         </w:rPr>
-        <w:t xml:space="preserve">date_registration</w:t>
+        <w:t xml:space="preserve">‎date_registration‎</w:t>
       </w:r>
       <w:r>
         <w:rPr>
@@ -18985,7 +19004,7 @@
           <w:rStyle w:val="VerbatimChar"/>
           <w:rtl/>
         </w:rPr>
-        <w:t xml:space="preserve">studentVle</w:t>
+        <w:t xml:space="preserve">‎studentVle‎</w:t>
       </w:r>
       <w:r>
         <w:rPr>
@@ -19010,7 +19029,7 @@
           <w:rStyle w:val="VerbatimChar"/>
           <w:rtl/>
         </w:rPr>
-        <w:t xml:space="preserve">vle</w:t>
+        <w:t xml:space="preserve">‎vle‎</w:t>
       </w:r>
       <w:r>
         <w:rPr>
@@ -19045,7 +19064,7 @@
           <w:rStyle w:val="VerbatimChar"/>
           <w:rtl/>
         </w:rPr>
-        <w:t xml:space="preserve">sum_click</w:t>
+        <w:t xml:space="preserve">‎sum_click‎</w:t>
       </w:r>
       <w:r>
         <w:rPr>
@@ -19496,7 +19515,7 @@
           <w:rStyle w:val="VerbatimChar"/>
           <w:rtl/>
         </w:rPr>
-        <w:t xml:space="preserve">date_unregistration</w:t>
+        <w:t xml:space="preserve">‎date_unregistration‎</w:t>
       </w:r>
       <w:r>
         <w:rPr>
@@ -19577,7 +19596,7 @@
           <w:rStyle w:val="VerbatimChar"/>
           <w:rtl/>
         </w:rPr>
-        <w:t xml:space="preserve">assessments.date</w:t>
+        <w:t xml:space="preserve">‎assessments.date‎</w:t>
       </w:r>
       <w:r>
         <w:rPr>
@@ -19692,7 +19711,7 @@
           <w:rStyle w:val="VerbatimChar"/>
           <w:rtl/>
         </w:rPr>
-        <w:t xml:space="preserve">studentVle</w:t>
+        <w:t xml:space="preserve">‎studentVle‎</w:t>
       </w:r>
       <w:r>
         <w:rPr>
@@ -19717,7 +19736,7 @@
           <w:rStyle w:val="VerbatimChar"/>
           <w:rtl/>
         </w:rPr>
-        <w:t xml:space="preserve">data/verify_oulad.py</w:t>
+        <w:t xml:space="preserve">‎data/verify_oulad.py‎</w:t>
       </w:r>
       <w:r>
         <w:rPr>
@@ -33760,7 +33779,7 @@
           <w:rStyle w:val="VerbatimChar"/>
           <w:rtl/>
         </w:rPr>
-        <w:t xml:space="preserve">assessments.date</w:t>
+        <w:t xml:space="preserve">‎assessments.date‎</w:t>
       </w:r>
       <w:r>
         <w:rPr>
@@ -33823,7 +33842,7 @@
           <w:rStyle w:val="VerbatimChar"/>
           <w:rtl/>
         </w:rPr>
-        <w:t xml:space="preserve">FFF_2013J</w:t>
+        <w:t xml:space="preserve">‎FFF_2013J‎</w:t>
       </w:r>
       <w:r>
         <w:rPr>
@@ -35771,7 +35790,7 @@
           <w:bCs/>
           <w:b/>
         </w:rPr>
-        <w:t xml:space="preserve">results/dev2013/hybrid_frozen.json</w:t>
+        <w:t xml:space="preserve">‎results/dev2013/hybrid_frozen.json‎</w:t>
       </w:r>
       <w:r>
         <w:rPr>
@@ -35796,7 +35815,7 @@
           <w:bCs/>
           <w:b/>
         </w:rPr>
-        <w:t xml:space="preserve">freeze-03</w:t>
+        <w:t xml:space="preserve">‎freeze-03‎</w:t>
       </w:r>
       <w:r>
         <w:rPr>
@@ -36041,32 +36060,7 @@
         <w:rPr>
           <w:rtl/>
         </w:rPr>
-        <w:t xml:space="preserve">NDCG@10 = [من</w:t>
-      </w:r>
-      <w:r>
-        <w:rPr>
-          <w:rtl/>
-        </w:rPr>
-        <w:t xml:space="preserve"> </w:t>
-      </w:r>
-      <w:r>
-        <w:rPr>
-          <w:rStyle w:val="VerbatimChar"/>
-          <w:rtl/>
-        </w:rPr>
-        <w:t xml:space="preserve">hybrid_acceptance.md</w:t>
-      </w:r>
-      <w:r>
-        <w:rPr>
-          <w:rtl/>
-        </w:rPr>
-        <w:t xml:space="preserve"> </w:t>
-      </w:r>
-      <w:r>
-        <w:rPr>
-          <w:rtl/>
-        </w:rPr>
-        <w:t xml:space="preserve">بعد ش1]، وفجوة التفاؤل = [ـ]. وللسجل: بالأرضية الاسمية (وزن SKNN صفر في 13/27 زوجاً) كانت 0.5560.</w:t>
+        <w:t xml:space="preserve">NDCG@10 = 0.5609، وفجوة التفاؤل = −0.0027. وللسجل: بالأرضية الاسمية (وزن SKNN صفر في 13/27 زوجاً) كانت 0.5560.</w:t>
       </w:r>
     </w:p>
     <w:p>
@@ -38651,7 +38645,7 @@
           <w:rStyle w:val="VerbatimChar"/>
           <w:rtl/>
         </w:rPr>
-        <w:t xml:space="preserve">next</w:t>
+        <w:t xml:space="preserve">‎next‎</w:t>
       </w:r>
       <w:r>
         <w:rPr>
@@ -38714,7 +38708,7 @@
           <w:rStyle w:val="VerbatimChar"/>
           <w:rtl/>
         </w:rPr>
-        <w:t xml:space="preserve">next-new</w:t>
+        <w:t xml:space="preserve">‎next-new‎</w:t>
       </w:r>
       <w:r>
         <w:rPr>
@@ -40094,7 +40088,7 @@
           <w:rStyle w:val="VerbatimChar"/>
           <w:rtl/>
         </w:rPr>
-        <w:t xml:space="preserve">next</w:t>
+        <w:t xml:space="preserve">‎next‎</w:t>
       </w:r>
       <w:r>
         <w:rPr>
@@ -40113,7 +40107,7 @@
           <w:rStyle w:val="VerbatimChar"/>
           <w:rtl/>
         </w:rPr>
-        <w:t xml:space="preserve">next-new</w:t>
+        <w:t xml:space="preserve">‎next-new‎</w:t>
       </w:r>
       <w:r>
         <w:rPr>
@@ -44753,7 +44747,7 @@
                 <w:rStyle w:val="VerbatimChar"/>
                 <w:rtl/>
               </w:rPr>
-              <w:t xml:space="preserve">date_registration</w:t>
+              <w:t xml:space="preserve">‎date_registration‎</w:t>
             </w:r>
           </w:p>
         </w:tc>
@@ -44956,7 +44950,7 @@
                 <w:rStyle w:val="VerbatimChar"/>
                 <w:rtl/>
               </w:rPr>
-              <w:t xml:space="preserve">num_of_prev_attempts</w:t>
+              <w:t xml:space="preserve">‎num_of_prev_attempts‎</w:t>
             </w:r>
             <w:r>
               <w:rPr>
@@ -44975,7 +44969,7 @@
                 <w:rStyle w:val="VerbatimChar"/>
                 <w:rtl/>
               </w:rPr>
-              <w:t xml:space="preserve">studied_credits</w:t>
+              <w:t xml:space="preserve">‎studied_credits‎</w:t>
             </w:r>
           </w:p>
         </w:tc>
@@ -46773,7 +46767,7 @@
           <w:rStyle w:val="VerbatimChar"/>
           <w:rtl/>
         </w:rPr>
-        <w:t xml:space="preserve">date_registration</w:t>
+        <w:t xml:space="preserve">‎date_registration‎</w:t>
       </w:r>
       <w:r>
         <w:rPr>
@@ -46838,7 +46832,7 @@
           <w:rStyle w:val="VerbatimChar"/>
           <w:rtl/>
         </w:rPr>
-        <w:t xml:space="preserve">num_of_prev_attempts</w:t>
+        <w:t xml:space="preserve">‎num_of_prev_attempts‎</w:t>
       </w:r>
       <w:r>
         <w:rPr>
@@ -46851,7 +46845,7 @@
           <w:rStyle w:val="VerbatimChar"/>
           <w:rtl/>
         </w:rPr>
-        <w:t xml:space="preserve">studied_credits</w:t>
+        <w:t xml:space="preserve">‎studied_credits‎</w:t>
       </w:r>
       <w:r>
         <w:rPr>
@@ -46864,7 +46858,7 @@
           <w:rStyle w:val="VerbatimChar"/>
           <w:rtl/>
         </w:rPr>
-        <w:t xml:space="preserve">date_registration</w:t>
+        <w:t xml:space="preserve">‎date_registration‎</w:t>
       </w:r>
       <w:r>
         <w:rPr>
@@ -50151,7 +50145,7 @@
           <w:rStyle w:val="VerbatimChar"/>
           <w:rtl/>
         </w:rPr>
-        <w:t xml:space="preserve">src/</w:t>
+        <w:t xml:space="preserve">‎src/‎</w:t>
       </w:r>
       <w:r>
         <w:rPr>
@@ -50342,7 +50336,7 @@
                 <w:rStyle w:val="VerbatimChar"/>
                 <w:rtl/>
               </w:rPr>
-              <w:t xml:space="preserve">groupby</w:t>
+              <w:t xml:space="preserve">‎groupby‎</w:t>
             </w:r>
             <w:r>
               <w:rPr>
@@ -50361,7 +50355,7 @@
                 <w:rStyle w:val="VerbatimChar"/>
                 <w:rtl/>
               </w:rPr>
-              <w:t xml:space="preserve">nunique</w:t>
+              <w:t xml:space="preserve">‎nunique‎</w:t>
             </w:r>
             <w:r>
               <w:rPr>
@@ -50618,7 +50612,7 @@
                 <w:rStyle w:val="VerbatimChar"/>
                 <w:rtl/>
               </w:rPr>
-              <w:t xml:space="preserve">numpy.linalg.solve</w:t>
+              <w:t xml:space="preserve">‎numpy.linalg.solve‎</w:t>
             </w:r>
             <w:r>
               <w:rPr>
@@ -51142,7 +51136,7 @@
                 <w:rStyle w:val="VerbatimChar"/>
                 <w:rtl/>
               </w:rPr>
-              <w:t xml:space="preserve">numpy.random.Generator</w:t>
+              <w:t xml:space="preserve">‎numpy.random.Generator‎</w:t>
             </w:r>
             <w:r>
               <w:rPr>
@@ -58651,7 +58645,7 @@
           <w:rStyle w:val="VerbatimChar"/>
           <w:rtl/>
         </w:rPr>
-        <w:t xml:space="preserve">assessments.date</w:t>
+        <w:t xml:space="preserve">‎assessments.date‎</w:t>
       </w:r>
       <w:r>
         <w:rPr>
@@ -58674,7 +58668,7 @@
           <w:rStyle w:val="VerbatimChar"/>
           <w:rtl/>
         </w:rPr>
-        <w:t xml:space="preserve">studentAssessment</w:t>
+        <w:t xml:space="preserve">‎studentAssessment‎</w:t>
       </w:r>
       <w:r>
         <w:rPr>
@@ -58693,7 +58687,7 @@
           <w:rStyle w:val="VerbatimChar"/>
           <w:rtl/>
         </w:rPr>
-        <w:t xml:space="preserve">final_result</w:t>
+        <w:t xml:space="preserve">‎final_result‎</w:t>
       </w:r>
       <w:r>
         <w:rPr>
@@ -58712,7 +58706,7 @@
           <w:rStyle w:val="VerbatimChar"/>
           <w:rtl/>
         </w:rPr>
-        <w:t xml:space="preserve">final_result</w:t>
+        <w:t xml:space="preserve">‎final_result‎</w:t>
       </w:r>
       <w:r>
         <w:rPr>
@@ -58793,7 +58787,7 @@
           <w:rStyle w:val="VerbatimChar"/>
           <w:rtl/>
         </w:rPr>
-        <w:t xml:space="preserve">studentRegistration</w:t>
+        <w:t xml:space="preserve">‎studentRegistration‎</w:t>
       </w:r>
       <w:r>
         <w:rPr>
@@ -58905,7 +58899,7 @@
           <w:rStyle w:val="VerbatimChar"/>
           <w:rtl/>
         </w:rPr>
-        <w:t xml:space="preserve">gender, disability, imd_band, age_band</w:t>
+        <w:t xml:space="preserve">‎gender, disability, imd_band, age_band‎</w:t>
       </w:r>
       <w:r>
         <w:rPr>
@@ -59072,7 +59066,7 @@
           <w:rStyle w:val="VerbatimChar"/>
           <w:rtl/>
         </w:rPr>
-        <w:t xml:space="preserve">final_result</w:t>
+        <w:t xml:space="preserve">‎final_result‎</w:t>
       </w:r>
       <w:r>
         <w:rPr>
@@ -60473,7 +60467,7 @@
                 <w:rStyle w:val="VerbatimChar"/>
                 <w:rtl/>
               </w:rPr>
-              <w:t xml:space="preserve">studentVle</w:t>
+              <w:t xml:space="preserve">‎studentVle‎</w:t>
             </w:r>
             <w:r>
               <w:rPr>
@@ -60546,7 +60540,7 @@
                 <w:rStyle w:val="VerbatimChar"/>
                 <w:rtl/>
               </w:rPr>
-              <w:t xml:space="preserve">FFF_2013J</w:t>
+              <w:t xml:space="preserve">‎FFF_2013J‎</w:t>
             </w:r>
             <w:r>
               <w:rPr>
@@ -60653,7 +60647,7 @@
                 <w:rStyle w:val="VerbatimChar"/>
                 <w:rtl/>
               </w:rPr>
-              <w:t xml:space="preserve">AAA_2013J</w:t>
+              <w:t xml:space="preserve">‎AAA_2013J‎</w:t>
             </w:r>
           </w:p>
         </w:tc>
@@ -71991,7 +71985,7 @@
           <w:rStyle w:val="VerbatimChar"/>
           <w:rtl/>
         </w:rPr>
-        <w:t xml:space="preserve">code_module, code_presentation, id_student</w:t>
+        <w:t xml:space="preserve">‎code_module, code_presentation, id_student‎</w:t>
       </w:r>
       <w:r>
         <w:rPr>
@@ -72016,7 +72010,7 @@
           <w:rStyle w:val="VerbatimChar"/>
           <w:rtl/>
         </w:rPr>
-        <w:t xml:space="preserve">studentRegistration</w:t>
+        <w:t xml:space="preserve">‎studentRegistration‎</w:t>
       </w:r>
       <w:r>
         <w:rPr>
@@ -72035,7 +72029,7 @@
           <w:rStyle w:val="VerbatimChar"/>
           <w:rtl/>
         </w:rPr>
-        <w:t xml:space="preserve">usecols</w:t>
+        <w:t xml:space="preserve">‎usecols‎</w:t>
       </w:r>
       <w:r>
         <w:rPr>
@@ -72054,7 +72048,7 @@
           <w:rStyle w:val="VerbatimChar"/>
           <w:rtl/>
         </w:rPr>
-        <w:t xml:space="preserve">date_unregistration</w:t>
+        <w:t xml:space="preserve">‎date_unregistration‎</w:t>
       </w:r>
       <w:r>
         <w:rPr>
@@ -73221,7 +73215,7 @@
                 <w:rStyle w:val="VerbatimChar"/>
                 <w:rtl/>
               </w:rPr>
-              <w:t xml:space="preserve">final_result</w:t>
+              <w:t xml:space="preserve">‎final_result‎</w:t>
             </w:r>
           </w:p>
         </w:tc>
@@ -73649,7 +73643,7 @@
         <w:rPr>
           <w:rtl/>
         </w:rPr>
-        <w:t xml:space="preserve">(1) CBF ضعيف بنيوياً على OULAD لغياب النصوص؛ (2) GRU-lite ضحل بطبقة واحدة، و«الشبكات العميقة» معدَّلة بقرار (D-18)؛ (3) لا تقييم بشري للواجهة ولا للتفسير (D-22)؛ (4) الأدوات بديلة عن TensorFlow وscikit-learn بقيد بيئي موثق (ADR-003)؛ (5) قيمة MD5 المرجعية لـOULAD من طرف ثالث (D-08)؛ (6) التفسير لمكوّن GRU عام وغير شفاف؛ (7) GRU-lite بلا ميزات زمنية، والسياق الزمني وظيفة المكوّن (1) (D-35)؛ (8) RQ4-ب يُجاب وصفياً، وδ_AUC اتفاقي معلن؛ (9) واجهة إعادة التشغيل توضيحية: تستعمل معاملات أقرب قطع ‎≤‎ t، ولا يُستخرج منها رقم تقييم (D-49)؛ (10) MDE80 المجمَّد (الجدول 2-ب): H2-أ 0.045 وH3 0.050 (أكبر من 2δ)، وH4-أ 0.0225، وH1 [تُعاد بعد D-51]؛ فـ«غير حاسمة» متوقعة لبعض الفرضيات وتُوصف بنص D-48؛ و«تكافؤ» H3 شبه متعذر بنيوياً (D-61).</w:t>
+        <w:t xml:space="preserve">(1) CBF ضعيف بنيوياً على OULAD لغياب النصوص؛ (2) GRU-lite ضحل بطبقة واحدة، و«الشبكات العميقة» معدَّلة بقرار (D-18)؛ (3) لا تقييم بشري للواجهة ولا للتفسير (D-22)؛ (4) الأدوات بديلة عن TensorFlow وscikit-learn بقيد بيئي موثق (ADR-003)؛ (5) قيمة MD5 المرجعية لـOULAD من طرف ثالث (D-08)؛ (6) التفسير لمكوّن GRU عام وغير شفاف؛ (7) GRU-lite بلا ميزات زمنية، والسياق الزمني وظيفة المكوّن (1) (D-35)؛ (8) RQ4-ب يُجاب وصفياً، وδ_AUC اتفاقي معلن؛ (9) واجهة إعادة التشغيل توضيحية: تستعمل معاملات أقرب قطع ‎≤‎ t، ولا يُستخرج منها رقم تقييم (D-49)؛ (10) MDE80 المجمَّد (الجدول 2-ب): H2-أ 0.045 وH3 0.050 (أكبر من 2δ)، وH4-أ 0.0225، وH1 0.0375؛ فـ«غير حاسمة» متوقعة لبعض الفرضيات وتُوصف بنص D-48؛ و«تكافؤ» H3 شبه متعذر بنيوياً (D-61).</w:t>
       </w:r>
     </w:p>
     <w:bookmarkEnd w:id="104"/>
@@ -74121,7 +74115,7 @@
                 <w:rStyle w:val="VerbatimChar"/>
                 <w:rtl/>
               </w:rPr>
-              <w:t xml:space="preserve">data/raw/</w:t>
+              <w:t xml:space="preserve">‎data/raw/‎</w:t>
             </w:r>
             <w:r>
               <w:rPr>
@@ -74146,7 +74140,7 @@
                 <w:rStyle w:val="VerbatimChar"/>
                 <w:rtl/>
               </w:rPr>
-              <w:t xml:space="preserve">oulad</w:t>
+              <w:t xml:space="preserve">‎oulad‎</w:t>
             </w:r>
             <w:r>
               <w:rPr>
@@ -74777,7 +74771,7 @@
                 <w:rStyle w:val="VerbatimChar"/>
                 <w:rtl/>
               </w:rPr>
-              <w:t xml:space="preserve">studentRegistration</w:t>
+              <w:t xml:space="preserve">‎studentRegistration‎</w:t>
             </w:r>
             <w:r>
               <w:rPr>
@@ -74926,7 +74920,7 @@
           <w:rStyle w:val="VerbatimChar"/>
           <w:rtl/>
         </w:rPr>
-        <w:t xml:space="preserve">docs/meetings/2026-10-24-meeting-03-freeze.md</w:t>
+        <w:t xml:space="preserve">‎docs/meetings/2026-10-24-meeting-03-freeze.md‎</w:t>
       </w:r>
       <w:r>
         <w:rPr>
@@ -75780,7 +75774,7 @@
                 <w:rStyle w:val="VerbatimChar"/>
                 <w:rtl/>
               </w:rPr>
-              <w:t xml:space="preserve">freeze-03</w:t>
+              <w:t xml:space="preserve">‎freeze-03‎</w:t>
             </w:r>
           </w:p>
         </w:tc>
@@ -75924,7 +75918,7 @@
         <w:rPr>
           <w:rtl/>
         </w:rPr>
-        <w:t xml:space="preserve">لا قرار معلّق. ويبقى ملء خانتين تنفيذاً بلا اختيار (D-62): قيم H1 في الجدول 2-ب وفي القيد (10) بعد إعادة حساب</w:t>
+        <w:t xml:space="preserve">لا قرار معلّق. ومُلئت الخانتان تنفيذاً بلا اختيار (D-62): قيم H1 في الجدول 2-ب وفي القيد (10) من</w:t>
       </w:r>
       <w:r>
         <w:rPr>
@@ -75937,7 +75931,32 @@
           <w:rStyle w:val="VerbatimChar"/>
           <w:rtl/>
         </w:rPr>
-        <w:t xml:space="preserve">power</w:t>
+        <w:t xml:space="preserve">‎mde80.json‎</w:t>
+      </w:r>
+      <w:r>
+        <w:rPr>
+          <w:rtl/>
+        </w:rPr>
+        <w:t xml:space="preserve"> </w:t>
+      </w:r>
+      <w:r>
+        <w:rPr>
+          <w:rtl/>
+        </w:rPr>
+        <w:t xml:space="preserve">بعد إعادة حساب</w:t>
+      </w:r>
+      <w:r>
+        <w:rPr>
+          <w:rtl/>
+        </w:rPr>
+        <w:t xml:space="preserve"> </w:t>
+      </w:r>
+      <w:r>
+        <w:rPr>
+          <w:rStyle w:val="VerbatimChar"/>
+          <w:rtl/>
+        </w:rPr>
+        <w:t xml:space="preserve">‎power‎</w:t>
       </w:r>
       <w:r>
         <w:rPr>
@@ -75962,19 +75981,19 @@
           <w:rStyle w:val="VerbatimChar"/>
           <w:rtl/>
         </w:rPr>
-        <w:t xml:space="preserve">hybrid_acceptance.md</w:t>
-      </w:r>
-      <w:r>
-        <w:rPr>
-          <w:rtl/>
-        </w:rPr>
-        <w:t xml:space="preserve"> </w:t>
-      </w:r>
-      <w:r>
-        <w:rPr>
-          <w:rtl/>
-        </w:rPr>
-        <w:t xml:space="preserve">بعد ش1. وتحقق T5 من المراجع [39]–[57] قبل الاستشهاد بها في الرسالة.</w:t>
+        <w:t xml:space="preserve">‎hybrid_acceptance.md‎</w:t>
+      </w:r>
+      <w:r>
+        <w:rPr>
+          <w:rtl/>
+        </w:rPr>
+        <w:t xml:space="preserve"> </w:t>
+      </w:r>
+      <w:r>
+        <w:rPr>
+          <w:rtl/>
+        </w:rPr>
+        <w:t xml:space="preserve">(ش1). وتحقق T5 من المراجع [39]–[57] قبل الاستشهاد بها في الرسالة.</w:t>
       </w:r>
     </w:p>
     <w:bookmarkEnd w:id="105"/>
@@ -76025,7 +76044,7 @@
           <w:rStyle w:val="VerbatimChar"/>
           <w:rtl/>
         </w:rPr>
-        <w:t xml:space="preserve">docs/working/references-bibliography.md</w:t>
+        <w:t xml:space="preserve">‎docs/working/references-bibliography.md‎</w:t>
       </w:r>
       <w:r>
         <w:rPr>
@@ -79278,7 +79297,7 @@
       <w:jc w:val="left"/>
     </w:pPr>
     <w:rPr>
-      <w:rFonts w:ascii="Consolas" w:hAnsi="Consolas" w:cs="Consolas" w:eastAsia="Consolas"/>
+      <w:rFonts w:ascii="Consolas" w:hAnsi="Consolas" w:cs="Simplified Arabic" w:eastAsia="Consolas"/>
       <w:sz w:val="22"/>
     </w:rPr>
   </w:style>
@@ -79343,7 +79362,7 @@
       <w:jc w:val="left"/>
     </w:pPr>
     <w:rPr>
-      <w:rFonts w:ascii="Consolas" w:hAnsi="Consolas" w:cs="Consolas" w:eastAsia="Consolas"/>
+      <w:rFonts w:ascii="Consolas" w:hAnsi="Consolas" w:cs="Simplified Arabic" w:eastAsia="Consolas"/>
     </w:rPr>
   </w:style>
   <w:style w:type="character" w:customStyle="1" w:styleId="KeywordTok">

</xml_diff>